<commit_message>
feat(huong-dan): phu luc nhom Zalo ho tro theo cum (9 cum, 119 don vi)
- content/nhomZaloTheoCum.ts: du lieu rieng cua khoa, lay tu tai lieu "Danh sach nhom Zalo theo cum ho tro"
- /huong-dan: muc Phu luc (PL) co o tim truong khong dau, moi cum co nut "Tham gia nhom Zalo"
- Ghi chu Zalo tro toi phu luc khi chua thay nut Vao nhom Zalo
- Ban Word: them phu luc bang Cum | Don vi | Link; sinh lai docs/huong-dan-hoc-vien.docx
  (kem nhan dang nhap moi)

Co-Authored-By: Claude Opus 5.5 <noreply@anthropic.com>
</commit_message>
<xml_diff>
--- a/docs/huong-dan-hoc-vien.docx
+++ b/docs/huong-dan-hoc-vien.docx
@@ -188,22 +188,6 @@
       </w:pPr>
       <w:r>
         <w:rPr>
-          <w:b/>
-          <w:bCs/>
-          <w:sz w:val="28"/>
-          <w:szCs w:val="28"/>
-        </w:rPr>
-        <w:t xml:space="preserve">Khóa bồi dưỡng tại An Giang</w:t>
-      </w:r>
-    </w:p>
-    <w:p>
-      <w:pPr>
-        <w:spacing w:after="0" w:line="240"/>
-        <w:ind w:firstLine="0"/>
-        <w:jc w:val="center"/>
-      </w:pPr>
-      <w:r>
-        <w:rPr>
           <w:i/>
           <w:iCs/>
           <w:sz w:val="28"/>
@@ -245,7 +229,7 @@
         <w:jc w:val="both"/>
       </w:pPr>
       <w:r>
-        <w:t xml:space="preserve">Hướng dẫn này giúp giáo viên và cán bộ quản lý tham gia khóa bồi dưỡng năng lực số (khóa bồi dưỡng tại An Giang) sử dụng hệ thống Bồi dưỡng Năng lực số tại địa chỉ </w:t>
+        <w:t xml:space="preserve">Hướng dẫn này giúp giáo viên và cán bộ quản lý tham gia khóa bồi dưỡng năng lực số sử dụng hệ thống Bồi dưỡng Năng lực số tại địa chỉ </w:t>
       </w:r>
       <w:r>
         <w:rPr>
@@ -1064,7 +1048,17 @@
         <w:t xml:space="preserve">“Vào nhóm Zalo”</w:t>
       </w:r>
       <w:r>
-        <w:t xml:space="preserve"> để nhận thông báo và được hỗ trợ suốt khóa học (mục VIII).</w:t>
+        <w:t xml:space="preserve"> để nhận thông báo và được hỗ trợ suốt khóa học (mục VIII). Chưa thấy nút này, Thầy/Cô tra tên trường mình trong </w:t>
+      </w:r>
+      <w:r>
+        <w:rPr>
+          <w:b/>
+          <w:bCs/>
+        </w:rPr>
+        <w:t xml:space="preserve">Phụ lục: Nhóm Zalo hỗ trợ theo cụm</w:t>
+      </w:r>
+      <w:r>
+        <w:t xml:space="preserve"> ở cuối tài liệu để tham gia đúng nhóm.</w:t>
       </w:r>
     </w:p>
     <w:p>
@@ -1892,10 +1886,10 @@
           <w:b/>
           <w:bCs/>
         </w:rPr>
-        <w:t xml:space="preserve">tên đăng nhập, mã định danh hoặc số CCCD</w:t>
-      </w:r>
-      <w:r>
-        <w:t xml:space="preserve">. Mã định danh trên CSDL MOET do nhà trường cung cấp (lấy từ danh sách học viên) — chỉ gồm chữ số, không có dấu cách. Nếu đã bổ sung số CCCD vào hồ sơ, Thầy/Cô cũng có thể đăng nhập bằng số CCCD.</w:t>
+        <w:t xml:space="preserve">tên tài khoản hoặc mã định danh MOET</w:t>
+      </w:r>
+      <w:r>
+        <w:t xml:space="preserve">. Mã định danh trên CSDL MOET do nhà trường cung cấp (lấy từ danh sách học viên) — chỉ gồm chữ số, không có dấu cách.</w:t>
       </w:r>
     </w:p>
     <w:p>
@@ -8017,7 +8011,7 @@
                 <w:sz w:val="24"/>
                 <w:szCs w:val="24"/>
               </w:rPr>
-              <w:t xml:space="preserve">. Nhập mã định danh hoặc số CCCD, bấm </w:t>
+              <w:t xml:space="preserve">. Nhập tên tài khoản hoặc mã định danh MOET, bấm </w:t>
             </w:r>
             <w:r>
               <w:rPr>
@@ -13951,6 +13945,2711 @@
       <w:r>
         <w:t xml:space="preserve"> để được hỗ trợ./.</w:t>
       </w:r>
+    </w:p>
+    <w:p>
+      <w:pPr>
+        <w:pageBreakBefore/>
+        <w:spacing w:after="0" w:line="288"/>
+        <w:ind w:firstLine="0"/>
+        <w:jc w:val="center"/>
+      </w:pPr>
+      <w:r>
+        <w:rPr>
+          <w:b/>
+          <w:bCs/>
+          <w:sz w:val="28"/>
+          <w:szCs w:val="28"/>
+        </w:rPr>
+        <w:t xml:space="preserve">PHỤ LỤC</w:t>
+      </w:r>
+    </w:p>
+    <w:p>
+      <w:pPr>
+        <w:spacing w:after="240" w:line="240"/>
+        <w:ind w:firstLine="0"/>
+        <w:jc w:val="center"/>
+      </w:pPr>
+      <w:r>
+        <w:rPr>
+          <w:b/>
+          <w:bCs/>
+          <w:sz w:val="28"/>
+          <w:szCs w:val="28"/>
+        </w:rPr>
+        <w:t xml:space="preserve">DANH SÁCH NHÓM ZALO HỖ TRỢ THEO CỤM</w:t>
+      </w:r>
+    </w:p>
+    <w:p>
+      <w:pPr>
+        <w:spacing w:after="120" w:before="0" w:line="288"/>
+        <w:ind w:firstLine="567"/>
+        <w:jc w:val="both"/>
+      </w:pPr>
+      <w:r>
+        <w:t xml:space="preserve">- </w:t>
+      </w:r>
+      <w:r>
+        <w:t xml:space="preserve">Danh sách đơn vị phân theo cụm chỉ phục vụ hỗ trợ học viên trong quá trình bồi dưỡng, </w:t>
+      </w:r>
+      <w:r>
+        <w:rPr>
+          <w:b/>
+          <w:bCs/>
+        </w:rPr>
+        <w:t xml:space="preserve">không phải danh sách chia lớp</w:t>
+      </w:r>
+      <w:r>
+        <w:t xml:space="preserve"> chính thức.</w:t>
+      </w:r>
+    </w:p>
+    <w:p>
+      <w:pPr>
+        <w:spacing w:after="120" w:before="0" w:line="288"/>
+        <w:ind w:firstLine="567"/>
+        <w:jc w:val="both"/>
+      </w:pPr>
+      <w:r>
+        <w:t xml:space="preserve">- </w:t>
+      </w:r>
+      <w:r>
+        <w:t xml:space="preserve">Căn cứ </w:t>
+      </w:r>
+      <w:r>
+        <w:rPr>
+          <w:b/>
+          <w:bCs/>
+        </w:rPr>
+        <w:t xml:space="preserve">đơn vị công tác</w:t>
+      </w:r>
+      <w:r>
+        <w:t xml:space="preserve"> để tham gia đúng nhóm Zalo của cụm mình, không tham gia cùng lúc nhiều nhóm.</w:t>
+      </w:r>
+    </w:p>
+    <w:p>
+      <w:pPr>
+        <w:spacing w:after="120" w:before="0" w:line="288"/>
+        <w:ind w:firstLine="567"/>
+        <w:jc w:val="both"/>
+      </w:pPr>
+      <w:r>
+        <w:t xml:space="preserve">- </w:t>
+      </w:r>
+      <w:r>
+        <w:t xml:space="preserve">Mỗi học viên dùng </w:t>
+      </w:r>
+      <w:r>
+        <w:rPr>
+          <w:b/>
+          <w:bCs/>
+        </w:rPr>
+        <w:t xml:space="preserve">1 tài khoản Zalo</w:t>
+      </w:r>
+      <w:r>
+        <w:t xml:space="preserve">, đặt tên tài khoản đúng họ tên của mình.</w:t>
+      </w:r>
+    </w:p>
+    <w:tbl>
+      <w:tblPr>
+        <w:tblW w:type="dxa" w:w="9355"/>
+        <w:tblBorders>
+          <w:top w:val="single" w:color="auto" w:sz="4"/>
+          <w:left w:val="single" w:color="auto" w:sz="4"/>
+          <w:bottom w:val="single" w:color="auto" w:sz="4"/>
+          <w:right w:val="single" w:color="auto" w:sz="4"/>
+          <w:insideH w:val="single" w:color="auto" w:sz="4"/>
+          <w:insideV w:val="single" w:color="auto" w:sz="4"/>
+        </w:tblBorders>
+        <w:tblLayout w:type="fixed"/>
+      </w:tblPr>
+      <w:tblGrid>
+        <w:gridCol w:w="1500"/>
+        <w:gridCol w:w="4555"/>
+        <w:gridCol w:w="3300"/>
+      </w:tblGrid>
+      <w:tr>
+        <w:trPr>
+          <w:cantSplit/>
+          <w:tblHeader/>
+        </w:trPr>
+        <w:tc>
+          <w:tcPr>
+            <w:tcW w:type="dxa" w:w="1500"/>
+            <w:tcBorders>
+              <w:top w:val="single" w:color="000000" w:sz="4"/>
+              <w:left w:val="single" w:color="000000" w:sz="4"/>
+              <w:bottom w:val="single" w:color="000000" w:sz="4"/>
+              <w:right w:val="single" w:color="000000" w:sz="4"/>
+            </w:tcBorders>
+            <w:shd w:fill="E7E6E6" w:color="auto" w:val="clear"/>
+            <w:tcMar>
+              <w:top w:type="dxa" w:w="40"/>
+              <w:left w:type="dxa" w:w="80"/>
+              <w:bottom w:type="dxa" w:w="40"/>
+              <w:right w:type="dxa" w:w="80"/>
+            </w:tcMar>
+            <w:vAlign w:val="center"/>
+          </w:tcPr>
+          <w:p>
+            <w:pPr>
+              <w:spacing w:after="40" w:line="264"/>
+              <w:ind w:firstLine="0"/>
+              <w:jc w:val="center"/>
+            </w:pPr>
+            <w:r>
+              <w:rPr>
+                <w:b/>
+                <w:bCs/>
+                <w:sz w:val="24"/>
+                <w:szCs w:val="24"/>
+              </w:rPr>
+              <w:t xml:space="preserve">Cụm</w:t>
+            </w:r>
+          </w:p>
+        </w:tc>
+        <w:tc>
+          <w:tcPr>
+            <w:tcW w:type="dxa" w:w="4555"/>
+            <w:tcBorders>
+              <w:top w:val="single" w:color="000000" w:sz="4"/>
+              <w:left w:val="single" w:color="000000" w:sz="4"/>
+              <w:bottom w:val="single" w:color="000000" w:sz="4"/>
+              <w:right w:val="single" w:color="000000" w:sz="4"/>
+            </w:tcBorders>
+            <w:shd w:fill="E7E6E6" w:color="auto" w:val="clear"/>
+            <w:tcMar>
+              <w:top w:type="dxa" w:w="40"/>
+              <w:left w:type="dxa" w:w="80"/>
+              <w:bottom w:type="dxa" w:w="40"/>
+              <w:right w:type="dxa" w:w="80"/>
+            </w:tcMar>
+            <w:vAlign w:val="center"/>
+          </w:tcPr>
+          <w:p>
+            <w:pPr>
+              <w:spacing w:after="40" w:line="264"/>
+              <w:ind w:firstLine="0"/>
+              <w:jc w:val="center"/>
+            </w:pPr>
+            <w:r>
+              <w:rPr>
+                <w:b/>
+                <w:bCs/>
+                <w:sz w:val="24"/>
+                <w:szCs w:val="24"/>
+              </w:rPr>
+              <w:t xml:space="preserve">Đơn vị công tác</w:t>
+            </w:r>
+          </w:p>
+        </w:tc>
+        <w:tc>
+          <w:tcPr>
+            <w:tcW w:type="dxa" w:w="3300"/>
+            <w:tcBorders>
+              <w:top w:val="single" w:color="000000" w:sz="4"/>
+              <w:left w:val="single" w:color="000000" w:sz="4"/>
+              <w:bottom w:val="single" w:color="000000" w:sz="4"/>
+              <w:right w:val="single" w:color="000000" w:sz="4"/>
+            </w:tcBorders>
+            <w:shd w:fill="E7E6E6" w:color="auto" w:val="clear"/>
+            <w:tcMar>
+              <w:top w:type="dxa" w:w="40"/>
+              <w:left w:type="dxa" w:w="80"/>
+              <w:bottom w:type="dxa" w:w="40"/>
+              <w:right w:type="dxa" w:w="80"/>
+            </w:tcMar>
+            <w:vAlign w:val="center"/>
+          </w:tcPr>
+          <w:p>
+            <w:pPr>
+              <w:spacing w:after="40" w:line="264"/>
+              <w:ind w:firstLine="0"/>
+              <w:jc w:val="center"/>
+            </w:pPr>
+            <w:r>
+              <w:rPr>
+                <w:b/>
+                <w:bCs/>
+                <w:sz w:val="24"/>
+                <w:szCs w:val="24"/>
+              </w:rPr>
+              <w:t xml:space="preserve">Link tham gia Zalo</w:t>
+            </w:r>
+          </w:p>
+        </w:tc>
+      </w:tr>
+      <w:tr>
+        <w:trPr>
+          <w:cantSplit/>
+        </w:trPr>
+        <w:tc>
+          <w:tcPr>
+            <w:tcW w:type="dxa" w:w="1500"/>
+            <w:tcBorders>
+              <w:top w:val="single" w:color="000000" w:sz="4"/>
+              <w:left w:val="single" w:color="000000" w:sz="4"/>
+              <w:bottom w:val="single" w:color="000000" w:sz="4"/>
+              <w:right w:val="single" w:color="000000" w:sz="4"/>
+            </w:tcBorders>
+            <w:tcMar>
+              <w:top w:type="dxa" w:w="40"/>
+              <w:left w:type="dxa" w:w="80"/>
+              <w:bottom w:type="dxa" w:w="40"/>
+              <w:right w:type="dxa" w:w="80"/>
+            </w:tcMar>
+            <w:vAlign w:val="top"/>
+          </w:tcPr>
+          <w:p>
+            <w:pPr>
+              <w:spacing w:after="40" w:line="264"/>
+              <w:ind w:firstLine="0"/>
+              <w:jc w:val="left"/>
+            </w:pPr>
+            <w:r>
+              <w:rPr>
+                <w:b/>
+                <w:bCs/>
+                <w:sz w:val="24"/>
+                <w:szCs w:val="24"/>
+              </w:rPr>
+              <w:t xml:space="preserve">Cụm hỗ trợ 1</w:t>
+            </w:r>
+          </w:p>
+        </w:tc>
+        <w:tc>
+          <w:tcPr>
+            <w:tcW w:type="dxa" w:w="4555"/>
+            <w:tcBorders>
+              <w:top w:val="single" w:color="000000" w:sz="4"/>
+              <w:left w:val="single" w:color="000000" w:sz="4"/>
+              <w:bottom w:val="single" w:color="000000" w:sz="4"/>
+              <w:right w:val="single" w:color="000000" w:sz="4"/>
+            </w:tcBorders>
+            <w:tcMar>
+              <w:top w:type="dxa" w:w="40"/>
+              <w:left w:type="dxa" w:w="80"/>
+              <w:bottom w:type="dxa" w:w="40"/>
+              <w:right w:type="dxa" w:w="80"/>
+            </w:tcMar>
+            <w:vAlign w:val="top"/>
+          </w:tcPr>
+          <w:p>
+            <w:pPr>
+              <w:spacing w:after="40" w:line="264"/>
+              <w:ind w:firstLine="0"/>
+              <w:jc w:val="left"/>
+            </w:pPr>
+            <w:r>
+              <w:rPr>
+                <w:sz w:val="24"/>
+                <w:szCs w:val="24"/>
+              </w:rPr>
+              <w:t xml:space="preserve">1. Trường THPT chuyên Huỳnh Mẫn Đạt</w:t>
+            </w:r>
+          </w:p>
+          <w:p>
+            <w:pPr>
+              <w:spacing w:after="40" w:line="264"/>
+              <w:ind w:firstLine="0"/>
+              <w:jc w:val="left"/>
+            </w:pPr>
+            <w:r>
+              <w:rPr>
+                <w:sz w:val="24"/>
+                <w:szCs w:val="24"/>
+              </w:rPr>
+              <w:t xml:space="preserve">2. Trường THPT Ngô Sĩ Liên</w:t>
+            </w:r>
+          </w:p>
+          <w:p>
+            <w:pPr>
+              <w:spacing w:after="40" w:line="264"/>
+              <w:ind w:firstLine="0"/>
+              <w:jc w:val="left"/>
+            </w:pPr>
+            <w:r>
+              <w:rPr>
+                <w:sz w:val="24"/>
+                <w:szCs w:val="24"/>
+              </w:rPr>
+              <w:t xml:space="preserve">3. Trường THPT Nguyễn Hùng Sơn</w:t>
+            </w:r>
+          </w:p>
+          <w:p>
+            <w:pPr>
+              <w:spacing w:after="40" w:line="264"/>
+              <w:ind w:firstLine="0"/>
+              <w:jc w:val="left"/>
+            </w:pPr>
+            <w:r>
+              <w:rPr>
+                <w:sz w:val="24"/>
+                <w:szCs w:val="24"/>
+              </w:rPr>
+              <w:t xml:space="preserve">4. Trường THPT Nguyễn Trung Trực 1</w:t>
+            </w:r>
+          </w:p>
+          <w:p>
+            <w:pPr>
+              <w:spacing w:after="40" w:line="264"/>
+              <w:ind w:firstLine="0"/>
+              <w:jc w:val="left"/>
+            </w:pPr>
+            <w:r>
+              <w:rPr>
+                <w:sz w:val="24"/>
+                <w:szCs w:val="24"/>
+              </w:rPr>
+              <w:t xml:space="preserve">5. Trường PT DTNT THCS và THPT An Giang 1</w:t>
+            </w:r>
+          </w:p>
+          <w:p>
+            <w:pPr>
+              <w:spacing w:after="40" w:line="264"/>
+              <w:ind w:firstLine="0"/>
+              <w:jc w:val="left"/>
+            </w:pPr>
+            <w:r>
+              <w:rPr>
+                <w:sz w:val="24"/>
+                <w:szCs w:val="24"/>
+              </w:rPr>
+              <w:t xml:space="preserve">6. Trường THCS và THPT Mong Thọ</w:t>
+            </w:r>
+          </w:p>
+          <w:p>
+            <w:pPr>
+              <w:spacing w:after="40" w:line="264"/>
+              <w:ind w:firstLine="0"/>
+              <w:jc w:val="left"/>
+            </w:pPr>
+            <w:r>
+              <w:rPr>
+                <w:sz w:val="24"/>
+                <w:szCs w:val="24"/>
+              </w:rPr>
+              <w:t xml:space="preserve">7. Trường THCS và THPT Võ Văn Kiệt</w:t>
+            </w:r>
+          </w:p>
+          <w:p>
+            <w:pPr>
+              <w:spacing w:after="40" w:line="264"/>
+              <w:ind w:firstLine="0"/>
+              <w:jc w:val="left"/>
+            </w:pPr>
+            <w:r>
+              <w:rPr>
+                <w:sz w:val="24"/>
+                <w:szCs w:val="24"/>
+              </w:rPr>
+              <w:t xml:space="preserve">8. Trường TH, THCS và THPT Kiên Hải</w:t>
+            </w:r>
+          </w:p>
+          <w:p>
+            <w:pPr>
+              <w:spacing w:after="40" w:line="264"/>
+              <w:ind w:firstLine="0"/>
+              <w:jc w:val="left"/>
+            </w:pPr>
+            <w:r>
+              <w:rPr>
+                <w:sz w:val="24"/>
+                <w:szCs w:val="24"/>
+              </w:rPr>
+              <w:t xml:space="preserve">9. Trường TH, THCS và THPT Lại Sơn</w:t>
+            </w:r>
+          </w:p>
+          <w:p>
+            <w:pPr>
+              <w:spacing w:after="40" w:line="264"/>
+              <w:ind w:firstLine="0"/>
+              <w:jc w:val="left"/>
+            </w:pPr>
+            <w:r>
+              <w:rPr>
+                <w:sz w:val="24"/>
+                <w:szCs w:val="24"/>
+              </w:rPr>
+              <w:t xml:space="preserve">10. Trung Tâm GDTX An Giang 1</w:t>
+            </w:r>
+          </w:p>
+          <w:p>
+            <w:pPr>
+              <w:spacing w:after="40" w:line="264"/>
+              <w:ind w:firstLine="0"/>
+              <w:jc w:val="left"/>
+            </w:pPr>
+            <w:r>
+              <w:rPr>
+                <w:sz w:val="24"/>
+                <w:szCs w:val="24"/>
+              </w:rPr>
+              <w:t xml:space="preserve">11. Trường THCS và THPT An Sơn</w:t>
+            </w:r>
+          </w:p>
+        </w:tc>
+        <w:tc>
+          <w:tcPr>
+            <w:tcW w:type="dxa" w:w="3300"/>
+            <w:tcBorders>
+              <w:top w:val="single" w:color="000000" w:sz="4"/>
+              <w:left w:val="single" w:color="000000" w:sz="4"/>
+              <w:bottom w:val="single" w:color="000000" w:sz="4"/>
+              <w:right w:val="single" w:color="000000" w:sz="4"/>
+            </w:tcBorders>
+            <w:tcMar>
+              <w:top w:type="dxa" w:w="40"/>
+              <w:left w:type="dxa" w:w="80"/>
+              <w:bottom w:type="dxa" w:w="40"/>
+              <w:right w:type="dxa" w:w="80"/>
+            </w:tcMar>
+            <w:vAlign w:val="top"/>
+          </w:tcPr>
+          <w:p>
+            <w:pPr>
+              <w:spacing w:after="40" w:line="264"/>
+              <w:ind w:firstLine="0"/>
+              <w:jc w:val="left"/>
+            </w:pPr>
+            <w:r>
+              <w:rPr>
+                <w:sz w:val="24"/>
+                <w:szCs w:val="24"/>
+              </w:rPr>
+              <w:t xml:space="preserve">https://zalo.me/g/jiciclxxj0ianu3mfrov</w:t>
+            </w:r>
+          </w:p>
+        </w:tc>
+      </w:tr>
+      <w:tr>
+        <w:trPr>
+          <w:cantSplit/>
+        </w:trPr>
+        <w:tc>
+          <w:tcPr>
+            <w:tcW w:type="dxa" w:w="1500"/>
+            <w:tcBorders>
+              <w:top w:val="single" w:color="000000" w:sz="4"/>
+              <w:left w:val="single" w:color="000000" w:sz="4"/>
+              <w:bottom w:val="single" w:color="000000" w:sz="4"/>
+              <w:right w:val="single" w:color="000000" w:sz="4"/>
+            </w:tcBorders>
+            <w:tcMar>
+              <w:top w:type="dxa" w:w="40"/>
+              <w:left w:type="dxa" w:w="80"/>
+              <w:bottom w:type="dxa" w:w="40"/>
+              <w:right w:type="dxa" w:w="80"/>
+            </w:tcMar>
+            <w:vAlign w:val="top"/>
+          </w:tcPr>
+          <w:p>
+            <w:pPr>
+              <w:spacing w:after="40" w:line="264"/>
+              <w:ind w:firstLine="0"/>
+              <w:jc w:val="left"/>
+            </w:pPr>
+            <w:r>
+              <w:rPr>
+                <w:b/>
+                <w:bCs/>
+                <w:sz w:val="24"/>
+                <w:szCs w:val="24"/>
+              </w:rPr>
+              <w:t xml:space="preserve">Cụm hỗ trợ 2</w:t>
+            </w:r>
+          </w:p>
+        </w:tc>
+        <w:tc>
+          <w:tcPr>
+            <w:tcW w:type="dxa" w:w="4555"/>
+            <w:tcBorders>
+              <w:top w:val="single" w:color="000000" w:sz="4"/>
+              <w:left w:val="single" w:color="000000" w:sz="4"/>
+              <w:bottom w:val="single" w:color="000000" w:sz="4"/>
+              <w:right w:val="single" w:color="000000" w:sz="4"/>
+            </w:tcBorders>
+            <w:tcMar>
+              <w:top w:type="dxa" w:w="40"/>
+              <w:left w:type="dxa" w:w="80"/>
+              <w:bottom w:type="dxa" w:w="40"/>
+              <w:right w:type="dxa" w:w="80"/>
+            </w:tcMar>
+            <w:vAlign w:val="top"/>
+          </w:tcPr>
+          <w:p>
+            <w:pPr>
+              <w:spacing w:after="40" w:line="264"/>
+              <w:ind w:firstLine="0"/>
+              <w:jc w:val="left"/>
+            </w:pPr>
+            <w:r>
+              <w:rPr>
+                <w:sz w:val="24"/>
+                <w:szCs w:val="24"/>
+              </w:rPr>
+              <w:t xml:space="preserve">1. Trường THPT Châu Thành</w:t>
+            </w:r>
+          </w:p>
+          <w:p>
+            <w:pPr>
+              <w:spacing w:after="40" w:line="264"/>
+              <w:ind w:firstLine="0"/>
+              <w:jc w:val="left"/>
+            </w:pPr>
+            <w:r>
+              <w:rPr>
+                <w:sz w:val="24"/>
+                <w:szCs w:val="24"/>
+              </w:rPr>
+              <w:t xml:space="preserve">2. Trường Trung cấp Kỹ thuật - Tổng hợp An Giang</w:t>
+            </w:r>
+          </w:p>
+          <w:p>
+            <w:pPr>
+              <w:spacing w:after="40" w:line="264"/>
+              <w:ind w:firstLine="0"/>
+              <w:jc w:val="left"/>
+            </w:pPr>
+            <w:r>
+              <w:rPr>
+                <w:sz w:val="24"/>
+                <w:szCs w:val="24"/>
+              </w:rPr>
+              <w:t xml:space="preserve">3. Trường Trung cấp An Giang 1</w:t>
+            </w:r>
+          </w:p>
+          <w:p>
+            <w:pPr>
+              <w:spacing w:after="40" w:line="264"/>
+              <w:ind w:firstLine="0"/>
+              <w:jc w:val="left"/>
+            </w:pPr>
+            <w:r>
+              <w:rPr>
+                <w:sz w:val="24"/>
+                <w:szCs w:val="24"/>
+              </w:rPr>
+              <w:t xml:space="preserve">4. Trường THPT Hòn Đất</w:t>
+            </w:r>
+          </w:p>
+          <w:p>
+            <w:pPr>
+              <w:spacing w:after="40" w:line="264"/>
+              <w:ind w:firstLine="0"/>
+              <w:jc w:val="left"/>
+            </w:pPr>
+            <w:r>
+              <w:rPr>
+                <w:sz w:val="24"/>
+                <w:szCs w:val="24"/>
+              </w:rPr>
+              <w:t xml:space="preserve">5. Trường THPT Sóc Sơn</w:t>
+            </w:r>
+          </w:p>
+          <w:p>
+            <w:pPr>
+              <w:spacing w:after="40" w:line="264"/>
+              <w:ind w:firstLine="0"/>
+              <w:jc w:val="left"/>
+            </w:pPr>
+            <w:r>
+              <w:rPr>
+                <w:sz w:val="24"/>
+                <w:szCs w:val="24"/>
+              </w:rPr>
+              <w:t xml:space="preserve">6. Trường THCS và THPT Bình Sơn</w:t>
+            </w:r>
+          </w:p>
+          <w:p>
+            <w:pPr>
+              <w:spacing w:after="40" w:line="264"/>
+              <w:ind w:firstLine="0"/>
+              <w:jc w:val="left"/>
+            </w:pPr>
+            <w:r>
+              <w:rPr>
+                <w:sz w:val="24"/>
+                <w:szCs w:val="24"/>
+              </w:rPr>
+              <w:t xml:space="preserve">7. Trường THCS và THPT Nam Thái Sơn</w:t>
+            </w:r>
+          </w:p>
+          <w:p>
+            <w:pPr>
+              <w:spacing w:after="40" w:line="264"/>
+              <w:ind w:firstLine="0"/>
+              <w:jc w:val="left"/>
+            </w:pPr>
+            <w:r>
+              <w:rPr>
+                <w:sz w:val="24"/>
+                <w:szCs w:val="24"/>
+              </w:rPr>
+              <w:t xml:space="preserve">8. Trường THCS và THPT Nguyễn Hùng Hiệp</w:t>
+            </w:r>
+          </w:p>
+          <w:p>
+            <w:pPr>
+              <w:spacing w:after="40" w:line="264"/>
+              <w:ind w:firstLine="0"/>
+              <w:jc w:val="left"/>
+            </w:pPr>
+            <w:r>
+              <w:rPr>
+                <w:sz w:val="24"/>
+                <w:szCs w:val="24"/>
+              </w:rPr>
+              <w:t xml:space="preserve">9. Trường THCS và THPT Phan Thị Ràng</w:t>
+            </w:r>
+          </w:p>
+          <w:p>
+            <w:pPr>
+              <w:spacing w:after="40" w:line="264"/>
+              <w:ind w:firstLine="0"/>
+              <w:jc w:val="left"/>
+            </w:pPr>
+            <w:r>
+              <w:rPr>
+                <w:sz w:val="24"/>
+                <w:szCs w:val="24"/>
+              </w:rPr>
+              <w:t xml:space="preserve">10. Trường THPT Kiên Lương</w:t>
+            </w:r>
+          </w:p>
+          <w:p>
+            <w:pPr>
+              <w:spacing w:after="40" w:line="264"/>
+              <w:ind w:firstLine="0"/>
+              <w:jc w:val="left"/>
+            </w:pPr>
+            <w:r>
+              <w:rPr>
+                <w:sz w:val="24"/>
+                <w:szCs w:val="24"/>
+              </w:rPr>
+              <w:t xml:space="preserve">11. Trường THPT Thoại Ngọc Hầu</w:t>
+            </w:r>
+          </w:p>
+          <w:p>
+            <w:pPr>
+              <w:spacing w:after="40" w:line="264"/>
+              <w:ind w:firstLine="0"/>
+              <w:jc w:val="left"/>
+            </w:pPr>
+            <w:r>
+              <w:rPr>
+                <w:sz w:val="24"/>
+                <w:szCs w:val="24"/>
+              </w:rPr>
+              <w:t xml:space="preserve">12. Trường THCS và THPT Ba Hòn</w:t>
+            </w:r>
+          </w:p>
+          <w:p>
+            <w:pPr>
+              <w:spacing w:after="40" w:line="264"/>
+              <w:ind w:firstLine="0"/>
+              <w:jc w:val="left"/>
+            </w:pPr>
+            <w:r>
+              <w:rPr>
+                <w:sz w:val="24"/>
+                <w:szCs w:val="24"/>
+              </w:rPr>
+              <w:t xml:space="preserve">13. Trung tâm GDNN-GDTX cụm Hà Tiên</w:t>
+            </w:r>
+          </w:p>
+        </w:tc>
+        <w:tc>
+          <w:tcPr>
+            <w:tcW w:type="dxa" w:w="3300"/>
+            <w:tcBorders>
+              <w:top w:val="single" w:color="000000" w:sz="4"/>
+              <w:left w:val="single" w:color="000000" w:sz="4"/>
+              <w:bottom w:val="single" w:color="000000" w:sz="4"/>
+              <w:right w:val="single" w:color="000000" w:sz="4"/>
+            </w:tcBorders>
+            <w:tcMar>
+              <w:top w:type="dxa" w:w="40"/>
+              <w:left w:type="dxa" w:w="80"/>
+              <w:bottom w:type="dxa" w:w="40"/>
+              <w:right w:type="dxa" w:w="80"/>
+            </w:tcMar>
+            <w:vAlign w:val="top"/>
+          </w:tcPr>
+          <w:p>
+            <w:pPr>
+              <w:spacing w:after="40" w:line="264"/>
+              <w:ind w:firstLine="0"/>
+              <w:jc w:val="left"/>
+            </w:pPr>
+            <w:r>
+              <w:rPr>
+                <w:sz w:val="24"/>
+                <w:szCs w:val="24"/>
+              </w:rPr>
+              <w:t xml:space="preserve">https://zalo.me/g/187j3jqe6sefqlju6uh5</w:t>
+            </w:r>
+          </w:p>
+        </w:tc>
+      </w:tr>
+      <w:tr>
+        <w:trPr>
+          <w:cantSplit/>
+        </w:trPr>
+        <w:tc>
+          <w:tcPr>
+            <w:tcW w:type="dxa" w:w="1500"/>
+            <w:tcBorders>
+              <w:top w:val="single" w:color="000000" w:sz="4"/>
+              <w:left w:val="single" w:color="000000" w:sz="4"/>
+              <w:bottom w:val="single" w:color="000000" w:sz="4"/>
+              <w:right w:val="single" w:color="000000" w:sz="4"/>
+            </w:tcBorders>
+            <w:tcMar>
+              <w:top w:type="dxa" w:w="40"/>
+              <w:left w:type="dxa" w:w="80"/>
+              <w:bottom w:type="dxa" w:w="40"/>
+              <w:right w:type="dxa" w:w="80"/>
+            </w:tcMar>
+            <w:vAlign w:val="top"/>
+          </w:tcPr>
+          <w:p>
+            <w:pPr>
+              <w:spacing w:after="40" w:line="264"/>
+              <w:ind w:firstLine="0"/>
+              <w:jc w:val="left"/>
+            </w:pPr>
+            <w:r>
+              <w:rPr>
+                <w:b/>
+                <w:bCs/>
+                <w:sz w:val="24"/>
+                <w:szCs w:val="24"/>
+              </w:rPr>
+              <w:t xml:space="preserve">Cụm hỗ trợ 3</w:t>
+            </w:r>
+          </w:p>
+        </w:tc>
+        <w:tc>
+          <w:tcPr>
+            <w:tcW w:type="dxa" w:w="4555"/>
+            <w:tcBorders>
+              <w:top w:val="single" w:color="000000" w:sz="4"/>
+              <w:left w:val="single" w:color="000000" w:sz="4"/>
+              <w:bottom w:val="single" w:color="000000" w:sz="4"/>
+              <w:right w:val="single" w:color="000000" w:sz="4"/>
+            </w:tcBorders>
+            <w:tcMar>
+              <w:top w:type="dxa" w:w="40"/>
+              <w:left w:type="dxa" w:w="80"/>
+              <w:bottom w:type="dxa" w:w="40"/>
+              <w:right w:type="dxa" w:w="80"/>
+            </w:tcMar>
+            <w:vAlign w:val="top"/>
+          </w:tcPr>
+          <w:p>
+            <w:pPr>
+              <w:spacing w:after="40" w:line="264"/>
+              <w:ind w:firstLine="0"/>
+              <w:jc w:val="left"/>
+            </w:pPr>
+            <w:r>
+              <w:rPr>
+                <w:sz w:val="24"/>
+                <w:szCs w:val="24"/>
+              </w:rPr>
+              <w:t xml:space="preserve">1. Trung tâm GDNN-GDTX cụm Giồng Riềng</w:t>
+            </w:r>
+          </w:p>
+          <w:p>
+            <w:pPr>
+              <w:spacing w:after="40" w:line="264"/>
+              <w:ind w:firstLine="0"/>
+              <w:jc w:val="left"/>
+            </w:pPr>
+            <w:r>
+              <w:rPr>
+                <w:sz w:val="24"/>
+                <w:szCs w:val="24"/>
+              </w:rPr>
+              <w:t xml:space="preserve">2. Trường THPT Giồng Riềng</w:t>
+            </w:r>
+          </w:p>
+          <w:p>
+            <w:pPr>
+              <w:spacing w:after="40" w:line="264"/>
+              <w:ind w:firstLine="0"/>
+              <w:jc w:val="left"/>
+            </w:pPr>
+            <w:r>
+              <w:rPr>
+                <w:sz w:val="24"/>
+                <w:szCs w:val="24"/>
+              </w:rPr>
+              <w:t xml:space="preserve">3. Trường THCS và THPT Bàn Tân Định</w:t>
+            </w:r>
+          </w:p>
+          <w:p>
+            <w:pPr>
+              <w:spacing w:after="40" w:line="264"/>
+              <w:ind w:firstLine="0"/>
+              <w:jc w:val="left"/>
+            </w:pPr>
+            <w:r>
+              <w:rPr>
+                <w:sz w:val="24"/>
+                <w:szCs w:val="24"/>
+              </w:rPr>
+              <w:t xml:space="preserve">4. Trường THCS và THPT Hòa Hưng</w:t>
+            </w:r>
+          </w:p>
+          <w:p>
+            <w:pPr>
+              <w:spacing w:after="40" w:line="264"/>
+              <w:ind w:firstLine="0"/>
+              <w:jc w:val="left"/>
+            </w:pPr>
+            <w:r>
+              <w:rPr>
+                <w:sz w:val="24"/>
+                <w:szCs w:val="24"/>
+              </w:rPr>
+              <w:t xml:space="preserve">5. Trường THCS và THPT Hòa Thuận</w:t>
+            </w:r>
+          </w:p>
+          <w:p>
+            <w:pPr>
+              <w:spacing w:after="40" w:line="264"/>
+              <w:ind w:firstLine="0"/>
+              <w:jc w:val="left"/>
+            </w:pPr>
+            <w:r>
+              <w:rPr>
+                <w:sz w:val="24"/>
+                <w:szCs w:val="24"/>
+              </w:rPr>
+              <w:t xml:space="preserve">6. Trường THCS và THPT Long Thạnh</w:t>
+            </w:r>
+          </w:p>
+          <w:p>
+            <w:pPr>
+              <w:spacing w:after="40" w:line="264"/>
+              <w:ind w:firstLine="0"/>
+              <w:jc w:val="left"/>
+            </w:pPr>
+            <w:r>
+              <w:rPr>
+                <w:sz w:val="24"/>
+                <w:szCs w:val="24"/>
+              </w:rPr>
+              <w:t xml:space="preserve">7. Trường THCS và THPT Thạnh Lộc</w:t>
+            </w:r>
+          </w:p>
+          <w:p>
+            <w:pPr>
+              <w:spacing w:after="40" w:line="264"/>
+              <w:ind w:firstLine="0"/>
+              <w:jc w:val="left"/>
+            </w:pPr>
+            <w:r>
+              <w:rPr>
+                <w:sz w:val="24"/>
+                <w:szCs w:val="24"/>
+              </w:rPr>
+              <w:t xml:space="preserve">8. Trường Trung cấp nghề Dân tộc nội trú An Giang</w:t>
+            </w:r>
+          </w:p>
+          <w:p>
+            <w:pPr>
+              <w:spacing w:after="40" w:line="264"/>
+              <w:ind w:firstLine="0"/>
+              <w:jc w:val="left"/>
+            </w:pPr>
+            <w:r>
+              <w:rPr>
+                <w:sz w:val="24"/>
+                <w:szCs w:val="24"/>
+              </w:rPr>
+              <w:t xml:space="preserve">9. Trường THPT Nguyễn Thần Hiến</w:t>
+            </w:r>
+          </w:p>
+          <w:p>
+            <w:pPr>
+              <w:spacing w:after="40" w:line="264"/>
+              <w:ind w:firstLine="0"/>
+              <w:jc w:val="left"/>
+            </w:pPr>
+            <w:r>
+              <w:rPr>
+                <w:sz w:val="24"/>
+                <w:szCs w:val="24"/>
+              </w:rPr>
+              <w:t xml:space="preserve">10. Trường THCS và THPT Vĩnh Thắng</w:t>
+            </w:r>
+          </w:p>
+          <w:p>
+            <w:pPr>
+              <w:spacing w:after="40" w:line="264"/>
+              <w:ind w:firstLine="0"/>
+              <w:jc w:val="left"/>
+            </w:pPr>
+            <w:r>
+              <w:rPr>
+                <w:sz w:val="24"/>
+                <w:szCs w:val="24"/>
+              </w:rPr>
+              <w:t xml:space="preserve">11. Trung tâm GDNN-GDTX cụm Gò Quao</w:t>
+            </w:r>
+          </w:p>
+          <w:p>
+            <w:pPr>
+              <w:spacing w:after="40" w:line="264"/>
+              <w:ind w:firstLine="0"/>
+              <w:jc w:val="left"/>
+            </w:pPr>
+            <w:r>
+              <w:rPr>
+                <w:sz w:val="24"/>
+                <w:szCs w:val="24"/>
+              </w:rPr>
+              <w:t xml:space="preserve">12. Trường THCS và THPT Thới Quản</w:t>
+            </w:r>
+          </w:p>
+          <w:p>
+            <w:pPr>
+              <w:spacing w:after="40" w:line="264"/>
+              <w:ind w:firstLine="0"/>
+              <w:jc w:val="left"/>
+            </w:pPr>
+            <w:r>
+              <w:rPr>
+                <w:sz w:val="24"/>
+                <w:szCs w:val="24"/>
+              </w:rPr>
+              <w:t xml:space="preserve">13. Trường THCS và THPT Vĩnh Hòa Hưng Bắc</w:t>
+            </w:r>
+          </w:p>
+          <w:p>
+            <w:pPr>
+              <w:spacing w:after="40" w:line="264"/>
+              <w:ind w:firstLine="0"/>
+              <w:jc w:val="left"/>
+            </w:pPr>
+            <w:r>
+              <w:rPr>
+                <w:sz w:val="24"/>
+                <w:szCs w:val="24"/>
+              </w:rPr>
+              <w:t xml:space="preserve">14. Trường THPT Gò Quao</w:t>
+            </w:r>
+          </w:p>
+          <w:p>
+            <w:pPr>
+              <w:spacing w:after="40" w:line="264"/>
+              <w:ind w:firstLine="0"/>
+              <w:jc w:val="left"/>
+            </w:pPr>
+            <w:r>
+              <w:rPr>
+                <w:sz w:val="24"/>
+                <w:szCs w:val="24"/>
+              </w:rPr>
+              <w:t xml:space="preserve">15. Trường THCS và THPT Định An</w:t>
+            </w:r>
+          </w:p>
+        </w:tc>
+        <w:tc>
+          <w:tcPr>
+            <w:tcW w:type="dxa" w:w="3300"/>
+            <w:tcBorders>
+              <w:top w:val="single" w:color="000000" w:sz="4"/>
+              <w:left w:val="single" w:color="000000" w:sz="4"/>
+              <w:bottom w:val="single" w:color="000000" w:sz="4"/>
+              <w:right w:val="single" w:color="000000" w:sz="4"/>
+            </w:tcBorders>
+            <w:tcMar>
+              <w:top w:type="dxa" w:w="40"/>
+              <w:left w:type="dxa" w:w="80"/>
+              <w:bottom w:type="dxa" w:w="40"/>
+              <w:right w:type="dxa" w:w="80"/>
+            </w:tcMar>
+            <w:vAlign w:val="top"/>
+          </w:tcPr>
+          <w:p>
+            <w:pPr>
+              <w:spacing w:after="40" w:line="264"/>
+              <w:ind w:firstLine="0"/>
+              <w:jc w:val="left"/>
+            </w:pPr>
+            <w:r>
+              <w:rPr>
+                <w:sz w:val="24"/>
+                <w:szCs w:val="24"/>
+              </w:rPr>
+              <w:t xml:space="preserve">https://zalo.me/g/makl763buz3ppqibfk7y</w:t>
+            </w:r>
+          </w:p>
+        </w:tc>
+      </w:tr>
+      <w:tr>
+        <w:trPr>
+          <w:cantSplit/>
+        </w:trPr>
+        <w:tc>
+          <w:tcPr>
+            <w:tcW w:type="dxa" w:w="1500"/>
+            <w:tcBorders>
+              <w:top w:val="single" w:color="000000" w:sz="4"/>
+              <w:left w:val="single" w:color="000000" w:sz="4"/>
+              <w:bottom w:val="single" w:color="000000" w:sz="4"/>
+              <w:right w:val="single" w:color="000000" w:sz="4"/>
+            </w:tcBorders>
+            <w:tcMar>
+              <w:top w:type="dxa" w:w="40"/>
+              <w:left w:type="dxa" w:w="80"/>
+              <w:bottom w:type="dxa" w:w="40"/>
+              <w:right w:type="dxa" w:w="80"/>
+            </w:tcMar>
+            <w:vAlign w:val="top"/>
+          </w:tcPr>
+          <w:p>
+            <w:pPr>
+              <w:spacing w:after="40" w:line="264"/>
+              <w:ind w:firstLine="0"/>
+              <w:jc w:val="left"/>
+            </w:pPr>
+            <w:r>
+              <w:rPr>
+                <w:b/>
+                <w:bCs/>
+                <w:sz w:val="24"/>
+                <w:szCs w:val="24"/>
+              </w:rPr>
+              <w:t xml:space="preserve">Cụm hỗ trợ 4</w:t>
+            </w:r>
+          </w:p>
+        </w:tc>
+        <w:tc>
+          <w:tcPr>
+            <w:tcW w:type="dxa" w:w="4555"/>
+            <w:tcBorders>
+              <w:top w:val="single" w:color="000000" w:sz="4"/>
+              <w:left w:val="single" w:color="000000" w:sz="4"/>
+              <w:bottom w:val="single" w:color="000000" w:sz="4"/>
+              <w:right w:val="single" w:color="000000" w:sz="4"/>
+            </w:tcBorders>
+            <w:tcMar>
+              <w:top w:type="dxa" w:w="40"/>
+              <w:left w:type="dxa" w:w="80"/>
+              <w:bottom w:type="dxa" w:w="40"/>
+              <w:right w:type="dxa" w:w="80"/>
+            </w:tcMar>
+            <w:vAlign w:val="top"/>
+          </w:tcPr>
+          <w:p>
+            <w:pPr>
+              <w:spacing w:after="40" w:line="264"/>
+              <w:ind w:firstLine="0"/>
+              <w:jc w:val="left"/>
+            </w:pPr>
+            <w:r>
+              <w:rPr>
+                <w:sz w:val="24"/>
+                <w:szCs w:val="24"/>
+              </w:rPr>
+              <w:t xml:space="preserve">1. Trường THCS và THPT Tân Thành</w:t>
+            </w:r>
+          </w:p>
+          <w:p>
+            <w:pPr>
+              <w:spacing w:after="40" w:line="264"/>
+              <w:ind w:firstLine="0"/>
+              <w:jc w:val="left"/>
+            </w:pPr>
+            <w:r>
+              <w:rPr>
+                <w:sz w:val="24"/>
+                <w:szCs w:val="24"/>
+              </w:rPr>
+              <w:t xml:space="preserve">2. Trường THPT Tân Hiệp</w:t>
+            </w:r>
+          </w:p>
+          <w:p>
+            <w:pPr>
+              <w:spacing w:after="40" w:line="264"/>
+              <w:ind w:firstLine="0"/>
+              <w:jc w:val="left"/>
+            </w:pPr>
+            <w:r>
+              <w:rPr>
+                <w:sz w:val="24"/>
+                <w:szCs w:val="24"/>
+              </w:rPr>
+              <w:t xml:space="preserve">3. Trường THCS và THPT Thạnh Tây</w:t>
+            </w:r>
+          </w:p>
+          <w:p>
+            <w:pPr>
+              <w:spacing w:after="40" w:line="264"/>
+              <w:ind w:firstLine="0"/>
+              <w:jc w:val="left"/>
+            </w:pPr>
+            <w:r>
+              <w:rPr>
+                <w:sz w:val="24"/>
+                <w:szCs w:val="24"/>
+              </w:rPr>
+              <w:t xml:space="preserve">4. Trường THPT Thạnh Đông</w:t>
+            </w:r>
+          </w:p>
+          <w:p>
+            <w:pPr>
+              <w:spacing w:after="40" w:line="264"/>
+              <w:ind w:firstLine="0"/>
+              <w:jc w:val="left"/>
+            </w:pPr>
+            <w:r>
+              <w:rPr>
+                <w:sz w:val="24"/>
+                <w:szCs w:val="24"/>
+              </w:rPr>
+              <w:t xml:space="preserve">5. Trường THCS và THPT Vĩnh Thuận</w:t>
+            </w:r>
+          </w:p>
+          <w:p>
+            <w:pPr>
+              <w:spacing w:after="40" w:line="264"/>
+              <w:ind w:firstLine="0"/>
+              <w:jc w:val="left"/>
+            </w:pPr>
+            <w:r>
+              <w:rPr>
+                <w:sz w:val="24"/>
+                <w:szCs w:val="24"/>
+              </w:rPr>
+              <w:t xml:space="preserve">6. Trường THPT An Minh</w:t>
+            </w:r>
+          </w:p>
+          <w:p>
+            <w:pPr>
+              <w:spacing w:after="40" w:line="264"/>
+              <w:ind w:firstLine="0"/>
+              <w:jc w:val="left"/>
+            </w:pPr>
+            <w:r>
+              <w:rPr>
+                <w:sz w:val="24"/>
+                <w:szCs w:val="24"/>
+              </w:rPr>
+              <w:t xml:space="preserve">7. Trường THPT Vĩnh Thuận</w:t>
+            </w:r>
+          </w:p>
+          <w:p>
+            <w:pPr>
+              <w:spacing w:after="40" w:line="264"/>
+              <w:ind w:firstLine="0"/>
+              <w:jc w:val="left"/>
+            </w:pPr>
+            <w:r>
+              <w:rPr>
+                <w:sz w:val="24"/>
+                <w:szCs w:val="24"/>
+              </w:rPr>
+              <w:t xml:space="preserve">8. Trường THCS và THPT U Minh Thượng</w:t>
+            </w:r>
+          </w:p>
+          <w:p>
+            <w:pPr>
+              <w:spacing w:after="40" w:line="264"/>
+              <w:ind w:firstLine="0"/>
+              <w:jc w:val="left"/>
+            </w:pPr>
+            <w:r>
+              <w:rPr>
+                <w:sz w:val="24"/>
+                <w:szCs w:val="24"/>
+              </w:rPr>
+              <w:t xml:space="preserve">9. Trường THCS và THPT Vĩnh Hòa</w:t>
+            </w:r>
+          </w:p>
+          <w:p>
+            <w:pPr>
+              <w:spacing w:after="40" w:line="264"/>
+              <w:ind w:firstLine="0"/>
+              <w:jc w:val="left"/>
+            </w:pPr>
+            <w:r>
+              <w:rPr>
+                <w:sz w:val="24"/>
+                <w:szCs w:val="24"/>
+              </w:rPr>
+              <w:t xml:space="preserve">10. Trường THCS và THPT Vĩnh Phong</w:t>
+            </w:r>
+          </w:p>
+          <w:p>
+            <w:pPr>
+              <w:spacing w:after="40" w:line="264"/>
+              <w:ind w:firstLine="0"/>
+              <w:jc w:val="left"/>
+            </w:pPr>
+            <w:r>
+              <w:rPr>
+                <w:sz w:val="24"/>
+                <w:szCs w:val="24"/>
+              </w:rPr>
+              <w:t xml:space="preserve">11. Trường THCS và THPT Đông Thái</w:t>
+            </w:r>
+          </w:p>
+          <w:p>
+            <w:pPr>
+              <w:spacing w:after="40" w:line="264"/>
+              <w:ind w:firstLine="0"/>
+              <w:jc w:val="left"/>
+            </w:pPr>
+            <w:r>
+              <w:rPr>
+                <w:sz w:val="24"/>
+                <w:szCs w:val="24"/>
+              </w:rPr>
+              <w:t xml:space="preserve">12. Trường THCS và THPT Minh Thuận</w:t>
+            </w:r>
+          </w:p>
+          <w:p>
+            <w:pPr>
+              <w:spacing w:after="40" w:line="264"/>
+              <w:ind w:firstLine="0"/>
+              <w:jc w:val="left"/>
+            </w:pPr>
+            <w:r>
+              <w:rPr>
+                <w:sz w:val="24"/>
+                <w:szCs w:val="24"/>
+              </w:rPr>
+              <w:t xml:space="preserve">13. Trường THCS và THPT Nam Yên</w:t>
+            </w:r>
+          </w:p>
+          <w:p>
+            <w:pPr>
+              <w:spacing w:after="40" w:line="264"/>
+              <w:ind w:firstLine="0"/>
+              <w:jc w:val="left"/>
+            </w:pPr>
+            <w:r>
+              <w:rPr>
+                <w:sz w:val="24"/>
+                <w:szCs w:val="24"/>
+              </w:rPr>
+              <w:t xml:space="preserve">14. Trường THPT An Biên</w:t>
+            </w:r>
+          </w:p>
+        </w:tc>
+        <w:tc>
+          <w:tcPr>
+            <w:tcW w:type="dxa" w:w="3300"/>
+            <w:tcBorders>
+              <w:top w:val="single" w:color="000000" w:sz="4"/>
+              <w:left w:val="single" w:color="000000" w:sz="4"/>
+              <w:bottom w:val="single" w:color="000000" w:sz="4"/>
+              <w:right w:val="single" w:color="000000" w:sz="4"/>
+            </w:tcBorders>
+            <w:tcMar>
+              <w:top w:type="dxa" w:w="40"/>
+              <w:left w:type="dxa" w:w="80"/>
+              <w:bottom w:type="dxa" w:w="40"/>
+              <w:right w:type="dxa" w:w="80"/>
+            </w:tcMar>
+            <w:vAlign w:val="top"/>
+          </w:tcPr>
+          <w:p>
+            <w:pPr>
+              <w:spacing w:after="40" w:line="264"/>
+              <w:ind w:firstLine="0"/>
+              <w:jc w:val="left"/>
+            </w:pPr>
+            <w:r>
+              <w:rPr>
+                <w:sz w:val="24"/>
+                <w:szCs w:val="24"/>
+              </w:rPr>
+              <w:t xml:space="preserve">https://zalo.me/g/j3za7zgwqhixlueio59b</w:t>
+            </w:r>
+          </w:p>
+        </w:tc>
+      </w:tr>
+      <w:tr>
+        <w:trPr>
+          <w:cantSplit/>
+        </w:trPr>
+        <w:tc>
+          <w:tcPr>
+            <w:tcW w:type="dxa" w:w="1500"/>
+            <w:tcBorders>
+              <w:top w:val="single" w:color="000000" w:sz="4"/>
+              <w:left w:val="single" w:color="000000" w:sz="4"/>
+              <w:bottom w:val="single" w:color="000000" w:sz="4"/>
+              <w:right w:val="single" w:color="000000" w:sz="4"/>
+            </w:tcBorders>
+            <w:tcMar>
+              <w:top w:type="dxa" w:w="40"/>
+              <w:left w:type="dxa" w:w="80"/>
+              <w:bottom w:type="dxa" w:w="40"/>
+              <w:right w:type="dxa" w:w="80"/>
+            </w:tcMar>
+            <w:vAlign w:val="top"/>
+          </w:tcPr>
+          <w:p>
+            <w:pPr>
+              <w:spacing w:after="40" w:line="264"/>
+              <w:ind w:firstLine="0"/>
+              <w:jc w:val="left"/>
+            </w:pPr>
+            <w:r>
+              <w:rPr>
+                <w:b/>
+                <w:bCs/>
+                <w:sz w:val="24"/>
+                <w:szCs w:val="24"/>
+              </w:rPr>
+              <w:t xml:space="preserve">Cụm hỗ trợ 5</w:t>
+            </w:r>
+          </w:p>
+        </w:tc>
+        <w:tc>
+          <w:tcPr>
+            <w:tcW w:type="dxa" w:w="4555"/>
+            <w:tcBorders>
+              <w:top w:val="single" w:color="000000" w:sz="4"/>
+              <w:left w:val="single" w:color="000000" w:sz="4"/>
+              <w:bottom w:val="single" w:color="000000" w:sz="4"/>
+              <w:right w:val="single" w:color="000000" w:sz="4"/>
+            </w:tcBorders>
+            <w:tcMar>
+              <w:top w:type="dxa" w:w="40"/>
+              <w:left w:type="dxa" w:w="80"/>
+              <w:bottom w:type="dxa" w:w="40"/>
+              <w:right w:type="dxa" w:w="80"/>
+            </w:tcMar>
+            <w:vAlign w:val="top"/>
+          </w:tcPr>
+          <w:p>
+            <w:pPr>
+              <w:spacing w:after="40" w:line="264"/>
+              <w:ind w:firstLine="0"/>
+              <w:jc w:val="left"/>
+            </w:pPr>
+            <w:r>
+              <w:rPr>
+                <w:sz w:val="24"/>
+                <w:szCs w:val="24"/>
+              </w:rPr>
+              <w:t xml:space="preserve">1. Trường THCS và THPT Vân Khánh</w:t>
+            </w:r>
+          </w:p>
+          <w:p>
+            <w:pPr>
+              <w:spacing w:after="40" w:line="264"/>
+              <w:ind w:firstLine="0"/>
+              <w:jc w:val="left"/>
+            </w:pPr>
+            <w:r>
+              <w:rPr>
+                <w:sz w:val="24"/>
+                <w:szCs w:val="24"/>
+              </w:rPr>
+              <w:t xml:space="preserve">2. Trường THCS và THPT Vĩnh Bình Bắc</w:t>
+            </w:r>
+          </w:p>
+          <w:p>
+            <w:pPr>
+              <w:spacing w:after="40" w:line="264"/>
+              <w:ind w:firstLine="0"/>
+              <w:jc w:val="left"/>
+            </w:pPr>
+            <w:r>
+              <w:rPr>
+                <w:sz w:val="24"/>
+                <w:szCs w:val="24"/>
+              </w:rPr>
+              <w:t xml:space="preserve">3. Trường THCS và THPT Nguyễn Văn Xiện</w:t>
+            </w:r>
+          </w:p>
+          <w:p>
+            <w:pPr>
+              <w:spacing w:after="40" w:line="264"/>
+              <w:ind w:firstLine="0"/>
+              <w:jc w:val="left"/>
+            </w:pPr>
+            <w:r>
+              <w:rPr>
+                <w:sz w:val="24"/>
+                <w:szCs w:val="24"/>
+              </w:rPr>
+              <w:t xml:space="preserve">4. Trường THPT An Thới</w:t>
+            </w:r>
+          </w:p>
+          <w:p>
+            <w:pPr>
+              <w:spacing w:after="40" w:line="264"/>
+              <w:ind w:firstLine="0"/>
+              <w:jc w:val="left"/>
+            </w:pPr>
+            <w:r>
+              <w:rPr>
+                <w:sz w:val="24"/>
+                <w:szCs w:val="24"/>
+              </w:rPr>
+              <w:t xml:space="preserve">5. Trường THPT Dương Đông</w:t>
+            </w:r>
+          </w:p>
+          <w:p>
+            <w:pPr>
+              <w:spacing w:after="40" w:line="264"/>
+              <w:ind w:firstLine="0"/>
+              <w:jc w:val="left"/>
+            </w:pPr>
+            <w:r>
+              <w:rPr>
+                <w:sz w:val="24"/>
+                <w:szCs w:val="24"/>
+              </w:rPr>
+              <w:t xml:space="preserve">6. Trường THPT Phú Quốc</w:t>
+            </w:r>
+          </w:p>
+          <w:p>
+            <w:pPr>
+              <w:spacing w:after="40" w:line="264"/>
+              <w:ind w:firstLine="0"/>
+              <w:jc w:val="left"/>
+            </w:pPr>
+            <w:r>
+              <w:rPr>
+                <w:sz w:val="24"/>
+                <w:szCs w:val="24"/>
+              </w:rPr>
+              <w:t xml:space="preserve">7. Trung tâm GDNN-GDTX cụm Đặc khu Phú Quốc</w:t>
+            </w:r>
+          </w:p>
+          <w:p>
+            <w:pPr>
+              <w:spacing w:after="40" w:line="264"/>
+              <w:ind w:firstLine="0"/>
+              <w:jc w:val="left"/>
+            </w:pPr>
+            <w:r>
+              <w:rPr>
+                <w:sz w:val="24"/>
+                <w:szCs w:val="24"/>
+              </w:rPr>
+              <w:t xml:space="preserve">8. Trường Trung cấp Việt - Hàn Phú Quốc</w:t>
+            </w:r>
+          </w:p>
+          <w:p>
+            <w:pPr>
+              <w:spacing w:after="40" w:line="264"/>
+              <w:ind w:firstLine="0"/>
+              <w:jc w:val="left"/>
+            </w:pPr>
+            <w:r>
+              <w:rPr>
+                <w:sz w:val="24"/>
+                <w:szCs w:val="24"/>
+              </w:rPr>
+              <w:t xml:space="preserve">9. Trường THPT An Phú</w:t>
+            </w:r>
+          </w:p>
+          <w:p>
+            <w:pPr>
+              <w:spacing w:after="40" w:line="264"/>
+              <w:ind w:firstLine="0"/>
+              <w:jc w:val="left"/>
+            </w:pPr>
+            <w:r>
+              <w:rPr>
+                <w:sz w:val="24"/>
+                <w:szCs w:val="24"/>
+              </w:rPr>
+              <w:t xml:space="preserve">10. Trường THPT Châu Phong</w:t>
+            </w:r>
+          </w:p>
+          <w:p>
+            <w:pPr>
+              <w:spacing w:after="40" w:line="264"/>
+              <w:ind w:firstLine="0"/>
+              <w:jc w:val="left"/>
+            </w:pPr>
+            <w:r>
+              <w:rPr>
+                <w:sz w:val="24"/>
+                <w:szCs w:val="24"/>
+              </w:rPr>
+              <w:t xml:space="preserve">11. Trường THPT Châu Phú</w:t>
+            </w:r>
+          </w:p>
+          <w:p>
+            <w:pPr>
+              <w:spacing w:after="40" w:line="264"/>
+              <w:ind w:firstLine="0"/>
+              <w:jc w:val="left"/>
+            </w:pPr>
+            <w:r>
+              <w:rPr>
+                <w:sz w:val="24"/>
+                <w:szCs w:val="24"/>
+              </w:rPr>
+              <w:t xml:space="preserve">12. Trường THPT Nguyễn Công Trứ</w:t>
+            </w:r>
+          </w:p>
+          <w:p>
+            <w:pPr>
+              <w:spacing w:after="40" w:line="264"/>
+              <w:ind w:firstLine="0"/>
+              <w:jc w:val="left"/>
+            </w:pPr>
+            <w:r>
+              <w:rPr>
+                <w:sz w:val="24"/>
+                <w:szCs w:val="24"/>
+              </w:rPr>
+              <w:t xml:space="preserve">13. Trường THPT Nguyễn Quang Diêu</w:t>
+            </w:r>
+          </w:p>
+          <w:p>
+            <w:pPr>
+              <w:spacing w:after="40" w:line="264"/>
+              <w:ind w:firstLine="0"/>
+              <w:jc w:val="left"/>
+            </w:pPr>
+            <w:r>
+              <w:rPr>
+                <w:sz w:val="24"/>
+                <w:szCs w:val="24"/>
+              </w:rPr>
+              <w:t xml:space="preserve">14. Trường THPT Trần Văn Thành</w:t>
+            </w:r>
+          </w:p>
+          <w:p>
+            <w:pPr>
+              <w:spacing w:after="40" w:line="264"/>
+              <w:ind w:firstLine="0"/>
+              <w:jc w:val="left"/>
+            </w:pPr>
+            <w:r>
+              <w:rPr>
+                <w:sz w:val="24"/>
+                <w:szCs w:val="24"/>
+              </w:rPr>
+              <w:t xml:space="preserve">15. Trường THPT Vĩnh Trạch</w:t>
+            </w:r>
+          </w:p>
+        </w:tc>
+        <w:tc>
+          <w:tcPr>
+            <w:tcW w:type="dxa" w:w="3300"/>
+            <w:tcBorders>
+              <w:top w:val="single" w:color="000000" w:sz="4"/>
+              <w:left w:val="single" w:color="000000" w:sz="4"/>
+              <w:bottom w:val="single" w:color="000000" w:sz="4"/>
+              <w:right w:val="single" w:color="000000" w:sz="4"/>
+            </w:tcBorders>
+            <w:tcMar>
+              <w:top w:type="dxa" w:w="40"/>
+              <w:left w:type="dxa" w:w="80"/>
+              <w:bottom w:type="dxa" w:w="40"/>
+              <w:right w:type="dxa" w:w="80"/>
+            </w:tcMar>
+            <w:vAlign w:val="top"/>
+          </w:tcPr>
+          <w:p>
+            <w:pPr>
+              <w:spacing w:after="40" w:line="264"/>
+              <w:ind w:firstLine="0"/>
+              <w:jc w:val="left"/>
+            </w:pPr>
+            <w:r>
+              <w:rPr>
+                <w:sz w:val="24"/>
+                <w:szCs w:val="24"/>
+              </w:rPr>
+              <w:t xml:space="preserve">https://zalo.me/g/drb3x1mherfsbj7ldn4v</w:t>
+            </w:r>
+          </w:p>
+        </w:tc>
+      </w:tr>
+      <w:tr>
+        <w:trPr>
+          <w:cantSplit/>
+        </w:trPr>
+        <w:tc>
+          <w:tcPr>
+            <w:tcW w:type="dxa" w:w="1500"/>
+            <w:tcBorders>
+              <w:top w:val="single" w:color="000000" w:sz="4"/>
+              <w:left w:val="single" w:color="000000" w:sz="4"/>
+              <w:bottom w:val="single" w:color="000000" w:sz="4"/>
+              <w:right w:val="single" w:color="000000" w:sz="4"/>
+            </w:tcBorders>
+            <w:tcMar>
+              <w:top w:type="dxa" w:w="40"/>
+              <w:left w:type="dxa" w:w="80"/>
+              <w:bottom w:type="dxa" w:w="40"/>
+              <w:right w:type="dxa" w:w="80"/>
+            </w:tcMar>
+            <w:vAlign w:val="top"/>
+          </w:tcPr>
+          <w:p>
+            <w:pPr>
+              <w:spacing w:after="40" w:line="264"/>
+              <w:ind w:firstLine="0"/>
+              <w:jc w:val="left"/>
+            </w:pPr>
+            <w:r>
+              <w:rPr>
+                <w:b/>
+                <w:bCs/>
+                <w:sz w:val="24"/>
+                <w:szCs w:val="24"/>
+              </w:rPr>
+              <w:t xml:space="preserve">Cụm hỗ trợ 6</w:t>
+            </w:r>
+          </w:p>
+        </w:tc>
+        <w:tc>
+          <w:tcPr>
+            <w:tcW w:type="dxa" w:w="4555"/>
+            <w:tcBorders>
+              <w:top w:val="single" w:color="000000" w:sz="4"/>
+              <w:left w:val="single" w:color="000000" w:sz="4"/>
+              <w:bottom w:val="single" w:color="000000" w:sz="4"/>
+              <w:right w:val="single" w:color="000000" w:sz="4"/>
+            </w:tcBorders>
+            <w:tcMar>
+              <w:top w:type="dxa" w:w="40"/>
+              <w:left w:type="dxa" w:w="80"/>
+              <w:bottom w:type="dxa" w:w="40"/>
+              <w:right w:type="dxa" w:w="80"/>
+            </w:tcMar>
+            <w:vAlign w:val="top"/>
+          </w:tcPr>
+          <w:p>
+            <w:pPr>
+              <w:spacing w:after="40" w:line="264"/>
+              <w:ind w:firstLine="0"/>
+              <w:jc w:val="left"/>
+            </w:pPr>
+            <w:r>
+              <w:rPr>
+                <w:sz w:val="24"/>
+                <w:szCs w:val="24"/>
+              </w:rPr>
+              <w:t xml:space="preserve">1. Trường THPT Vọng Thê</w:t>
+            </w:r>
+          </w:p>
+          <w:p>
+            <w:pPr>
+              <w:spacing w:after="40" w:line="264"/>
+              <w:ind w:firstLine="0"/>
+              <w:jc w:val="left"/>
+            </w:pPr>
+            <w:r>
+              <w:rPr>
+                <w:sz w:val="24"/>
+                <w:szCs w:val="24"/>
+              </w:rPr>
+              <w:t xml:space="preserve">2. Trường PT DTNT THCS và THPT An Giang 2</w:t>
+            </w:r>
+          </w:p>
+          <w:p>
+            <w:pPr>
+              <w:spacing w:after="40" w:line="264"/>
+              <w:ind w:firstLine="0"/>
+              <w:jc w:val="left"/>
+            </w:pPr>
+            <w:r>
+              <w:rPr>
+                <w:sz w:val="24"/>
+                <w:szCs w:val="24"/>
+              </w:rPr>
+              <w:t xml:space="preserve">3. Trường THCS và THPT Bình Long</w:t>
+            </w:r>
+          </w:p>
+          <w:p>
+            <w:pPr>
+              <w:spacing w:after="40" w:line="264"/>
+              <w:ind w:firstLine="0"/>
+              <w:jc w:val="left"/>
+            </w:pPr>
+            <w:r>
+              <w:rPr>
+                <w:sz w:val="24"/>
+                <w:szCs w:val="24"/>
+              </w:rPr>
+              <w:t xml:space="preserve">4. Trường THCS và THPT Long Bình</w:t>
+            </w:r>
+          </w:p>
+          <w:p>
+            <w:pPr>
+              <w:spacing w:after="40" w:line="264"/>
+              <w:ind w:firstLine="0"/>
+              <w:jc w:val="left"/>
+            </w:pPr>
+            <w:r>
+              <w:rPr>
+                <w:sz w:val="24"/>
+                <w:szCs w:val="24"/>
+              </w:rPr>
+              <w:t xml:space="preserve">5. Trường THCS và THPT Phú Tân</w:t>
+            </w:r>
+          </w:p>
+          <w:p>
+            <w:pPr>
+              <w:spacing w:after="40" w:line="264"/>
+              <w:ind w:firstLine="0"/>
+              <w:jc w:val="left"/>
+            </w:pPr>
+            <w:r>
+              <w:rPr>
+                <w:sz w:val="24"/>
+                <w:szCs w:val="24"/>
+              </w:rPr>
+              <w:t xml:space="preserve">6. Trung tâm GDNN-GDTX Phú Tân</w:t>
+            </w:r>
+          </w:p>
+          <w:p>
+            <w:pPr>
+              <w:spacing w:after="40" w:line="264"/>
+              <w:ind w:firstLine="0"/>
+              <w:jc w:val="left"/>
+            </w:pPr>
+            <w:r>
+              <w:rPr>
+                <w:sz w:val="24"/>
+                <w:szCs w:val="24"/>
+              </w:rPr>
+              <w:t xml:space="preserve">7. Trường THPT Bình Mỹ</w:t>
+            </w:r>
+          </w:p>
+          <w:p>
+            <w:pPr>
+              <w:spacing w:after="40" w:line="264"/>
+              <w:ind w:firstLine="0"/>
+              <w:jc w:val="left"/>
+            </w:pPr>
+            <w:r>
+              <w:rPr>
+                <w:sz w:val="24"/>
+                <w:szCs w:val="24"/>
+              </w:rPr>
+              <w:t xml:space="preserve">8. Trường THPT Nguyễn Hiền</w:t>
+            </w:r>
+          </w:p>
+          <w:p>
+            <w:pPr>
+              <w:spacing w:after="40" w:line="264"/>
+              <w:ind w:firstLine="0"/>
+              <w:jc w:val="left"/>
+            </w:pPr>
+            <w:r>
+              <w:rPr>
+                <w:sz w:val="24"/>
+                <w:szCs w:val="24"/>
+              </w:rPr>
+              <w:t xml:space="preserve">9. Trường THPT Nguyễn Văn Hưởng</w:t>
+            </w:r>
+          </w:p>
+          <w:p>
+            <w:pPr>
+              <w:spacing w:after="40" w:line="264"/>
+              <w:ind w:firstLine="0"/>
+              <w:jc w:val="left"/>
+            </w:pPr>
+            <w:r>
+              <w:rPr>
+                <w:sz w:val="24"/>
+                <w:szCs w:val="24"/>
+              </w:rPr>
+              <w:t xml:space="preserve">10. Trường THPT Vĩnh Bình</w:t>
+            </w:r>
+          </w:p>
+          <w:p>
+            <w:pPr>
+              <w:spacing w:after="40" w:line="264"/>
+              <w:ind w:firstLine="0"/>
+              <w:jc w:val="left"/>
+            </w:pPr>
+            <w:r>
+              <w:rPr>
+                <w:sz w:val="24"/>
+                <w:szCs w:val="24"/>
+              </w:rPr>
+              <w:t xml:space="preserve">11. Trường THPT Võ Thị Sáu</w:t>
+            </w:r>
+          </w:p>
+          <w:p>
+            <w:pPr>
+              <w:spacing w:after="40" w:line="264"/>
+              <w:ind w:firstLine="0"/>
+              <w:jc w:val="left"/>
+            </w:pPr>
+            <w:r>
+              <w:rPr>
+                <w:sz w:val="24"/>
+                <w:szCs w:val="24"/>
+              </w:rPr>
+              <w:t xml:space="preserve">12. Trường THCS và THPT Vĩnh Hanh</w:t>
+            </w:r>
+          </w:p>
+        </w:tc>
+        <w:tc>
+          <w:tcPr>
+            <w:tcW w:type="dxa" w:w="3300"/>
+            <w:tcBorders>
+              <w:top w:val="single" w:color="000000" w:sz="4"/>
+              <w:left w:val="single" w:color="000000" w:sz="4"/>
+              <w:bottom w:val="single" w:color="000000" w:sz="4"/>
+              <w:right w:val="single" w:color="000000" w:sz="4"/>
+            </w:tcBorders>
+            <w:tcMar>
+              <w:top w:type="dxa" w:w="40"/>
+              <w:left w:type="dxa" w:w="80"/>
+              <w:bottom w:type="dxa" w:w="40"/>
+              <w:right w:type="dxa" w:w="80"/>
+            </w:tcMar>
+            <w:vAlign w:val="top"/>
+          </w:tcPr>
+          <w:p>
+            <w:pPr>
+              <w:spacing w:after="40" w:line="264"/>
+              <w:ind w:firstLine="0"/>
+              <w:jc w:val="left"/>
+            </w:pPr>
+            <w:r>
+              <w:rPr>
+                <w:sz w:val="24"/>
+                <w:szCs w:val="24"/>
+              </w:rPr>
+              <w:t xml:space="preserve">https://zalo.me/g/5utluxouvzard8ktl5zv</w:t>
+            </w:r>
+          </w:p>
+        </w:tc>
+      </w:tr>
+      <w:tr>
+        <w:trPr>
+          <w:cantSplit/>
+        </w:trPr>
+        <w:tc>
+          <w:tcPr>
+            <w:tcW w:type="dxa" w:w="1500"/>
+            <w:tcBorders>
+              <w:top w:val="single" w:color="000000" w:sz="4"/>
+              <w:left w:val="single" w:color="000000" w:sz="4"/>
+              <w:bottom w:val="single" w:color="000000" w:sz="4"/>
+              <w:right w:val="single" w:color="000000" w:sz="4"/>
+            </w:tcBorders>
+            <w:tcMar>
+              <w:top w:type="dxa" w:w="40"/>
+              <w:left w:type="dxa" w:w="80"/>
+              <w:bottom w:type="dxa" w:w="40"/>
+              <w:right w:type="dxa" w:w="80"/>
+            </w:tcMar>
+            <w:vAlign w:val="top"/>
+          </w:tcPr>
+          <w:p>
+            <w:pPr>
+              <w:spacing w:after="40" w:line="264"/>
+              <w:ind w:firstLine="0"/>
+              <w:jc w:val="left"/>
+            </w:pPr>
+            <w:r>
+              <w:rPr>
+                <w:b/>
+                <w:bCs/>
+                <w:sz w:val="24"/>
+                <w:szCs w:val="24"/>
+              </w:rPr>
+              <w:t xml:space="preserve">Cụm hỗ trợ 7</w:t>
+            </w:r>
+          </w:p>
+        </w:tc>
+        <w:tc>
+          <w:tcPr>
+            <w:tcW w:type="dxa" w:w="4555"/>
+            <w:tcBorders>
+              <w:top w:val="single" w:color="000000" w:sz="4"/>
+              <w:left w:val="single" w:color="000000" w:sz="4"/>
+              <w:bottom w:val="single" w:color="000000" w:sz="4"/>
+              <w:right w:val="single" w:color="000000" w:sz="4"/>
+            </w:tcBorders>
+            <w:tcMar>
+              <w:top w:type="dxa" w:w="40"/>
+              <w:left w:type="dxa" w:w="80"/>
+              <w:bottom w:type="dxa" w:w="40"/>
+              <w:right w:type="dxa" w:w="80"/>
+            </w:tcMar>
+            <w:vAlign w:val="top"/>
+          </w:tcPr>
+          <w:p>
+            <w:pPr>
+              <w:spacing w:after="40" w:line="264"/>
+              <w:ind w:firstLine="0"/>
+              <w:jc w:val="left"/>
+            </w:pPr>
+            <w:r>
+              <w:rPr>
+                <w:sz w:val="24"/>
+                <w:szCs w:val="24"/>
+              </w:rPr>
+              <w:t xml:space="preserve">1. Trung tâm GDNN-GDTX Tịnh Biên</w:t>
+            </w:r>
+          </w:p>
+          <w:p>
+            <w:pPr>
+              <w:spacing w:after="40" w:line="264"/>
+              <w:ind w:firstLine="0"/>
+              <w:jc w:val="left"/>
+            </w:pPr>
+            <w:r>
+              <w:rPr>
+                <w:sz w:val="24"/>
+                <w:szCs w:val="24"/>
+              </w:rPr>
+              <w:t xml:space="preserve">2. Trường THPT Chuyên Thoại Ngọc Hầu</w:t>
+            </w:r>
+          </w:p>
+          <w:p>
+            <w:pPr>
+              <w:spacing w:after="40" w:line="264"/>
+              <w:ind w:firstLine="0"/>
+              <w:jc w:val="left"/>
+            </w:pPr>
+            <w:r>
+              <w:rPr>
+                <w:sz w:val="24"/>
+                <w:szCs w:val="24"/>
+              </w:rPr>
+              <w:t xml:space="preserve">3. Trường THPT Nguyễn Trung Trực 2</w:t>
+            </w:r>
+          </w:p>
+          <w:p>
+            <w:pPr>
+              <w:spacing w:after="40" w:line="264"/>
+              <w:ind w:firstLine="0"/>
+              <w:jc w:val="left"/>
+            </w:pPr>
+            <w:r>
+              <w:rPr>
+                <w:sz w:val="24"/>
+                <w:szCs w:val="24"/>
+              </w:rPr>
+              <w:t xml:space="preserve">4. Trường THPT Nguyễn Văn Thoại</w:t>
+            </w:r>
+          </w:p>
+          <w:p>
+            <w:pPr>
+              <w:spacing w:after="40" w:line="264"/>
+              <w:ind w:firstLine="0"/>
+              <w:jc w:val="left"/>
+            </w:pPr>
+            <w:r>
+              <w:rPr>
+                <w:sz w:val="24"/>
+                <w:szCs w:val="24"/>
+              </w:rPr>
+              <w:t xml:space="preserve">5. Trường THPT Tân Châu</w:t>
+            </w:r>
+          </w:p>
+          <w:p>
+            <w:pPr>
+              <w:spacing w:after="40" w:line="264"/>
+              <w:ind w:firstLine="0"/>
+              <w:jc w:val="left"/>
+            </w:pPr>
+            <w:r>
+              <w:rPr>
+                <w:sz w:val="24"/>
+                <w:szCs w:val="24"/>
+              </w:rPr>
+              <w:t xml:space="preserve">6. Trường THPT Vĩnh Xương</w:t>
+            </w:r>
+          </w:p>
+          <w:p>
+            <w:pPr>
+              <w:spacing w:after="40" w:line="264"/>
+              <w:ind w:firstLine="0"/>
+              <w:jc w:val="left"/>
+            </w:pPr>
+            <w:r>
+              <w:rPr>
+                <w:sz w:val="24"/>
+                <w:szCs w:val="24"/>
+              </w:rPr>
+              <w:t xml:space="preserve">7. Trường THPT Võ Thành Trinh</w:t>
+            </w:r>
+          </w:p>
+          <w:p>
+            <w:pPr>
+              <w:spacing w:after="40" w:line="264"/>
+              <w:ind w:firstLine="0"/>
+              <w:jc w:val="left"/>
+            </w:pPr>
+            <w:r>
+              <w:rPr>
+                <w:sz w:val="24"/>
+                <w:szCs w:val="24"/>
+              </w:rPr>
+              <w:t xml:space="preserve">8. Trường THCS và THPT Cô Tô</w:t>
+            </w:r>
+          </w:p>
+          <w:p>
+            <w:pPr>
+              <w:spacing w:after="40" w:line="264"/>
+              <w:ind w:firstLine="0"/>
+              <w:jc w:val="left"/>
+            </w:pPr>
+            <w:r>
+              <w:rPr>
+                <w:sz w:val="24"/>
+                <w:szCs w:val="24"/>
+              </w:rPr>
+              <w:t xml:space="preserve">9. Trung tâm GDTX An Giang 2</w:t>
+            </w:r>
+          </w:p>
+          <w:p>
+            <w:pPr>
+              <w:spacing w:after="40" w:line="264"/>
+              <w:ind w:firstLine="0"/>
+              <w:jc w:val="left"/>
+            </w:pPr>
+            <w:r>
+              <w:rPr>
+                <w:sz w:val="24"/>
+                <w:szCs w:val="24"/>
+              </w:rPr>
+              <w:t xml:space="preserve">10. Trung tâm GDNN-GDTX Thoại Sơn</w:t>
+            </w:r>
+          </w:p>
+          <w:p>
+            <w:pPr>
+              <w:spacing w:after="40" w:line="264"/>
+              <w:ind w:firstLine="0"/>
+              <w:jc w:val="left"/>
+            </w:pPr>
+            <w:r>
+              <w:rPr>
+                <w:sz w:val="24"/>
+                <w:szCs w:val="24"/>
+              </w:rPr>
+              <w:t xml:space="preserve">11. Trường THPT Cần Đăng</w:t>
+            </w:r>
+          </w:p>
+          <w:p>
+            <w:pPr>
+              <w:spacing w:after="40" w:line="264"/>
+              <w:ind w:firstLine="0"/>
+              <w:jc w:val="left"/>
+            </w:pPr>
+            <w:r>
+              <w:rPr>
+                <w:sz w:val="24"/>
+                <w:szCs w:val="24"/>
+              </w:rPr>
+              <w:t xml:space="preserve">12. Trường THPT Chi Lăng</w:t>
+            </w:r>
+          </w:p>
+          <w:p>
+            <w:pPr>
+              <w:spacing w:after="40" w:line="264"/>
+              <w:ind w:firstLine="0"/>
+              <w:jc w:val="left"/>
+            </w:pPr>
+            <w:r>
+              <w:rPr>
+                <w:sz w:val="24"/>
+                <w:szCs w:val="24"/>
+              </w:rPr>
+              <w:t xml:space="preserve">13. Trường THPT Hòa Lạc</w:t>
+            </w:r>
+          </w:p>
+          <w:p>
+            <w:pPr>
+              <w:spacing w:after="40" w:line="264"/>
+              <w:ind w:firstLine="0"/>
+              <w:jc w:val="left"/>
+            </w:pPr>
+            <w:r>
+              <w:rPr>
+                <w:sz w:val="24"/>
+                <w:szCs w:val="24"/>
+              </w:rPr>
+              <w:t xml:space="preserve">14. Trường THPT Huỳnh Thị Hưởng</w:t>
+            </w:r>
+          </w:p>
+        </w:tc>
+        <w:tc>
+          <w:tcPr>
+            <w:tcW w:type="dxa" w:w="3300"/>
+            <w:tcBorders>
+              <w:top w:val="single" w:color="000000" w:sz="4"/>
+              <w:left w:val="single" w:color="000000" w:sz="4"/>
+              <w:bottom w:val="single" w:color="000000" w:sz="4"/>
+              <w:right w:val="single" w:color="000000" w:sz="4"/>
+            </w:tcBorders>
+            <w:tcMar>
+              <w:top w:type="dxa" w:w="40"/>
+              <w:left w:type="dxa" w:w="80"/>
+              <w:bottom w:type="dxa" w:w="40"/>
+              <w:right w:type="dxa" w:w="80"/>
+            </w:tcMar>
+            <w:vAlign w:val="top"/>
+          </w:tcPr>
+          <w:p>
+            <w:pPr>
+              <w:spacing w:after="40" w:line="264"/>
+              <w:ind w:firstLine="0"/>
+              <w:jc w:val="left"/>
+            </w:pPr>
+            <w:r>
+              <w:rPr>
+                <w:sz w:val="24"/>
+                <w:szCs w:val="24"/>
+              </w:rPr>
+              <w:t xml:space="preserve">https://zalo.me/g/jekclf0jbx5jpawcnpec</w:t>
+            </w:r>
+          </w:p>
+        </w:tc>
+      </w:tr>
+      <w:tr>
+        <w:trPr>
+          <w:cantSplit/>
+        </w:trPr>
+        <w:tc>
+          <w:tcPr>
+            <w:tcW w:type="dxa" w:w="1500"/>
+            <w:tcBorders>
+              <w:top w:val="single" w:color="000000" w:sz="4"/>
+              <w:left w:val="single" w:color="000000" w:sz="4"/>
+              <w:bottom w:val="single" w:color="000000" w:sz="4"/>
+              <w:right w:val="single" w:color="000000" w:sz="4"/>
+            </w:tcBorders>
+            <w:tcMar>
+              <w:top w:type="dxa" w:w="40"/>
+              <w:left w:type="dxa" w:w="80"/>
+              <w:bottom w:type="dxa" w:w="40"/>
+              <w:right w:type="dxa" w:w="80"/>
+            </w:tcMar>
+            <w:vAlign w:val="top"/>
+          </w:tcPr>
+          <w:p>
+            <w:pPr>
+              <w:spacing w:after="40" w:line="264"/>
+              <w:ind w:firstLine="0"/>
+              <w:jc w:val="left"/>
+            </w:pPr>
+            <w:r>
+              <w:rPr>
+                <w:b/>
+                <w:bCs/>
+                <w:sz w:val="24"/>
+                <w:szCs w:val="24"/>
+              </w:rPr>
+              <w:t xml:space="preserve">Cụm hỗ trợ 8</w:t>
+            </w:r>
+          </w:p>
+        </w:tc>
+        <w:tc>
+          <w:tcPr>
+            <w:tcW w:type="dxa" w:w="4555"/>
+            <w:tcBorders>
+              <w:top w:val="single" w:color="000000" w:sz="4"/>
+              <w:left w:val="single" w:color="000000" w:sz="4"/>
+              <w:bottom w:val="single" w:color="000000" w:sz="4"/>
+              <w:right w:val="single" w:color="000000" w:sz="4"/>
+            </w:tcBorders>
+            <w:tcMar>
+              <w:top w:type="dxa" w:w="40"/>
+              <w:left w:type="dxa" w:w="80"/>
+              <w:bottom w:type="dxa" w:w="40"/>
+              <w:right w:type="dxa" w:w="80"/>
+            </w:tcMar>
+            <w:vAlign w:val="top"/>
+          </w:tcPr>
+          <w:p>
+            <w:pPr>
+              <w:spacing w:after="40" w:line="264"/>
+              <w:ind w:firstLine="0"/>
+              <w:jc w:val="left"/>
+            </w:pPr>
+            <w:r>
+              <w:rPr>
+                <w:sz w:val="24"/>
+                <w:szCs w:val="24"/>
+              </w:rPr>
+              <w:t xml:space="preserve">1. Trường THPT Lương Văn Cù</w:t>
+            </w:r>
+          </w:p>
+          <w:p>
+            <w:pPr>
+              <w:spacing w:after="40" w:line="264"/>
+              <w:ind w:firstLine="0"/>
+              <w:jc w:val="left"/>
+            </w:pPr>
+            <w:r>
+              <w:rPr>
+                <w:sz w:val="24"/>
+                <w:szCs w:val="24"/>
+              </w:rPr>
+              <w:t xml:space="preserve">2. Trường THPT Nguyễn Khuyến</w:t>
+            </w:r>
+          </w:p>
+          <w:p>
+            <w:pPr>
+              <w:spacing w:after="40" w:line="264"/>
+              <w:ind w:firstLine="0"/>
+              <w:jc w:val="left"/>
+            </w:pPr>
+            <w:r>
+              <w:rPr>
+                <w:sz w:val="24"/>
+                <w:szCs w:val="24"/>
+              </w:rPr>
+              <w:t xml:space="preserve">3. Trường THPT Ung Văn Khiêm</w:t>
+            </w:r>
+          </w:p>
+          <w:p>
+            <w:pPr>
+              <w:spacing w:after="40" w:line="264"/>
+              <w:ind w:firstLine="0"/>
+              <w:jc w:val="left"/>
+            </w:pPr>
+            <w:r>
+              <w:rPr>
+                <w:sz w:val="24"/>
+                <w:szCs w:val="24"/>
+              </w:rPr>
+              <w:t xml:space="preserve">4. Trường THPT Xuân Tô</w:t>
+            </w:r>
+          </w:p>
+          <w:p>
+            <w:pPr>
+              <w:spacing w:after="40" w:line="264"/>
+              <w:ind w:firstLine="0"/>
+              <w:jc w:val="left"/>
+            </w:pPr>
+            <w:r>
+              <w:rPr>
+                <w:sz w:val="24"/>
+                <w:szCs w:val="24"/>
+              </w:rPr>
+              <w:t xml:space="preserve">5. Trường THCS và THPT Mỹ Hòa Hưng</w:t>
+            </w:r>
+          </w:p>
+          <w:p>
+            <w:pPr>
+              <w:spacing w:after="40" w:line="264"/>
+              <w:ind w:firstLine="0"/>
+              <w:jc w:val="left"/>
+            </w:pPr>
+            <w:r>
+              <w:rPr>
+                <w:sz w:val="24"/>
+                <w:szCs w:val="24"/>
+              </w:rPr>
+              <w:t xml:space="preserve">6. Trung tâm GDNN-GDTX An Phú</w:t>
+            </w:r>
+          </w:p>
+          <w:p>
+            <w:pPr>
+              <w:spacing w:after="40" w:line="264"/>
+              <w:ind w:firstLine="0"/>
+              <w:jc w:val="left"/>
+            </w:pPr>
+            <w:r>
+              <w:rPr>
+                <w:sz w:val="24"/>
+                <w:szCs w:val="24"/>
+              </w:rPr>
+              <w:t xml:space="preserve">7. Trường Trẻ em Khuyết tật An Giang</w:t>
+            </w:r>
+          </w:p>
+          <w:p>
+            <w:pPr>
+              <w:spacing w:after="40" w:line="264"/>
+              <w:ind w:firstLine="0"/>
+              <w:jc w:val="left"/>
+            </w:pPr>
+            <w:r>
+              <w:rPr>
+                <w:sz w:val="24"/>
+                <w:szCs w:val="24"/>
+              </w:rPr>
+              <w:t xml:space="preserve">8. Trường THPT Bình Thạnh Đông</w:t>
+            </w:r>
+          </w:p>
+          <w:p>
+            <w:pPr>
+              <w:spacing w:after="40" w:line="264"/>
+              <w:ind w:firstLine="0"/>
+              <w:jc w:val="left"/>
+            </w:pPr>
+            <w:r>
+              <w:rPr>
+                <w:sz w:val="24"/>
+                <w:szCs w:val="24"/>
+              </w:rPr>
+              <w:t xml:space="preserve">9. Trường THPT Châu Thị Tế</w:t>
+            </w:r>
+          </w:p>
+          <w:p>
+            <w:pPr>
+              <w:spacing w:after="40" w:line="264"/>
+              <w:ind w:firstLine="0"/>
+              <w:jc w:val="left"/>
+            </w:pPr>
+            <w:r>
+              <w:rPr>
+                <w:sz w:val="24"/>
+                <w:szCs w:val="24"/>
+              </w:rPr>
+              <w:t xml:space="preserve">10. Trường THPT Chuyên Thủ Khoa Nghĩa</w:t>
+            </w:r>
+          </w:p>
+          <w:p>
+            <w:pPr>
+              <w:spacing w:after="40" w:line="264"/>
+              <w:ind w:firstLine="0"/>
+              <w:jc w:val="left"/>
+            </w:pPr>
+            <w:r>
+              <w:rPr>
+                <w:sz w:val="24"/>
+                <w:szCs w:val="24"/>
+              </w:rPr>
+              <w:t xml:space="preserve">11. Trường THPT Nguyễn Bỉnh Khiêm</w:t>
+            </w:r>
+          </w:p>
+          <w:p>
+            <w:pPr>
+              <w:spacing w:after="40" w:line="264"/>
+              <w:ind w:firstLine="0"/>
+              <w:jc w:val="left"/>
+            </w:pPr>
+            <w:r>
+              <w:rPr>
+                <w:sz w:val="24"/>
+                <w:szCs w:val="24"/>
+              </w:rPr>
+              <w:t xml:space="preserve">12. Trường THPT Nguyễn Chí Thanh</w:t>
+            </w:r>
+          </w:p>
+          <w:p>
+            <w:pPr>
+              <w:spacing w:after="40" w:line="264"/>
+              <w:ind w:firstLine="0"/>
+              <w:jc w:val="left"/>
+            </w:pPr>
+            <w:r>
+              <w:rPr>
+                <w:sz w:val="24"/>
+                <w:szCs w:val="24"/>
+              </w:rPr>
+              <w:t xml:space="preserve">13. Trường THPT Nguyễn Sinh Sắc</w:t>
+            </w:r>
+          </w:p>
+        </w:tc>
+        <w:tc>
+          <w:tcPr>
+            <w:tcW w:type="dxa" w:w="3300"/>
+            <w:tcBorders>
+              <w:top w:val="single" w:color="000000" w:sz="4"/>
+              <w:left w:val="single" w:color="000000" w:sz="4"/>
+              <w:bottom w:val="single" w:color="000000" w:sz="4"/>
+              <w:right w:val="single" w:color="000000" w:sz="4"/>
+            </w:tcBorders>
+            <w:tcMar>
+              <w:top w:type="dxa" w:w="40"/>
+              <w:left w:type="dxa" w:w="80"/>
+              <w:bottom w:type="dxa" w:w="40"/>
+              <w:right w:type="dxa" w:w="80"/>
+            </w:tcMar>
+            <w:vAlign w:val="top"/>
+          </w:tcPr>
+          <w:p>
+            <w:pPr>
+              <w:spacing w:after="40" w:line="264"/>
+              <w:ind w:firstLine="0"/>
+              <w:jc w:val="left"/>
+            </w:pPr>
+            <w:r>
+              <w:rPr>
+                <w:sz w:val="24"/>
+                <w:szCs w:val="24"/>
+              </w:rPr>
+              <w:t xml:space="preserve">https://zalo.me/g/hvwvlnkezun2xbvqj4p8</w:t>
+            </w:r>
+          </w:p>
+        </w:tc>
+      </w:tr>
+      <w:tr>
+        <w:trPr>
+          <w:cantSplit/>
+        </w:trPr>
+        <w:tc>
+          <w:tcPr>
+            <w:tcW w:type="dxa" w:w="1500"/>
+            <w:tcBorders>
+              <w:top w:val="single" w:color="000000" w:sz="4"/>
+              <w:left w:val="single" w:color="000000" w:sz="4"/>
+              <w:bottom w:val="single" w:color="000000" w:sz="4"/>
+              <w:right w:val="single" w:color="000000" w:sz="4"/>
+            </w:tcBorders>
+            <w:tcMar>
+              <w:top w:type="dxa" w:w="40"/>
+              <w:left w:type="dxa" w:w="80"/>
+              <w:bottom w:type="dxa" w:w="40"/>
+              <w:right w:type="dxa" w:w="80"/>
+            </w:tcMar>
+            <w:vAlign w:val="top"/>
+          </w:tcPr>
+          <w:p>
+            <w:pPr>
+              <w:spacing w:after="40" w:line="264"/>
+              <w:ind w:firstLine="0"/>
+              <w:jc w:val="left"/>
+            </w:pPr>
+            <w:r>
+              <w:rPr>
+                <w:b/>
+                <w:bCs/>
+                <w:sz w:val="24"/>
+                <w:szCs w:val="24"/>
+              </w:rPr>
+              <w:t xml:space="preserve">Cụm hỗ trợ 9</w:t>
+            </w:r>
+          </w:p>
+        </w:tc>
+        <w:tc>
+          <w:tcPr>
+            <w:tcW w:type="dxa" w:w="4555"/>
+            <w:tcBorders>
+              <w:top w:val="single" w:color="000000" w:sz="4"/>
+              <w:left w:val="single" w:color="000000" w:sz="4"/>
+              <w:bottom w:val="single" w:color="000000" w:sz="4"/>
+              <w:right w:val="single" w:color="000000" w:sz="4"/>
+            </w:tcBorders>
+            <w:tcMar>
+              <w:top w:type="dxa" w:w="40"/>
+              <w:left w:type="dxa" w:w="80"/>
+              <w:bottom w:type="dxa" w:w="40"/>
+              <w:right w:type="dxa" w:w="80"/>
+            </w:tcMar>
+            <w:vAlign w:val="top"/>
+          </w:tcPr>
+          <w:p>
+            <w:pPr>
+              <w:spacing w:after="40" w:line="264"/>
+              <w:ind w:firstLine="0"/>
+              <w:jc w:val="left"/>
+            </w:pPr>
+            <w:r>
+              <w:rPr>
+                <w:sz w:val="24"/>
+                <w:szCs w:val="24"/>
+              </w:rPr>
+              <w:t xml:space="preserve">1. Trường THPT Thạnh Mỹ Tây</w:t>
+            </w:r>
+          </w:p>
+          <w:p>
+            <w:pPr>
+              <w:spacing w:after="40" w:line="264"/>
+              <w:ind w:firstLine="0"/>
+              <w:jc w:val="left"/>
+            </w:pPr>
+            <w:r>
+              <w:rPr>
+                <w:sz w:val="24"/>
+                <w:szCs w:val="24"/>
+              </w:rPr>
+              <w:t xml:space="preserve">2. Trường THPT Tịnh Biên</w:t>
+            </w:r>
+          </w:p>
+          <w:p>
+            <w:pPr>
+              <w:spacing w:after="40" w:line="264"/>
+              <w:ind w:firstLine="0"/>
+              <w:jc w:val="left"/>
+            </w:pPr>
+            <w:r>
+              <w:rPr>
+                <w:sz w:val="24"/>
+                <w:szCs w:val="24"/>
+              </w:rPr>
+              <w:t xml:space="preserve">3. Trường THCS và THPT Bình Chánh</w:t>
+            </w:r>
+          </w:p>
+          <w:p>
+            <w:pPr>
+              <w:spacing w:after="40" w:line="264"/>
+              <w:ind w:firstLine="0"/>
+              <w:jc w:val="left"/>
+            </w:pPr>
+            <w:r>
+              <w:rPr>
+                <w:sz w:val="24"/>
+                <w:szCs w:val="24"/>
+              </w:rPr>
+              <w:t xml:space="preserve">4. Trường THCS và THPT Vĩnh Lộc</w:t>
+            </w:r>
+          </w:p>
+          <w:p>
+            <w:pPr>
+              <w:spacing w:after="40" w:line="264"/>
+              <w:ind w:firstLine="0"/>
+              <w:jc w:val="left"/>
+            </w:pPr>
+            <w:r>
+              <w:rPr>
+                <w:sz w:val="24"/>
+                <w:szCs w:val="24"/>
+              </w:rPr>
+              <w:t xml:space="preserve">5. Trường THPT Ba Chúc</w:t>
+            </w:r>
+          </w:p>
+          <w:p>
+            <w:pPr>
+              <w:spacing w:after="40" w:line="264"/>
+              <w:ind w:firstLine="0"/>
+              <w:jc w:val="left"/>
+            </w:pPr>
+            <w:r>
+              <w:rPr>
+                <w:sz w:val="24"/>
+                <w:szCs w:val="24"/>
+              </w:rPr>
+              <w:t xml:space="preserve">6. Trường THPT Châu Văn Liêm</w:t>
+            </w:r>
+          </w:p>
+          <w:p>
+            <w:pPr>
+              <w:spacing w:after="40" w:line="264"/>
+              <w:ind w:firstLine="0"/>
+              <w:jc w:val="left"/>
+            </w:pPr>
+            <w:r>
+              <w:rPr>
+                <w:sz w:val="24"/>
+                <w:szCs w:val="24"/>
+              </w:rPr>
+              <w:t xml:space="preserve">7. Trường THPT Chu Văn An</w:t>
+            </w:r>
+          </w:p>
+          <w:p>
+            <w:pPr>
+              <w:spacing w:after="40" w:line="264"/>
+              <w:ind w:firstLine="0"/>
+              <w:jc w:val="left"/>
+            </w:pPr>
+            <w:r>
+              <w:rPr>
+                <w:sz w:val="24"/>
+                <w:szCs w:val="24"/>
+              </w:rPr>
+              <w:t xml:space="preserve">8. Trường THPT Long Xuyên</w:t>
+            </w:r>
+          </w:p>
+          <w:p>
+            <w:pPr>
+              <w:spacing w:after="40" w:line="264"/>
+              <w:ind w:firstLine="0"/>
+              <w:jc w:val="left"/>
+            </w:pPr>
+            <w:r>
+              <w:rPr>
+                <w:sz w:val="24"/>
+                <w:szCs w:val="24"/>
+              </w:rPr>
+              <w:t xml:space="preserve">9. Trường THPT Nguyễn Hữu Cảnh</w:t>
+            </w:r>
+          </w:p>
+          <w:p>
+            <w:pPr>
+              <w:spacing w:after="40" w:line="264"/>
+              <w:ind w:firstLine="0"/>
+              <w:jc w:val="left"/>
+            </w:pPr>
+            <w:r>
+              <w:rPr>
+                <w:sz w:val="24"/>
+                <w:szCs w:val="24"/>
+              </w:rPr>
+              <w:t xml:space="preserve">10. Trường THPT Quốc Thái</w:t>
+            </w:r>
+          </w:p>
+          <w:p>
+            <w:pPr>
+              <w:spacing w:after="40" w:line="264"/>
+              <w:ind w:firstLine="0"/>
+              <w:jc w:val="left"/>
+            </w:pPr>
+            <w:r>
+              <w:rPr>
+                <w:sz w:val="24"/>
+                <w:szCs w:val="24"/>
+              </w:rPr>
+              <w:t xml:space="preserve">11. Trung tâm GDNN-GDTX Châu Thành</w:t>
+            </w:r>
+          </w:p>
+          <w:p>
+            <w:pPr>
+              <w:spacing w:after="40" w:line="264"/>
+              <w:ind w:firstLine="0"/>
+              <w:jc w:val="left"/>
+            </w:pPr>
+            <w:r>
+              <w:rPr>
+                <w:sz w:val="24"/>
+                <w:szCs w:val="24"/>
+              </w:rPr>
+              <w:t xml:space="preserve">12. Trường Trung cấp Kỹ thuật-Công nghệ An Giang</w:t>
+            </w:r>
+          </w:p>
+        </w:tc>
+        <w:tc>
+          <w:tcPr>
+            <w:tcW w:type="dxa" w:w="3300"/>
+            <w:tcBorders>
+              <w:top w:val="single" w:color="000000" w:sz="4"/>
+              <w:left w:val="single" w:color="000000" w:sz="4"/>
+              <w:bottom w:val="single" w:color="000000" w:sz="4"/>
+              <w:right w:val="single" w:color="000000" w:sz="4"/>
+            </w:tcBorders>
+            <w:tcMar>
+              <w:top w:type="dxa" w:w="40"/>
+              <w:left w:type="dxa" w:w="80"/>
+              <w:bottom w:type="dxa" w:w="40"/>
+              <w:right w:type="dxa" w:w="80"/>
+            </w:tcMar>
+            <w:vAlign w:val="top"/>
+          </w:tcPr>
+          <w:p>
+            <w:pPr>
+              <w:spacing w:after="40" w:line="264"/>
+              <w:ind w:firstLine="0"/>
+              <w:jc w:val="left"/>
+            </w:pPr>
+            <w:r>
+              <w:rPr>
+                <w:sz w:val="24"/>
+                <w:szCs w:val="24"/>
+              </w:rPr>
+              <w:t xml:space="preserve">https://zalo.me/g/bmrz4c3zhqxqzt1saisu</w:t>
+            </w:r>
+          </w:p>
+        </w:tc>
+      </w:tr>
+    </w:tbl>
+    <w:p>
+      <w:pPr>
+        <w:spacing w:after="120" w:line="240"/>
+        <w:ind w:firstLine="0"/>
+      </w:pPr>
     </w:p>
     <w:sectPr>
       <w:headerReference w:type="default" r:id="rId7"/>

</xml_diff>

<commit_message>
feat(huong-dan): loi vao phu luc nhom Zalo cho nguoi chua dang nhap; ban Word bo phan chi co tren web
- Trang dang nhap: link "Tra cuu nhom Zalo ho tro theo truong" -> /huong-dan#phu-luc-zalo
- Trang gioi thieu: cau hoi "Toi tham gia nhom Zalo ho tro nao?"
- Ban Word: bo nhan "(lam ngay)", doi "Viec can lam ngay bay gio" -> "Thu tu cac viec can lam",
  "dung cong cu o Phan 3" -> "xem cach viet mat khau o muc III", "(Phan N)" -> "(xem muc N)";
  phu luc them cau huong dan + dia chi ban truc tuyen; sinh lai docx

Co-Authored-By: Claude Opus 5.5 <noreply@anthropic.com>
</commit_message>
<xml_diff>
--- a/docs/huong-dan-hoc-vien.docx
+++ b/docs/huong-dan-hoc-vien.docx
@@ -551,16 +551,7 @@
                 <w:sz w:val="24"/>
                 <w:szCs w:val="24"/>
               </w:rPr>
-              <w:t xml:space="preserve">. </w:t>
-            </w:r>
-            <w:r>
-              <w:rPr>
-                <w:i/>
-                <w:iCs/>
-                <w:sz w:val="24"/>
-                <w:szCs w:val="24"/>
-              </w:rPr>
-              <w:t xml:space="preserve">(làm ngay)</w:t>
+              <w:t xml:space="preserve">.</w:t>
             </w:r>
           </w:p>
         </w:tc>
@@ -663,16 +654,7 @@
                 <w:sz w:val="24"/>
                 <w:szCs w:val="24"/>
               </w:rPr>
-              <w:t xml:space="preserve">Hồ sơ đủ thì khối khảo sát mở trên Trang chủ. Làm lần lượt 2 phiếu: khảo sát kĩ năng số, rồi đánh giá năng lực số. </w:t>
-            </w:r>
-            <w:r>
-              <w:rPr>
-                <w:i/>
-                <w:iCs/>
-                <w:sz w:val="24"/>
-                <w:szCs w:val="24"/>
-              </w:rPr>
-              <w:t xml:space="preserve">(làm ngay)</w:t>
+              <w:t xml:space="preserve">Hồ sơ đủ thì khối khảo sát mở trên Trang chủ. Làm lần lượt 2 phiếu: khảo sát kĩ năng số, rồi đánh giá năng lực số.</w:t>
             </w:r>
           </w:p>
         </w:tc>
@@ -1006,10 +988,10 @@
           <w:i/>
           <w:iCs/>
         </w:rPr>
-        <w:t xml:space="preserve">Lưu ý – Việc cần làm ngay bây giờ: </w:t>
-      </w:r>
-      <w:r>
-        <w:t xml:space="preserve">Đăng nhập (mục III) → bổ sung hồ sơ, chọn đúng Đối tượng (mục VI) → làm 2 phiếu khảo sát (mục VII) → kiểm tra cả hai phiếu đã hiện "Đã hoàn thành". Chưa có tên trong danh sách học viên nên không đăng nhập được? Xem mục XIII hoặc gửi email hỗ trợ.</w:t>
+        <w:t xml:space="preserve">Lưu ý – Thứ tự các việc cần làm: </w:t>
+      </w:r>
+      <w:r>
+        <w:t xml:space="preserve">Đăng nhập (xem mục III) → bổ sung hồ sơ, chọn đúng Đối tượng (xem mục VI) → làm 2 phiếu khảo sát (xem mục VII) → kiểm tra cả hai phiếu đã hiện "Đã hoàn thành". Chưa có tên trong danh sách học viên nên không đăng nhập được? Xem mục XIII hoặc gửi email hỗ trợ.</w:t>
       </w:r>
     </w:p>
     <w:p>
@@ -1048,7 +1030,7 @@
         <w:t xml:space="preserve">“Vào nhóm Zalo”</w:t>
       </w:r>
       <w:r>
-        <w:t xml:space="preserve"> để nhận thông báo và được hỗ trợ suốt khóa học (mục VIII). Chưa thấy nút này, Thầy/Cô tra tên trường mình trong </w:t>
+        <w:t xml:space="preserve"> để nhận thông báo và được hỗ trợ suốt khóa học (xem mục VIII). Chưa thấy nút này, Thầy/Cô tra tên trường mình trong </w:t>
       </w:r>
       <w:r>
         <w:rPr>
@@ -3027,7 +3009,7 @@
         <w:t xml:space="preserve">“Làm khảo sát đầu vào”</w:t>
       </w:r>
       <w:r>
-        <w:t xml:space="preserve"> (mục VII). Dưới đó có thể còn khung của đợt xác nhận — bảng đầu tiên dưới đây giải thích các khung hay gặp.</w:t>
+        <w:t xml:space="preserve"> (xem mục VII). Dưới đó có thể còn khung của đợt xác nhận — bảng đầu tiên dưới đây giải thích các khung hay gặp.</w:t>
       </w:r>
     </w:p>
     <w:p>
@@ -3135,7 +3117,7 @@
         <w:t xml:space="preserve">Thông tin lớp học</w:t>
       </w:r>
       <w:r>
-        <w:t xml:space="preserve"> để tham gia nhóm Zalo của cụm ngay (mục VIII).</w:t>
+        <w:t xml:space="preserve"> để tham gia nhóm Zalo của cụm ngay (xem mục VIII).</w:t>
       </w:r>
     </w:p>
     <w:tbl>
@@ -4371,7 +4353,7 @@
                 <w:sz w:val="24"/>
                 <w:szCs w:val="24"/>
               </w:rPr>
-              <w:t xml:space="preserve">Xem khung vàng ở mục Việc cần làm, bổ sung hồ sơ (mục VI).</w:t>
+              <w:t xml:space="preserve">Xem khung vàng ở mục Việc cần làm, bổ sung hồ sơ (xem mục VI).</w:t>
             </w:r>
           </w:p>
         </w:tc>
@@ -4472,7 +4454,7 @@
                 <w:sz w:val="24"/>
                 <w:szCs w:val="24"/>
               </w:rPr>
-              <w:t xml:space="preserve">Bấm vào thẻ để sang trang làm khảo sát (mục VII).</w:t>
+              <w:t xml:space="preserve">Bấm vào thẻ để sang trang làm khảo sát (xem mục VII).</w:t>
             </w:r>
           </w:p>
         </w:tc>
@@ -4573,7 +4555,7 @@
                 <w:sz w:val="24"/>
                 <w:szCs w:val="24"/>
               </w:rPr>
-              <w:t xml:space="preserve">Không cần làm gì thêm. Bấm vào thẻ để xem lớp học (mục VIII).</w:t>
+              <w:t xml:space="preserve">Không cần làm gì thêm. Bấm vào thẻ để xem lớp học (xem mục VIII).</w:t>
             </w:r>
           </w:p>
         </w:tc>
@@ -5968,7 +5950,7 @@
         <w:t xml:space="preserve">chỉ mở khi hồ sơ đã đủ thông tin</w:t>
       </w:r>
       <w:r>
-        <w:t xml:space="preserve"> (mục VI). Làm lần lượt 2 phiếu: khảo sát kĩ năng số trước, rồi đánh giá năng lực số.</w:t>
+        <w:t xml:space="preserve"> (xem mục VI). Làm lần lượt 2 phiếu: khảo sát kĩ năng số trước, rồi đánh giá năng lực số.</w:t>
       </w:r>
     </w:p>
     <w:p>
@@ -7133,7 +7115,7 @@
         <w:t xml:space="preserve">Lưu ý – Sau khi làm xong 2 phiếu: </w:t>
       </w:r>
       <w:r>
-        <w:t xml:space="preserve">Khi cả hai phiếu đều hiện nhãn "Đã hoàn thành", Ban tổ chức sẽ tổng hợp kết quả, xếp mức năng lực (Cơ bản, Thành thạo hoặc Nâng cao) và chia lớp theo trình độ. Thầy/Cô theo dõi nhóm Zalo của cụm để nhận thông báo (mục VIII).</w:t>
+        <w:t xml:space="preserve">Khi cả hai phiếu đều hiện nhãn "Đã hoàn thành", Ban tổ chức sẽ tổng hợp kết quả, xếp mức năng lực (Cơ bản, Thành thạo hoặc Nâng cao) và chia lớp theo trình độ. Thầy/Cô theo dõi nhóm Zalo của cụm để nhận thông báo (xem mục VIII).</w:t>
       </w:r>
     </w:p>
     <w:p>
@@ -9490,7 +9472,7 @@
                 <w:sz w:val="24"/>
                 <w:szCs w:val="24"/>
               </w:rPr>
-              <w:t xml:space="preserve">2. Lần đầu: mật khẩu là ngày sinh đủ 8 số, có số 0 ở đầu ngày/tháng (dùng công cụ ở mục III).</w:t>
+              <w:t xml:space="preserve">2. Lần đầu: mật khẩu là ngày sinh đủ 8 số, có số 0 ở đầu ngày/tháng (xem cách viết mật khẩu ở mục III).</w:t>
             </w:r>
           </w:p>
           <w:p>
@@ -13690,7 +13672,7 @@
         <w:t xml:space="preserve">chưa đăng nhập được vì chưa có tên trong danh sách học viên</w:t>
       </w:r>
       <w:r>
-        <w:t xml:space="preserve"> cũng dùng email này — đây là cách duy nhất để liên hệ trong trường hợp đó, vì mục Hỗ trợ trong hệ thống (mục XI) cần đăng nhập mới dùng được.</w:t>
+        <w:t xml:space="preserve"> cũng dùng email này — đây là cách duy nhất để liên hệ trong trường hợp đó, vì mục Hỗ trợ trong hệ thống (xem mục XI) cần đăng nhập mới dùng được.</w:t>
       </w:r>
     </w:p>
     <w:p>
@@ -13977,6 +13959,26 @@
           <w:szCs w:val="28"/>
         </w:rPr>
         <w:t xml:space="preserve">DANH SÁCH NHÓM ZALO HỖ TRỢ THEO CỤM</w:t>
+      </w:r>
+    </w:p>
+    <w:p>
+      <w:pPr>
+        <w:spacing w:after="120" w:before="0" w:line="288"/>
+        <w:ind w:firstLine="567"/>
+        <w:jc w:val="both"/>
+      </w:pPr>
+      <w:r>
+        <w:t xml:space="preserve">Học viên tìm tên đơn vị công tác của mình trong bảng dưới đây để tham gia đúng nhóm Zalo của cụm. Bản trực tuyến (có ô tìm theo tên trường, không cần đăng nhập) đăng tại </w:t>
+      </w:r>
+      <w:r>
+        <w:rPr>
+          <w:b/>
+          <w:bCs/>
+        </w:rPr>
+        <w:t xml:space="preserve">boiduongnls.hcmue.edu.vn/huong-dan</w:t>
+      </w:r>
+      <w:r>
+        <w:t xml:space="preserve">, mục Phụ lục.</w:t>
       </w:r>
     </w:p>
     <w:p>

</xml_diff>

<commit_message>
docs(huong-dan): phan Cach tim va tra cuu tai lieu + bang tom tat muc luc; nut Huong dan su dung o hero trang chu
- M0: nut 'Huong dan su dung' noi bat canh nut chinh o hero, luon hien.
- huongDan.ts: cachTraCuu (5 buoc tim trang huong dan, muc luc, tra loi, lien he),
  tomTat cho tung muc + TOM_TAT_PHU_LUC_ZALO.
- Ban Word: phan 'Cach tim va tra cuu tai lieu huong dan' (khong danh so La Ma de
  giu dan chieu muc III, VI...), 3 anh chup giao dien that, bang muc luc I-XIII + Phu luc.

Co-Authored-By: Claude Opus 5.5 <noreply@anthropic.com>
</commit_message>
<xml_diff>
--- a/docs/huong-dan-hoc-vien.docx
+++ b/docs/huong-dan-hoc-vien.docx
@@ -188,6 +188,22 @@
       </w:pPr>
       <w:r>
         <w:rPr>
+          <w:b/>
+          <w:bCs/>
+          <w:sz w:val="28"/>
+          <w:szCs w:val="28"/>
+        </w:rPr>
+        <w:t xml:space="preserve">Khóa bồi dưỡng tại An Giang</w:t>
+      </w:r>
+    </w:p>
+    <w:p>
+      <w:pPr>
+        <w:spacing w:after="0" w:line="240"/>
+        <w:ind w:firstLine="0"/>
+        <w:jc w:val="center"/>
+      </w:pPr>
+      <w:r>
+        <w:rPr>
           <w:i/>
           <w:iCs/>
           <w:sz w:val="28"/>
@@ -229,7 +245,7 @@
         <w:jc w:val="both"/>
       </w:pPr>
       <w:r>
-        <w:t xml:space="preserve">Hướng dẫn này giúp giáo viên và cán bộ quản lý tham gia khóa bồi dưỡng năng lực số sử dụng hệ thống Bồi dưỡng Năng lực số tại địa chỉ </w:t>
+        <w:t xml:space="preserve">Hướng dẫn này giúp giáo viên và cán bộ quản lý tham gia khóa bồi dưỡng năng lực số (khóa bồi dưỡng tại An Giang) sử dụng hệ thống Bồi dưỡng Năng lực số tại địa chỉ </w:t>
       </w:r>
       <w:r>
         <w:rPr>
@@ -281,6 +297,2013 @@
       <w:r>
         <w:t xml:space="preserve">; học viên đã đăng nhập có thể gửi yêu cầu tại mục “Hỗ trợ” trên hệ thống.</w:t>
       </w:r>
+    </w:p>
+    <w:p>
+      <w:pPr>
+        <w:pStyle w:val="Heading1"/>
+        <w:keepNext/>
+        <w:spacing w:after="120" w:before="240" w:line="288"/>
+        <w:ind w:firstLine="567"/>
+        <w:jc w:val="both"/>
+      </w:pPr>
+      <w:r>
+        <w:rPr>
+          <w:b/>
+          <w:bCs/>
+        </w:rPr>
+        <w:t xml:space="preserve">CÁCH TÌM VÀ TRA CỨU TÀI LIỆU HƯỚNG DẪN</w:t>
+      </w:r>
+    </w:p>
+    <w:p>
+      <w:pPr>
+        <w:spacing w:after="120" w:before="0" w:line="288"/>
+        <w:ind w:firstLine="567"/>
+        <w:jc w:val="both"/>
+      </w:pPr>
+      <w:r>
+        <w:t xml:space="preserve">Học viên lần đầu vào hệ thống nên mở trang hướng dẫn trực tuyến trước, xem mục lục để biết mỗi việc nằm ở mục nào, rồi làm lần lượt theo các mục. Khi gặp lỗi, tra cứu theo các bước dưới đây.</w:t>
+      </w:r>
+    </w:p>
+    <w:p>
+      <w:pPr>
+        <w:spacing w:after="120" w:before="0" w:line="288"/>
+        <w:ind w:firstLine="567"/>
+        <w:jc w:val="both"/>
+      </w:pPr>
+      <w:r>
+        <w:rPr>
+          <w:b/>
+          <w:bCs/>
+        </w:rPr>
+        <w:t xml:space="preserve">Bước 1. </w:t>
+      </w:r>
+      <w:r>
+        <w:t xml:space="preserve">Mở trình duyệt, vào </w:t>
+      </w:r>
+      <w:r>
+        <w:rPr>
+          <w:b/>
+          <w:bCs/>
+        </w:rPr>
+        <w:t xml:space="preserve">boiduongnls.hcmue.edu.vn</w:t>
+      </w:r>
+      <w:r>
+        <w:t xml:space="preserve"> (trang giới thiệu chương trình).</w:t>
+      </w:r>
+    </w:p>
+    <w:p>
+      <w:pPr>
+        <w:spacing w:after="120" w:before="0" w:line="288"/>
+        <w:ind w:firstLine="567"/>
+        <w:jc w:val="both"/>
+      </w:pPr>
+      <w:r>
+        <w:rPr>
+          <w:b/>
+          <w:bCs/>
+        </w:rPr>
+        <w:t xml:space="preserve">Bước 2. </w:t>
+      </w:r>
+      <w:r>
+        <w:t xml:space="preserve">Bấm nút </w:t>
+      </w:r>
+      <w:r>
+        <w:rPr>
+          <w:b/>
+          <w:bCs/>
+        </w:rPr>
+        <w:t xml:space="preserve">“Hướng dẫn sử dụng”</w:t>
+      </w:r>
+      <w:r>
+        <w:t xml:space="preserve"> ngay ở phần đầu trang (cũng có trên thanh menu và ở cuối trang). Ở trang đăng nhập có dòng </w:t>
+      </w:r>
+      <w:r>
+        <w:rPr>
+          <w:b/>
+          <w:bCs/>
+        </w:rPr>
+        <w:t xml:space="preserve">“Lần đầu sử dụng? Xem hướng dẫn từng bước có hình minh họa”</w:t>
+      </w:r>
+      <w:r>
+        <w:t xml:space="preserve">; sau khi đăng nhập có mục </w:t>
+      </w:r>
+      <w:r>
+        <w:rPr>
+          <w:b/>
+          <w:bCs/>
+        </w:rPr>
+        <w:t xml:space="preserve">“Hướng dẫn”</w:t>
+      </w:r>
+      <w:r>
+        <w:t xml:space="preserve"> trên menu. Có thể gõ thẳng boiduongnls.hcmue.edu.vn/huong-dan.</w:t>
+      </w:r>
+    </w:p>
+    <w:p>
+      <w:pPr>
+        <w:spacing w:after="120" w:before="0" w:line="288"/>
+        <w:ind w:firstLine="567"/>
+        <w:jc w:val="both"/>
+      </w:pPr>
+      <w:r>
+        <w:rPr>
+          <w:b/>
+          <w:bCs/>
+        </w:rPr>
+        <w:t xml:space="preserve">Bước 3. </w:t>
+      </w:r>
+      <w:r>
+        <w:t xml:space="preserve">Xem </w:t>
+      </w:r>
+      <w:r>
+        <w:rPr>
+          <w:b/>
+          <w:bCs/>
+        </w:rPr>
+        <w:t xml:space="preserve">Mục lục</w:t>
+      </w:r>
+      <w:r>
+        <w:t xml:space="preserve">: trên máy tính nằm ở cột bên trái; trên điện thoại dùng ô </w:t>
+      </w:r>
+      <w:r>
+        <w:rPr>
+          <w:b/>
+          <w:bCs/>
+        </w:rPr>
+        <w:t xml:space="preserve">“Đi tới phần”</w:t>
+      </w:r>
+      <w:r>
+        <w:t xml:space="preserve"> ở đầu trang. Bấm tên mục để nhảy tới mục đó. Chọn kiểu hình </w:t>
+      </w:r>
+      <w:r>
+        <w:rPr>
+          <w:b/>
+          <w:bCs/>
+        </w:rPr>
+        <w:t xml:space="preserve">“Máy tính”</w:t>
+      </w:r>
+      <w:r>
+        <w:t xml:space="preserve"> hoặc </w:t>
+      </w:r>
+      <w:r>
+        <w:rPr>
+          <w:b/>
+          <w:bCs/>
+        </w:rPr>
+        <w:t xml:space="preserve">“Điện thoại”</w:t>
+      </w:r>
+      <w:r>
+        <w:t xml:space="preserve"> cho đúng thiết bị đang dùng.</w:t>
+      </w:r>
+    </w:p>
+    <w:p>
+      <w:pPr>
+        <w:spacing w:after="120" w:before="0" w:line="288"/>
+        <w:ind w:firstLine="567"/>
+        <w:jc w:val="both"/>
+      </w:pPr>
+      <w:r>
+        <w:rPr>
+          <w:b/>
+          <w:bCs/>
+        </w:rPr>
+        <w:t xml:space="preserve">Bước 4. </w:t>
+      </w:r>
+      <w:r>
+        <w:t xml:space="preserve">Gặp lỗi: vào mục </w:t>
+      </w:r>
+      <w:r>
+        <w:rPr>
+          <w:b/>
+          <w:bCs/>
+        </w:rPr>
+        <w:t xml:space="preserve">Lỗi thường gặp và cách khắc phục</w:t>
+      </w:r>
+      <w:r>
+        <w:t xml:space="preserve">, gõ vài chữ của thông báo trên màn hình vào ô tìm kiếm (gõ không dấu cũng được) hoặc chọn nhóm vấn đề.</w:t>
+      </w:r>
+    </w:p>
+    <w:p>
+      <w:pPr>
+        <w:spacing w:after="120" w:before="0" w:line="288"/>
+        <w:ind w:firstLine="567"/>
+        <w:jc w:val="both"/>
+      </w:pPr>
+      <w:r>
+        <w:rPr>
+          <w:b/>
+          <w:bCs/>
+        </w:rPr>
+        <w:t xml:space="preserve">Bước 5. </w:t>
+      </w:r>
+      <w:r>
+        <w:t xml:space="preserve">Chưa tìm được cách xử lý: xem mục </w:t>
+      </w:r>
+      <w:r>
+        <w:rPr>
+          <w:b/>
+          <w:bCs/>
+        </w:rPr>
+        <w:t xml:space="preserve">Liên hệ hỗ trợ</w:t>
+      </w:r>
+      <w:r>
+        <w:t xml:space="preserve"> để gửi email theo mẫu, hoặc gửi yêu cầu tại mục </w:t>
+      </w:r>
+      <w:r>
+        <w:rPr>
+          <w:b/>
+          <w:bCs/>
+        </w:rPr>
+        <w:t xml:space="preserve">“Hỗ trợ”</w:t>
+      </w:r>
+      <w:r>
+        <w:t xml:space="preserve"> sau khi đăng nhập.</w:t>
+      </w:r>
+    </w:p>
+    <w:p>
+      <w:pPr>
+        <w:keepNext/>
+        <w:spacing w:before="120" w:line="240"/>
+        <w:ind w:firstLine="0"/>
+        <w:jc w:val="center"/>
+      </w:pPr>
+      <w:r>
+        <w:drawing>
+          <wp:inline distT="0" distB="0" distL="0" distR="0">
+            <wp:extent cx="4953000" cy="2514600"/>
+            <wp:effectExtent t="0" r="0" b="0" l="0"/>
+            <wp:docPr id="1" name="" descr="" title=""/>
+            <wp:cNvGraphicFramePr>
+              <a:graphicFrameLocks xmlns:a="http://schemas.openxmlformats.org/drawingml/2006/main" noChangeAspect="1"/>
+            </wp:cNvGraphicFramePr>
+            <a:graphic xmlns:a="http://schemas.openxmlformats.org/drawingml/2006/main">
+              <a:graphicData uri="http://schemas.openxmlformats.org/drawingml/2006/picture">
+                <pic:pic xmlns:pic="http://schemas.openxmlformats.org/drawingml/2006/picture">
+                  <pic:nvPicPr>
+                    <pic:cNvPr id="0" name="" descr=""/>
+                    <pic:cNvPicPr>
+                      <a:picLocks noChangeAspect="1" noChangeArrowheads="1"/>
+                    </pic:cNvPicPr>
+                  </pic:nvPicPr>
+                  <pic:blipFill>
+                    <a:blip r:embed="rId9" cstate="none"/>
+                    <a:srcRect/>
+                    <a:stretch>
+                      <a:fillRect/>
+                    </a:stretch>
+                  </pic:blipFill>
+                  <pic:spPr bwMode="auto">
+                    <a:xfrm>
+                      <a:off x="0" y="0"/>
+                      <a:ext cx="4953000" cy="2514600"/>
+                    </a:xfrm>
+                    <a:prstGeom prst="rect">
+                      <a:avLst/>
+                    </a:prstGeom>
+                  </pic:spPr>
+                </pic:pic>
+              </a:graphicData>
+            </a:graphic>
+          </wp:inline>
+        </w:drawing>
+      </w:r>
+    </w:p>
+    <w:p>
+      <w:pPr>
+        <w:spacing w:after="160" w:before="60" w:line="240"/>
+        <w:ind w:firstLine="0"/>
+        <w:jc w:val="center"/>
+      </w:pPr>
+      <w:r>
+        <w:rPr>
+          <w:i/>
+          <w:iCs/>
+          <w:sz w:val="24"/>
+          <w:szCs w:val="24"/>
+        </w:rPr>
+        <w:t xml:space="preserve">Hình 1. Nút “Hướng dẫn sử dụng” ở đầu trang giới thiệu (giao diện máy tính)</w:t>
+      </w:r>
+    </w:p>
+    <w:p>
+      <w:pPr>
+        <w:keepNext/>
+        <w:spacing w:before="120" w:line="240"/>
+        <w:ind w:firstLine="0"/>
+        <w:jc w:val="center"/>
+      </w:pPr>
+      <w:r>
+        <w:drawing>
+          <wp:inline distT="0" distB="0" distL="0" distR="0">
+            <wp:extent cx="4953000" cy="3486150"/>
+            <wp:effectExtent t="0" r="0" b="0" l="0"/>
+            <wp:docPr id="1" name="" descr="" title=""/>
+            <wp:cNvGraphicFramePr>
+              <a:graphicFrameLocks xmlns:a="http://schemas.openxmlformats.org/drawingml/2006/main" noChangeAspect="1"/>
+            </wp:cNvGraphicFramePr>
+            <a:graphic xmlns:a="http://schemas.openxmlformats.org/drawingml/2006/main">
+              <a:graphicData uri="http://schemas.openxmlformats.org/drawingml/2006/picture">
+                <pic:pic xmlns:pic="http://schemas.openxmlformats.org/drawingml/2006/picture">
+                  <pic:nvPicPr>
+                    <pic:cNvPr id="0" name="" descr=""/>
+                    <pic:cNvPicPr>
+                      <a:picLocks noChangeAspect="1" noChangeArrowheads="1"/>
+                    </pic:cNvPicPr>
+                  </pic:nvPicPr>
+                  <pic:blipFill>
+                    <a:blip r:embed="rId10" cstate="none"/>
+                    <a:srcRect/>
+                    <a:stretch>
+                      <a:fillRect/>
+                    </a:stretch>
+                  </pic:blipFill>
+                  <pic:spPr bwMode="auto">
+                    <a:xfrm>
+                      <a:off x="0" y="0"/>
+                      <a:ext cx="4953000" cy="3486150"/>
+                    </a:xfrm>
+                    <a:prstGeom prst="rect">
+                      <a:avLst/>
+                    </a:prstGeom>
+                  </pic:spPr>
+                </pic:pic>
+              </a:graphicData>
+            </a:graphic>
+          </wp:inline>
+        </w:drawing>
+      </w:r>
+    </w:p>
+    <w:p>
+      <w:pPr>
+        <w:spacing w:after="160" w:before="60" w:line="240"/>
+        <w:ind w:firstLine="0"/>
+        <w:jc w:val="center"/>
+      </w:pPr>
+      <w:r>
+        <w:rPr>
+          <w:i/>
+          <w:iCs/>
+          <w:sz w:val="24"/>
+          <w:szCs w:val="24"/>
+        </w:rPr>
+        <w:t xml:space="preserve">Hình 2. Trang Hướng dẫn sử dụng: mục lục ở cột bên trái (giao diện máy tính)</w:t>
+      </w:r>
+    </w:p>
+    <w:p>
+      <w:pPr>
+        <w:keepNext/>
+        <w:spacing w:before="120" w:line="240"/>
+        <w:ind w:firstLine="0"/>
+        <w:jc w:val="center"/>
+      </w:pPr>
+      <w:r>
+        <w:drawing>
+          <wp:inline distT="0" distB="0" distL="0" distR="0">
+            <wp:extent cx="1905000" cy="2743200"/>
+            <wp:effectExtent t="0" r="0" b="0" l="0"/>
+            <wp:docPr id="1" name="" descr="" title=""/>
+            <wp:cNvGraphicFramePr>
+              <a:graphicFrameLocks xmlns:a="http://schemas.openxmlformats.org/drawingml/2006/main" noChangeAspect="1"/>
+            </wp:cNvGraphicFramePr>
+            <a:graphic xmlns:a="http://schemas.openxmlformats.org/drawingml/2006/main">
+              <a:graphicData uri="http://schemas.openxmlformats.org/drawingml/2006/picture">
+                <pic:pic xmlns:pic="http://schemas.openxmlformats.org/drawingml/2006/picture">
+                  <pic:nvPicPr>
+                    <pic:cNvPr id="0" name="" descr=""/>
+                    <pic:cNvPicPr>
+                      <a:picLocks noChangeAspect="1" noChangeArrowheads="1"/>
+                    </pic:cNvPicPr>
+                  </pic:nvPicPr>
+                  <pic:blipFill>
+                    <a:blip r:embed="rId11" cstate="none"/>
+                    <a:srcRect/>
+                    <a:stretch>
+                      <a:fillRect/>
+                    </a:stretch>
+                  </pic:blipFill>
+                  <pic:spPr bwMode="auto">
+                    <a:xfrm>
+                      <a:off x="0" y="0"/>
+                      <a:ext cx="1905000" cy="2743200"/>
+                    </a:xfrm>
+                    <a:prstGeom prst="rect">
+                      <a:avLst/>
+                    </a:prstGeom>
+                  </pic:spPr>
+                </pic:pic>
+              </a:graphicData>
+            </a:graphic>
+          </wp:inline>
+        </w:drawing>
+      </w:r>
+    </w:p>
+    <w:p>
+      <w:pPr>
+        <w:spacing w:after="160" w:before="60" w:line="240"/>
+        <w:ind w:firstLine="0"/>
+        <w:jc w:val="center"/>
+      </w:pPr>
+      <w:r>
+        <w:rPr>
+          <w:i/>
+          <w:iCs/>
+          <w:sz w:val="24"/>
+          <w:szCs w:val="24"/>
+        </w:rPr>
+        <w:t xml:space="preserve">Hình 3. Trang Hướng dẫn sử dụng trên điện thoại: ô “Đi tới phần” để chọn mục</w:t>
+      </w:r>
+    </w:p>
+    <w:p>
+      <w:pPr>
+        <w:pStyle w:val="Heading2"/>
+        <w:keepNext/>
+        <w:spacing w:after="120" w:before="120" w:line="288"/>
+        <w:ind w:firstLine="567"/>
+        <w:jc w:val="both"/>
+      </w:pPr>
+      <w:r>
+        <w:rPr>
+          <w:b/>
+          <w:bCs/>
+        </w:rPr>
+        <w:t xml:space="preserve">Mục lục tài liệu và nội dung chính của từng mục</w:t>
+      </w:r>
+    </w:p>
+    <w:tbl>
+      <w:tblPr>
+        <w:tblW w:type="dxa" w:w="9355"/>
+        <w:tblBorders>
+          <w:top w:val="single" w:color="auto" w:sz="4"/>
+          <w:left w:val="single" w:color="auto" w:sz="4"/>
+          <w:bottom w:val="single" w:color="auto" w:sz="4"/>
+          <w:right w:val="single" w:color="auto" w:sz="4"/>
+          <w:insideH w:val="single" w:color="auto" w:sz="4"/>
+          <w:insideV w:val="single" w:color="auto" w:sz="4"/>
+        </w:tblBorders>
+        <w:tblLayout w:type="fixed"/>
+      </w:tblPr>
+      <w:tblGrid>
+        <w:gridCol w:w="1100"/>
+        <w:gridCol w:w="3300"/>
+        <w:gridCol w:w="4955"/>
+      </w:tblGrid>
+      <w:tr>
+        <w:trPr>
+          <w:cantSplit/>
+          <w:tblHeader/>
+        </w:trPr>
+        <w:tc>
+          <w:tcPr>
+            <w:tcW w:type="dxa" w:w="1100"/>
+            <w:tcBorders>
+              <w:top w:val="single" w:color="000000" w:sz="4"/>
+              <w:left w:val="single" w:color="000000" w:sz="4"/>
+              <w:bottom w:val="single" w:color="000000" w:sz="4"/>
+              <w:right w:val="single" w:color="000000" w:sz="4"/>
+            </w:tcBorders>
+            <w:shd w:fill="E7E6E6" w:color="auto" w:val="clear"/>
+            <w:tcMar>
+              <w:top w:type="dxa" w:w="40"/>
+              <w:left w:type="dxa" w:w="80"/>
+              <w:bottom w:type="dxa" w:w="40"/>
+              <w:right w:type="dxa" w:w="80"/>
+            </w:tcMar>
+            <w:vAlign w:val="center"/>
+          </w:tcPr>
+          <w:p>
+            <w:pPr>
+              <w:spacing w:after="40" w:line="264"/>
+              <w:ind w:firstLine="0"/>
+              <w:jc w:val="center"/>
+            </w:pPr>
+            <w:r>
+              <w:rPr>
+                <w:b/>
+                <w:bCs/>
+                <w:sz w:val="24"/>
+                <w:szCs w:val="24"/>
+              </w:rPr>
+              <w:t xml:space="preserve">Mục</w:t>
+            </w:r>
+          </w:p>
+        </w:tc>
+        <w:tc>
+          <w:tcPr>
+            <w:tcW w:type="dxa" w:w="3300"/>
+            <w:tcBorders>
+              <w:top w:val="single" w:color="000000" w:sz="4"/>
+              <w:left w:val="single" w:color="000000" w:sz="4"/>
+              <w:bottom w:val="single" w:color="000000" w:sz="4"/>
+              <w:right w:val="single" w:color="000000" w:sz="4"/>
+            </w:tcBorders>
+            <w:shd w:fill="E7E6E6" w:color="auto" w:val="clear"/>
+            <w:tcMar>
+              <w:top w:type="dxa" w:w="40"/>
+              <w:left w:type="dxa" w:w="80"/>
+              <w:bottom w:type="dxa" w:w="40"/>
+              <w:right w:type="dxa" w:w="80"/>
+            </w:tcMar>
+            <w:vAlign w:val="center"/>
+          </w:tcPr>
+          <w:p>
+            <w:pPr>
+              <w:spacing w:after="40" w:line="264"/>
+              <w:ind w:firstLine="0"/>
+              <w:jc w:val="center"/>
+            </w:pPr>
+            <w:r>
+              <w:rPr>
+                <w:b/>
+                <w:bCs/>
+                <w:sz w:val="24"/>
+                <w:szCs w:val="24"/>
+              </w:rPr>
+              <w:t xml:space="preserve">Tên mục</w:t>
+            </w:r>
+          </w:p>
+        </w:tc>
+        <w:tc>
+          <w:tcPr>
+            <w:tcW w:type="dxa" w:w="4955"/>
+            <w:tcBorders>
+              <w:top w:val="single" w:color="000000" w:sz="4"/>
+              <w:left w:val="single" w:color="000000" w:sz="4"/>
+              <w:bottom w:val="single" w:color="000000" w:sz="4"/>
+              <w:right w:val="single" w:color="000000" w:sz="4"/>
+            </w:tcBorders>
+            <w:shd w:fill="E7E6E6" w:color="auto" w:val="clear"/>
+            <w:tcMar>
+              <w:top w:type="dxa" w:w="40"/>
+              <w:left w:type="dxa" w:w="80"/>
+              <w:bottom w:type="dxa" w:w="40"/>
+              <w:right w:type="dxa" w:w="80"/>
+            </w:tcMar>
+            <w:vAlign w:val="center"/>
+          </w:tcPr>
+          <w:p>
+            <w:pPr>
+              <w:spacing w:after="40" w:line="264"/>
+              <w:ind w:firstLine="0"/>
+              <w:jc w:val="center"/>
+            </w:pPr>
+            <w:r>
+              <w:rPr>
+                <w:b/>
+                <w:bCs/>
+                <w:sz w:val="24"/>
+                <w:szCs w:val="24"/>
+              </w:rPr>
+              <w:t xml:space="preserve">Nội dung chính</w:t>
+            </w:r>
+          </w:p>
+        </w:tc>
+      </w:tr>
+      <w:tr>
+        <w:trPr>
+          <w:cantSplit/>
+        </w:trPr>
+        <w:tc>
+          <w:tcPr>
+            <w:tcW w:type="dxa" w:w="1100"/>
+            <w:tcBorders>
+              <w:top w:val="single" w:color="000000" w:sz="4"/>
+              <w:left w:val="single" w:color="000000" w:sz="4"/>
+              <w:bottom w:val="single" w:color="000000" w:sz="4"/>
+              <w:right w:val="single" w:color="000000" w:sz="4"/>
+            </w:tcBorders>
+            <w:tcMar>
+              <w:top w:type="dxa" w:w="40"/>
+              <w:left w:type="dxa" w:w="80"/>
+              <w:bottom w:type="dxa" w:w="40"/>
+              <w:right w:type="dxa" w:w="80"/>
+            </w:tcMar>
+            <w:vAlign w:val="top"/>
+          </w:tcPr>
+          <w:p>
+            <w:pPr>
+              <w:spacing w:after="40" w:line="264"/>
+              <w:ind w:firstLine="0"/>
+              <w:jc w:val="left"/>
+            </w:pPr>
+            <w:r>
+              <w:rPr>
+                <w:sz w:val="24"/>
+                <w:szCs w:val="24"/>
+              </w:rPr>
+              <w:t xml:space="preserve">I</w:t>
+            </w:r>
+          </w:p>
+        </w:tc>
+        <w:tc>
+          <w:tcPr>
+            <w:tcW w:type="dxa" w:w="3300"/>
+            <w:tcBorders>
+              <w:top w:val="single" w:color="000000" w:sz="4"/>
+              <w:left w:val="single" w:color="000000" w:sz="4"/>
+              <w:bottom w:val="single" w:color="000000" w:sz="4"/>
+              <w:right w:val="single" w:color="000000" w:sz="4"/>
+            </w:tcBorders>
+            <w:tcMar>
+              <w:top w:type="dxa" w:w="40"/>
+              <w:left w:type="dxa" w:w="80"/>
+              <w:bottom w:type="dxa" w:w="40"/>
+              <w:right w:type="dxa" w:w="80"/>
+            </w:tcMar>
+            <w:vAlign w:val="top"/>
+          </w:tcPr>
+          <w:p>
+            <w:pPr>
+              <w:spacing w:after="40" w:line="264"/>
+              <w:ind w:firstLine="0"/>
+              <w:jc w:val="left"/>
+            </w:pPr>
+            <w:r>
+              <w:rPr>
+                <w:b/>
+                <w:bCs/>
+                <w:sz w:val="24"/>
+                <w:szCs w:val="24"/>
+              </w:rPr>
+              <w:t xml:space="preserve">Tổng quan các giai đoạn</w:t>
+            </w:r>
+          </w:p>
+        </w:tc>
+        <w:tc>
+          <w:tcPr>
+            <w:tcW w:type="dxa" w:w="4955"/>
+            <w:tcBorders>
+              <w:top w:val="single" w:color="000000" w:sz="4"/>
+              <w:left w:val="single" w:color="000000" w:sz="4"/>
+              <w:bottom w:val="single" w:color="000000" w:sz="4"/>
+              <w:right w:val="single" w:color="000000" w:sz="4"/>
+            </w:tcBorders>
+            <w:tcMar>
+              <w:top w:type="dxa" w:w="40"/>
+              <w:left w:type="dxa" w:w="80"/>
+              <w:bottom w:type="dxa" w:w="40"/>
+              <w:right w:type="dxa" w:w="80"/>
+            </w:tcMar>
+            <w:vAlign w:val="top"/>
+          </w:tcPr>
+          <w:p>
+            <w:pPr>
+              <w:spacing w:after="40" w:line="264"/>
+              <w:ind w:firstLine="0"/>
+              <w:jc w:val="left"/>
+            </w:pPr>
+            <w:r>
+              <w:rPr>
+                <w:sz w:val="24"/>
+                <w:szCs w:val="24"/>
+              </w:rPr>
+              <w:t xml:space="preserve">Xem các giai đoạn của khóa học và việc cần làm ngay bây giờ.</w:t>
+            </w:r>
+          </w:p>
+        </w:tc>
+      </w:tr>
+      <w:tr>
+        <w:trPr>
+          <w:cantSplit/>
+        </w:trPr>
+        <w:tc>
+          <w:tcPr>
+            <w:tcW w:type="dxa" w:w="1100"/>
+            <w:tcBorders>
+              <w:top w:val="single" w:color="000000" w:sz="4"/>
+              <w:left w:val="single" w:color="000000" w:sz="4"/>
+              <w:bottom w:val="single" w:color="000000" w:sz="4"/>
+              <w:right w:val="single" w:color="000000" w:sz="4"/>
+            </w:tcBorders>
+            <w:tcMar>
+              <w:top w:type="dxa" w:w="40"/>
+              <w:left w:type="dxa" w:w="80"/>
+              <w:bottom w:type="dxa" w:w="40"/>
+              <w:right w:type="dxa" w:w="80"/>
+            </w:tcMar>
+            <w:vAlign w:val="top"/>
+          </w:tcPr>
+          <w:p>
+            <w:pPr>
+              <w:spacing w:after="40" w:line="264"/>
+              <w:ind w:firstLine="0"/>
+              <w:jc w:val="left"/>
+            </w:pPr>
+            <w:r>
+              <w:rPr>
+                <w:sz w:val="24"/>
+                <w:szCs w:val="24"/>
+              </w:rPr>
+              <w:t xml:space="preserve">II</w:t>
+            </w:r>
+          </w:p>
+        </w:tc>
+        <w:tc>
+          <w:tcPr>
+            <w:tcW w:type="dxa" w:w="3300"/>
+            <w:tcBorders>
+              <w:top w:val="single" w:color="000000" w:sz="4"/>
+              <w:left w:val="single" w:color="000000" w:sz="4"/>
+              <w:bottom w:val="single" w:color="000000" w:sz="4"/>
+              <w:right w:val="single" w:color="000000" w:sz="4"/>
+            </w:tcBorders>
+            <w:tcMar>
+              <w:top w:type="dxa" w:w="40"/>
+              <w:left w:type="dxa" w:w="80"/>
+              <w:bottom w:type="dxa" w:w="40"/>
+              <w:right w:type="dxa" w:w="80"/>
+            </w:tcMar>
+            <w:vAlign w:val="top"/>
+          </w:tcPr>
+          <w:p>
+            <w:pPr>
+              <w:spacing w:after="40" w:line="264"/>
+              <w:ind w:firstLine="0"/>
+              <w:jc w:val="left"/>
+            </w:pPr>
+            <w:r>
+              <w:rPr>
+                <w:b/>
+                <w:bCs/>
+                <w:sz w:val="24"/>
+                <w:szCs w:val="24"/>
+              </w:rPr>
+              <w:t xml:space="preserve">Chuẩn bị trước khi bắt đầu</w:t>
+            </w:r>
+          </w:p>
+        </w:tc>
+        <w:tc>
+          <w:tcPr>
+            <w:tcW w:type="dxa" w:w="4955"/>
+            <w:tcBorders>
+              <w:top w:val="single" w:color="000000" w:sz="4"/>
+              <w:left w:val="single" w:color="000000" w:sz="4"/>
+              <w:bottom w:val="single" w:color="000000" w:sz="4"/>
+              <w:right w:val="single" w:color="000000" w:sz="4"/>
+            </w:tcBorders>
+            <w:tcMar>
+              <w:top w:type="dxa" w:w="40"/>
+              <w:left w:type="dxa" w:w="80"/>
+              <w:bottom w:type="dxa" w:w="40"/>
+              <w:right w:type="dxa" w:w="80"/>
+            </w:tcMar>
+            <w:vAlign w:val="top"/>
+          </w:tcPr>
+          <w:p>
+            <w:pPr>
+              <w:spacing w:after="40" w:line="264"/>
+              <w:ind w:firstLine="0"/>
+              <w:jc w:val="left"/>
+            </w:pPr>
+            <w:r>
+              <w:rPr>
+                <w:sz w:val="24"/>
+                <w:szCs w:val="24"/>
+              </w:rPr>
+              <w:t xml:space="preserve">Chuẩn bị mã định danh, ngày sinh, CCCD, email và Zalo trước khi bắt đầu.</w:t>
+            </w:r>
+          </w:p>
+        </w:tc>
+      </w:tr>
+      <w:tr>
+        <w:trPr>
+          <w:cantSplit/>
+        </w:trPr>
+        <w:tc>
+          <w:tcPr>
+            <w:tcW w:type="dxa" w:w="1100"/>
+            <w:tcBorders>
+              <w:top w:val="single" w:color="000000" w:sz="4"/>
+              <w:left w:val="single" w:color="000000" w:sz="4"/>
+              <w:bottom w:val="single" w:color="000000" w:sz="4"/>
+              <w:right w:val="single" w:color="000000" w:sz="4"/>
+            </w:tcBorders>
+            <w:tcMar>
+              <w:top w:type="dxa" w:w="40"/>
+              <w:left w:type="dxa" w:w="80"/>
+              <w:bottom w:type="dxa" w:w="40"/>
+              <w:right w:type="dxa" w:w="80"/>
+            </w:tcMar>
+            <w:vAlign w:val="top"/>
+          </w:tcPr>
+          <w:p>
+            <w:pPr>
+              <w:spacing w:after="40" w:line="264"/>
+              <w:ind w:firstLine="0"/>
+              <w:jc w:val="left"/>
+            </w:pPr>
+            <w:r>
+              <w:rPr>
+                <w:sz w:val="24"/>
+                <w:szCs w:val="24"/>
+              </w:rPr>
+              <w:t xml:space="preserve">III</w:t>
+            </w:r>
+          </w:p>
+        </w:tc>
+        <w:tc>
+          <w:tcPr>
+            <w:tcW w:type="dxa" w:w="3300"/>
+            <w:tcBorders>
+              <w:top w:val="single" w:color="000000" w:sz="4"/>
+              <w:left w:val="single" w:color="000000" w:sz="4"/>
+              <w:bottom w:val="single" w:color="000000" w:sz="4"/>
+              <w:right w:val="single" w:color="000000" w:sz="4"/>
+            </w:tcBorders>
+            <w:tcMar>
+              <w:top w:type="dxa" w:w="40"/>
+              <w:left w:type="dxa" w:w="80"/>
+              <w:bottom w:type="dxa" w:w="40"/>
+              <w:right w:type="dxa" w:w="80"/>
+            </w:tcMar>
+            <w:vAlign w:val="top"/>
+          </w:tcPr>
+          <w:p>
+            <w:pPr>
+              <w:spacing w:after="40" w:line="264"/>
+              <w:ind w:firstLine="0"/>
+              <w:jc w:val="left"/>
+            </w:pPr>
+            <w:r>
+              <w:rPr>
+                <w:b/>
+                <w:bCs/>
+                <w:sz w:val="24"/>
+                <w:szCs w:val="24"/>
+              </w:rPr>
+              <w:t xml:space="preserve">Đăng nhập lần đầu</w:t>
+            </w:r>
+          </w:p>
+        </w:tc>
+        <w:tc>
+          <w:tcPr>
+            <w:tcW w:type="dxa" w:w="4955"/>
+            <w:tcBorders>
+              <w:top w:val="single" w:color="000000" w:sz="4"/>
+              <w:left w:val="single" w:color="000000" w:sz="4"/>
+              <w:bottom w:val="single" w:color="000000" w:sz="4"/>
+              <w:right w:val="single" w:color="000000" w:sz="4"/>
+            </w:tcBorders>
+            <w:tcMar>
+              <w:top w:type="dxa" w:w="40"/>
+              <w:left w:type="dxa" w:w="80"/>
+              <w:bottom w:type="dxa" w:w="40"/>
+              <w:right w:type="dxa" w:w="80"/>
+            </w:tcMar>
+            <w:vAlign w:val="top"/>
+          </w:tcPr>
+          <w:p>
+            <w:pPr>
+              <w:spacing w:after="40" w:line="264"/>
+              <w:ind w:firstLine="0"/>
+              <w:jc w:val="left"/>
+            </w:pPr>
+            <w:r>
+              <w:rPr>
+                <w:sz w:val="24"/>
+                <w:szCs w:val="24"/>
+              </w:rPr>
+              <w:t xml:space="preserve">Đăng nhập lần đầu bằng mã định danh và mật khẩu là ngày sinh.</w:t>
+            </w:r>
+          </w:p>
+        </w:tc>
+      </w:tr>
+      <w:tr>
+        <w:trPr>
+          <w:cantSplit/>
+        </w:trPr>
+        <w:tc>
+          <w:tcPr>
+            <w:tcW w:type="dxa" w:w="1100"/>
+            <w:tcBorders>
+              <w:top w:val="single" w:color="000000" w:sz="4"/>
+              <w:left w:val="single" w:color="000000" w:sz="4"/>
+              <w:bottom w:val="single" w:color="000000" w:sz="4"/>
+              <w:right w:val="single" w:color="000000" w:sz="4"/>
+            </w:tcBorders>
+            <w:tcMar>
+              <w:top w:type="dxa" w:w="40"/>
+              <w:left w:type="dxa" w:w="80"/>
+              <w:bottom w:type="dxa" w:w="40"/>
+              <w:right w:type="dxa" w:w="80"/>
+            </w:tcMar>
+            <w:vAlign w:val="top"/>
+          </w:tcPr>
+          <w:p>
+            <w:pPr>
+              <w:spacing w:after="40" w:line="264"/>
+              <w:ind w:firstLine="0"/>
+              <w:jc w:val="left"/>
+            </w:pPr>
+            <w:r>
+              <w:rPr>
+                <w:sz w:val="24"/>
+                <w:szCs w:val="24"/>
+              </w:rPr>
+              <w:t xml:space="preserve">IV</w:t>
+            </w:r>
+          </w:p>
+        </w:tc>
+        <w:tc>
+          <w:tcPr>
+            <w:tcW w:type="dxa" w:w="3300"/>
+            <w:tcBorders>
+              <w:top w:val="single" w:color="000000" w:sz="4"/>
+              <w:left w:val="single" w:color="000000" w:sz="4"/>
+              <w:bottom w:val="single" w:color="000000" w:sz="4"/>
+              <w:right w:val="single" w:color="000000" w:sz="4"/>
+            </w:tcBorders>
+            <w:tcMar>
+              <w:top w:type="dxa" w:w="40"/>
+              <w:left w:type="dxa" w:w="80"/>
+              <w:bottom w:type="dxa" w:w="40"/>
+              <w:right w:type="dxa" w:w="80"/>
+            </w:tcMar>
+            <w:vAlign w:val="top"/>
+          </w:tcPr>
+          <w:p>
+            <w:pPr>
+              <w:spacing w:after="40" w:line="264"/>
+              <w:ind w:firstLine="0"/>
+              <w:jc w:val="left"/>
+            </w:pPr>
+            <w:r>
+              <w:rPr>
+                <w:b/>
+                <w:bCs/>
+                <w:sz w:val="24"/>
+                <w:szCs w:val="24"/>
+              </w:rPr>
+              <w:t xml:space="preserve">Đổi mật khẩu lần đầu</w:t>
+            </w:r>
+          </w:p>
+        </w:tc>
+        <w:tc>
+          <w:tcPr>
+            <w:tcW w:type="dxa" w:w="4955"/>
+            <w:tcBorders>
+              <w:top w:val="single" w:color="000000" w:sz="4"/>
+              <w:left w:val="single" w:color="000000" w:sz="4"/>
+              <w:bottom w:val="single" w:color="000000" w:sz="4"/>
+              <w:right w:val="single" w:color="000000" w:sz="4"/>
+            </w:tcBorders>
+            <w:tcMar>
+              <w:top w:type="dxa" w:w="40"/>
+              <w:left w:type="dxa" w:w="80"/>
+              <w:bottom w:type="dxa" w:w="40"/>
+              <w:right w:type="dxa" w:w="80"/>
+            </w:tcMar>
+            <w:vAlign w:val="top"/>
+          </w:tcPr>
+          <w:p>
+            <w:pPr>
+              <w:spacing w:after="40" w:line="264"/>
+              <w:ind w:firstLine="0"/>
+              <w:jc w:val="left"/>
+            </w:pPr>
+            <w:r>
+              <w:rPr>
+                <w:sz w:val="24"/>
+                <w:szCs w:val="24"/>
+              </w:rPr>
+              <w:t xml:space="preserve">Đổi mật khẩu mới theo yêu cầu bắt buộc ngay sau lần đăng nhập đầu tiên.</w:t>
+            </w:r>
+          </w:p>
+        </w:tc>
+      </w:tr>
+      <w:tr>
+        <w:trPr>
+          <w:cantSplit/>
+        </w:trPr>
+        <w:tc>
+          <w:tcPr>
+            <w:tcW w:type="dxa" w:w="1100"/>
+            <w:tcBorders>
+              <w:top w:val="single" w:color="000000" w:sz="4"/>
+              <w:left w:val="single" w:color="000000" w:sz="4"/>
+              <w:bottom w:val="single" w:color="000000" w:sz="4"/>
+              <w:right w:val="single" w:color="000000" w:sz="4"/>
+            </w:tcBorders>
+            <w:tcMar>
+              <w:top w:type="dxa" w:w="40"/>
+              <w:left w:type="dxa" w:w="80"/>
+              <w:bottom w:type="dxa" w:w="40"/>
+              <w:right w:type="dxa" w:w="80"/>
+            </w:tcMar>
+            <w:vAlign w:val="top"/>
+          </w:tcPr>
+          <w:p>
+            <w:pPr>
+              <w:spacing w:after="40" w:line="264"/>
+              <w:ind w:firstLine="0"/>
+              <w:jc w:val="left"/>
+            </w:pPr>
+            <w:r>
+              <w:rPr>
+                <w:sz w:val="24"/>
+                <w:szCs w:val="24"/>
+              </w:rPr>
+              <w:t xml:space="preserve">V</w:t>
+            </w:r>
+          </w:p>
+        </w:tc>
+        <w:tc>
+          <w:tcPr>
+            <w:tcW w:type="dxa" w:w="3300"/>
+            <w:tcBorders>
+              <w:top w:val="single" w:color="000000" w:sz="4"/>
+              <w:left w:val="single" w:color="000000" w:sz="4"/>
+              <w:bottom w:val="single" w:color="000000" w:sz="4"/>
+              <w:right w:val="single" w:color="000000" w:sz="4"/>
+            </w:tcBorders>
+            <w:tcMar>
+              <w:top w:type="dxa" w:w="40"/>
+              <w:left w:type="dxa" w:w="80"/>
+              <w:bottom w:type="dxa" w:w="40"/>
+              <w:right w:type="dxa" w:w="80"/>
+            </w:tcMar>
+            <w:vAlign w:val="top"/>
+          </w:tcPr>
+          <w:p>
+            <w:pPr>
+              <w:spacing w:after="40" w:line="264"/>
+              <w:ind w:firstLine="0"/>
+              <w:jc w:val="left"/>
+            </w:pPr>
+            <w:r>
+              <w:rPr>
+                <w:b/>
+                <w:bCs/>
+                <w:sz w:val="24"/>
+                <w:szCs w:val="24"/>
+              </w:rPr>
+              <w:t xml:space="preserve">Trang chủ của tôi</w:t>
+            </w:r>
+          </w:p>
+        </w:tc>
+        <w:tc>
+          <w:tcPr>
+            <w:tcW w:type="dxa" w:w="4955"/>
+            <w:tcBorders>
+              <w:top w:val="single" w:color="000000" w:sz="4"/>
+              <w:left w:val="single" w:color="000000" w:sz="4"/>
+              <w:bottom w:val="single" w:color="000000" w:sz="4"/>
+              <w:right w:val="single" w:color="000000" w:sz="4"/>
+            </w:tcBorders>
+            <w:tcMar>
+              <w:top w:type="dxa" w:w="40"/>
+              <w:left w:type="dxa" w:w="80"/>
+              <w:bottom w:type="dxa" w:w="40"/>
+              <w:right w:type="dxa" w:w="80"/>
+            </w:tcMar>
+            <w:vAlign w:val="top"/>
+          </w:tcPr>
+          <w:p>
+            <w:pPr>
+              <w:spacing w:after="40" w:line="264"/>
+              <w:ind w:firstLine="0"/>
+              <w:jc w:val="left"/>
+            </w:pPr>
+            <w:r>
+              <w:rPr>
+                <w:sz w:val="24"/>
+                <w:szCs w:val="24"/>
+              </w:rPr>
+              <w:t xml:space="preserve">Xem việc cần làm tiếp theo và lối tắt tới Hồ sơ, Lớp học trên Trang chủ.</w:t>
+            </w:r>
+          </w:p>
+        </w:tc>
+      </w:tr>
+      <w:tr>
+        <w:trPr>
+          <w:cantSplit/>
+        </w:trPr>
+        <w:tc>
+          <w:tcPr>
+            <w:tcW w:type="dxa" w:w="1100"/>
+            <w:tcBorders>
+              <w:top w:val="single" w:color="000000" w:sz="4"/>
+              <w:left w:val="single" w:color="000000" w:sz="4"/>
+              <w:bottom w:val="single" w:color="000000" w:sz="4"/>
+              <w:right w:val="single" w:color="000000" w:sz="4"/>
+            </w:tcBorders>
+            <w:tcMar>
+              <w:top w:type="dxa" w:w="40"/>
+              <w:left w:type="dxa" w:w="80"/>
+              <w:bottom w:type="dxa" w:w="40"/>
+              <w:right w:type="dxa" w:w="80"/>
+            </w:tcMar>
+            <w:vAlign w:val="top"/>
+          </w:tcPr>
+          <w:p>
+            <w:pPr>
+              <w:spacing w:after="40" w:line="264"/>
+              <w:ind w:firstLine="0"/>
+              <w:jc w:val="left"/>
+            </w:pPr>
+            <w:r>
+              <w:rPr>
+                <w:sz w:val="24"/>
+                <w:szCs w:val="24"/>
+              </w:rPr>
+              <w:t xml:space="preserve">VI</w:t>
+            </w:r>
+          </w:p>
+        </w:tc>
+        <w:tc>
+          <w:tcPr>
+            <w:tcW w:type="dxa" w:w="3300"/>
+            <w:tcBorders>
+              <w:top w:val="single" w:color="000000" w:sz="4"/>
+              <w:left w:val="single" w:color="000000" w:sz="4"/>
+              <w:bottom w:val="single" w:color="000000" w:sz="4"/>
+              <w:right w:val="single" w:color="000000" w:sz="4"/>
+            </w:tcBorders>
+            <w:tcMar>
+              <w:top w:type="dxa" w:w="40"/>
+              <w:left w:type="dxa" w:w="80"/>
+              <w:bottom w:type="dxa" w:w="40"/>
+              <w:right w:type="dxa" w:w="80"/>
+            </w:tcMar>
+            <w:vAlign w:val="top"/>
+          </w:tcPr>
+          <w:p>
+            <w:pPr>
+              <w:spacing w:after="40" w:line="264"/>
+              <w:ind w:firstLine="0"/>
+              <w:jc w:val="left"/>
+            </w:pPr>
+            <w:r>
+              <w:rPr>
+                <w:b/>
+                <w:bCs/>
+                <w:sz w:val="24"/>
+                <w:szCs w:val="24"/>
+              </w:rPr>
+              <w:t xml:space="preserve">Bổ sung hồ sơ</w:t>
+            </w:r>
+          </w:p>
+        </w:tc>
+        <w:tc>
+          <w:tcPr>
+            <w:tcW w:type="dxa" w:w="4955"/>
+            <w:tcBorders>
+              <w:top w:val="single" w:color="000000" w:sz="4"/>
+              <w:left w:val="single" w:color="000000" w:sz="4"/>
+              <w:bottom w:val="single" w:color="000000" w:sz="4"/>
+              <w:right w:val="single" w:color="000000" w:sz="4"/>
+            </w:tcBorders>
+            <w:tcMar>
+              <w:top w:type="dxa" w:w="40"/>
+              <w:left w:type="dxa" w:w="80"/>
+              <w:bottom w:type="dxa" w:w="40"/>
+              <w:right w:type="dxa" w:w="80"/>
+            </w:tcMar>
+            <w:vAlign w:val="top"/>
+          </w:tcPr>
+          <w:p>
+            <w:pPr>
+              <w:spacing w:after="40" w:line="264"/>
+              <w:ind w:firstLine="0"/>
+              <w:jc w:val="left"/>
+            </w:pPr>
+            <w:r>
+              <w:rPr>
+                <w:sz w:val="24"/>
+                <w:szCs w:val="24"/>
+              </w:rPr>
+              <w:t xml:space="preserve">Bổ sung và kiểm tra thông tin hồ sơ, bắt buộc trước khi làm khảo sát.</w:t>
+            </w:r>
+          </w:p>
+        </w:tc>
+      </w:tr>
+      <w:tr>
+        <w:trPr>
+          <w:cantSplit/>
+        </w:trPr>
+        <w:tc>
+          <w:tcPr>
+            <w:tcW w:type="dxa" w:w="1100"/>
+            <w:tcBorders>
+              <w:top w:val="single" w:color="000000" w:sz="4"/>
+              <w:left w:val="single" w:color="000000" w:sz="4"/>
+              <w:bottom w:val="single" w:color="000000" w:sz="4"/>
+              <w:right w:val="single" w:color="000000" w:sz="4"/>
+            </w:tcBorders>
+            <w:tcMar>
+              <w:top w:type="dxa" w:w="40"/>
+              <w:left w:type="dxa" w:w="80"/>
+              <w:bottom w:type="dxa" w:w="40"/>
+              <w:right w:type="dxa" w:w="80"/>
+            </w:tcMar>
+            <w:vAlign w:val="top"/>
+          </w:tcPr>
+          <w:p>
+            <w:pPr>
+              <w:spacing w:after="40" w:line="264"/>
+              <w:ind w:firstLine="0"/>
+              <w:jc w:val="left"/>
+            </w:pPr>
+            <w:r>
+              <w:rPr>
+                <w:sz w:val="24"/>
+                <w:szCs w:val="24"/>
+              </w:rPr>
+              <w:t xml:space="preserve">VII</w:t>
+            </w:r>
+          </w:p>
+        </w:tc>
+        <w:tc>
+          <w:tcPr>
+            <w:tcW w:type="dxa" w:w="3300"/>
+            <w:tcBorders>
+              <w:top w:val="single" w:color="000000" w:sz="4"/>
+              <w:left w:val="single" w:color="000000" w:sz="4"/>
+              <w:bottom w:val="single" w:color="000000" w:sz="4"/>
+              <w:right w:val="single" w:color="000000" w:sz="4"/>
+            </w:tcBorders>
+            <w:tcMar>
+              <w:top w:type="dxa" w:w="40"/>
+              <w:left w:type="dxa" w:w="80"/>
+              <w:bottom w:type="dxa" w:w="40"/>
+              <w:right w:type="dxa" w:w="80"/>
+            </w:tcMar>
+            <w:vAlign w:val="top"/>
+          </w:tcPr>
+          <w:p>
+            <w:pPr>
+              <w:spacing w:after="40" w:line="264"/>
+              <w:ind w:firstLine="0"/>
+              <w:jc w:val="left"/>
+            </w:pPr>
+            <w:r>
+              <w:rPr>
+                <w:b/>
+                <w:bCs/>
+                <w:sz w:val="24"/>
+                <w:szCs w:val="24"/>
+              </w:rPr>
+              <w:t xml:space="preserve">Làm khảo sát đầu vào</w:t>
+            </w:r>
+          </w:p>
+        </w:tc>
+        <w:tc>
+          <w:tcPr>
+            <w:tcW w:type="dxa" w:w="4955"/>
+            <w:tcBorders>
+              <w:top w:val="single" w:color="000000" w:sz="4"/>
+              <w:left w:val="single" w:color="000000" w:sz="4"/>
+              <w:bottom w:val="single" w:color="000000" w:sz="4"/>
+              <w:right w:val="single" w:color="000000" w:sz="4"/>
+            </w:tcBorders>
+            <w:tcMar>
+              <w:top w:type="dxa" w:w="40"/>
+              <w:left w:type="dxa" w:w="80"/>
+              <w:bottom w:type="dxa" w:w="40"/>
+              <w:right w:type="dxa" w:w="80"/>
+            </w:tcMar>
+            <w:vAlign w:val="top"/>
+          </w:tcPr>
+          <w:p>
+            <w:pPr>
+              <w:spacing w:after="40" w:line="264"/>
+              <w:ind w:firstLine="0"/>
+              <w:jc w:val="left"/>
+            </w:pPr>
+            <w:r>
+              <w:rPr>
+                <w:sz w:val="24"/>
+                <w:szCs w:val="24"/>
+              </w:rPr>
+              <w:t xml:space="preserve">Làm lần lượt 2 phiếu khảo sát đầu vào khi hồ sơ đã đầy đủ.</w:t>
+            </w:r>
+          </w:p>
+        </w:tc>
+      </w:tr>
+      <w:tr>
+        <w:trPr>
+          <w:cantSplit/>
+        </w:trPr>
+        <w:tc>
+          <w:tcPr>
+            <w:tcW w:type="dxa" w:w="1100"/>
+            <w:tcBorders>
+              <w:top w:val="single" w:color="000000" w:sz="4"/>
+              <w:left w:val="single" w:color="000000" w:sz="4"/>
+              <w:bottom w:val="single" w:color="000000" w:sz="4"/>
+              <w:right w:val="single" w:color="000000" w:sz="4"/>
+            </w:tcBorders>
+            <w:tcMar>
+              <w:top w:type="dxa" w:w="40"/>
+              <w:left w:type="dxa" w:w="80"/>
+              <w:bottom w:type="dxa" w:w="40"/>
+              <w:right w:type="dxa" w:w="80"/>
+            </w:tcMar>
+            <w:vAlign w:val="top"/>
+          </w:tcPr>
+          <w:p>
+            <w:pPr>
+              <w:spacing w:after="40" w:line="264"/>
+              <w:ind w:firstLine="0"/>
+              <w:jc w:val="left"/>
+            </w:pPr>
+            <w:r>
+              <w:rPr>
+                <w:sz w:val="24"/>
+                <w:szCs w:val="24"/>
+              </w:rPr>
+              <w:t xml:space="preserve">VIII</w:t>
+            </w:r>
+          </w:p>
+        </w:tc>
+        <w:tc>
+          <w:tcPr>
+            <w:tcW w:type="dxa" w:w="3300"/>
+            <w:tcBorders>
+              <w:top w:val="single" w:color="000000" w:sz="4"/>
+              <w:left w:val="single" w:color="000000" w:sz="4"/>
+              <w:bottom w:val="single" w:color="000000" w:sz="4"/>
+              <w:right w:val="single" w:color="000000" w:sz="4"/>
+            </w:tcBorders>
+            <w:tcMar>
+              <w:top w:type="dxa" w:w="40"/>
+              <w:left w:type="dxa" w:w="80"/>
+              <w:bottom w:type="dxa" w:w="40"/>
+              <w:right w:type="dxa" w:w="80"/>
+            </w:tcMar>
+            <w:vAlign w:val="top"/>
+          </w:tcPr>
+          <w:p>
+            <w:pPr>
+              <w:spacing w:after="40" w:line="264"/>
+              <w:ind w:firstLine="0"/>
+              <w:jc w:val="left"/>
+            </w:pPr>
+            <w:r>
+              <w:rPr>
+                <w:b/>
+                <w:bCs/>
+                <w:sz w:val="24"/>
+                <w:szCs w:val="24"/>
+              </w:rPr>
+              <w:t xml:space="preserve">Nhóm Zalo hỗ trợ và thông tin lớp học</w:t>
+            </w:r>
+          </w:p>
+        </w:tc>
+        <w:tc>
+          <w:tcPr>
+            <w:tcW w:type="dxa" w:w="4955"/>
+            <w:tcBorders>
+              <w:top w:val="single" w:color="000000" w:sz="4"/>
+              <w:left w:val="single" w:color="000000" w:sz="4"/>
+              <w:bottom w:val="single" w:color="000000" w:sz="4"/>
+              <w:right w:val="single" w:color="000000" w:sz="4"/>
+            </w:tcBorders>
+            <w:tcMar>
+              <w:top w:type="dxa" w:w="40"/>
+              <w:left w:type="dxa" w:w="80"/>
+              <w:bottom w:type="dxa" w:w="40"/>
+              <w:right w:type="dxa" w:w="80"/>
+            </w:tcMar>
+            <w:vAlign w:val="top"/>
+          </w:tcPr>
+          <w:p>
+            <w:pPr>
+              <w:spacing w:after="40" w:line="264"/>
+              <w:ind w:firstLine="0"/>
+              <w:jc w:val="left"/>
+            </w:pPr>
+            <w:r>
+              <w:rPr>
+                <w:sz w:val="24"/>
+                <w:szCs w:val="24"/>
+              </w:rPr>
+              <w:t xml:space="preserve">Vào nhóm Zalo hỗ trợ của cụm và xem thông tin, lịch học của lớp.</w:t>
+            </w:r>
+          </w:p>
+        </w:tc>
+      </w:tr>
+      <w:tr>
+        <w:trPr>
+          <w:cantSplit/>
+        </w:trPr>
+        <w:tc>
+          <w:tcPr>
+            <w:tcW w:type="dxa" w:w="1100"/>
+            <w:tcBorders>
+              <w:top w:val="single" w:color="000000" w:sz="4"/>
+              <w:left w:val="single" w:color="000000" w:sz="4"/>
+              <w:bottom w:val="single" w:color="000000" w:sz="4"/>
+              <w:right w:val="single" w:color="000000" w:sz="4"/>
+            </w:tcBorders>
+            <w:tcMar>
+              <w:top w:type="dxa" w:w="40"/>
+              <w:left w:type="dxa" w:w="80"/>
+              <w:bottom w:type="dxa" w:w="40"/>
+              <w:right w:type="dxa" w:w="80"/>
+            </w:tcMar>
+            <w:vAlign w:val="top"/>
+          </w:tcPr>
+          <w:p>
+            <w:pPr>
+              <w:spacing w:after="40" w:line="264"/>
+              <w:ind w:firstLine="0"/>
+              <w:jc w:val="left"/>
+            </w:pPr>
+            <w:r>
+              <w:rPr>
+                <w:sz w:val="24"/>
+                <w:szCs w:val="24"/>
+              </w:rPr>
+              <w:t xml:space="preserve">IX</w:t>
+            </w:r>
+          </w:p>
+        </w:tc>
+        <w:tc>
+          <w:tcPr>
+            <w:tcW w:type="dxa" w:w="3300"/>
+            <w:tcBorders>
+              <w:top w:val="single" w:color="000000" w:sz="4"/>
+              <w:left w:val="single" w:color="000000" w:sz="4"/>
+              <w:bottom w:val="single" w:color="000000" w:sz="4"/>
+              <w:right w:val="single" w:color="000000" w:sz="4"/>
+            </w:tcBorders>
+            <w:tcMar>
+              <w:top w:type="dxa" w:w="40"/>
+              <w:left w:type="dxa" w:w="80"/>
+              <w:bottom w:type="dxa" w:w="40"/>
+              <w:right w:type="dxa" w:w="80"/>
+            </w:tcMar>
+            <w:vAlign w:val="top"/>
+          </w:tcPr>
+          <w:p>
+            <w:pPr>
+              <w:spacing w:after="40" w:line="264"/>
+              <w:ind w:firstLine="0"/>
+              <w:jc w:val="left"/>
+            </w:pPr>
+            <w:r>
+              <w:rPr>
+                <w:b/>
+                <w:bCs/>
+                <w:sz w:val="24"/>
+                <w:szCs w:val="24"/>
+              </w:rPr>
+              <w:t xml:space="preserve">Xác nhận thông tin cuối khóa</w:t>
+            </w:r>
+          </w:p>
+        </w:tc>
+        <w:tc>
+          <w:tcPr>
+            <w:tcW w:type="dxa" w:w="4955"/>
+            <w:tcBorders>
+              <w:top w:val="single" w:color="000000" w:sz="4"/>
+              <w:left w:val="single" w:color="000000" w:sz="4"/>
+              <w:bottom w:val="single" w:color="000000" w:sz="4"/>
+              <w:right w:val="single" w:color="000000" w:sz="4"/>
+            </w:tcBorders>
+            <w:tcMar>
+              <w:top w:type="dxa" w:w="40"/>
+              <w:left w:type="dxa" w:w="80"/>
+              <w:bottom w:type="dxa" w:w="40"/>
+              <w:right w:type="dxa" w:w="80"/>
+            </w:tcMar>
+            <w:vAlign w:val="top"/>
+          </w:tcPr>
+          <w:p>
+            <w:pPr>
+              <w:spacing w:after="40" w:line="264"/>
+              <w:ind w:firstLine="0"/>
+              <w:jc w:val="left"/>
+            </w:pPr>
+            <w:r>
+              <w:rPr>
+                <w:sz w:val="24"/>
+                <w:szCs w:val="24"/>
+              </w:rPr>
+              <w:t xml:space="preserve">Kiểm tra và xác nhận thông tin cuối khóa trước khi được cấp chứng nhận.</w:t>
+            </w:r>
+          </w:p>
+        </w:tc>
+      </w:tr>
+      <w:tr>
+        <w:trPr>
+          <w:cantSplit/>
+        </w:trPr>
+        <w:tc>
+          <w:tcPr>
+            <w:tcW w:type="dxa" w:w="1100"/>
+            <w:tcBorders>
+              <w:top w:val="single" w:color="000000" w:sz="4"/>
+              <w:left w:val="single" w:color="000000" w:sz="4"/>
+              <w:bottom w:val="single" w:color="000000" w:sz="4"/>
+              <w:right w:val="single" w:color="000000" w:sz="4"/>
+            </w:tcBorders>
+            <w:tcMar>
+              <w:top w:type="dxa" w:w="40"/>
+              <w:left w:type="dxa" w:w="80"/>
+              <w:bottom w:type="dxa" w:w="40"/>
+              <w:right w:type="dxa" w:w="80"/>
+            </w:tcMar>
+            <w:vAlign w:val="top"/>
+          </w:tcPr>
+          <w:p>
+            <w:pPr>
+              <w:spacing w:after="40" w:line="264"/>
+              <w:ind w:firstLine="0"/>
+              <w:jc w:val="left"/>
+            </w:pPr>
+            <w:r>
+              <w:rPr>
+                <w:sz w:val="24"/>
+                <w:szCs w:val="24"/>
+              </w:rPr>
+              <w:t xml:space="preserve">X</w:t>
+            </w:r>
+          </w:p>
+        </w:tc>
+        <w:tc>
+          <w:tcPr>
+            <w:tcW w:type="dxa" w:w="3300"/>
+            <w:tcBorders>
+              <w:top w:val="single" w:color="000000" w:sz="4"/>
+              <w:left w:val="single" w:color="000000" w:sz="4"/>
+              <w:bottom w:val="single" w:color="000000" w:sz="4"/>
+              <w:right w:val="single" w:color="000000" w:sz="4"/>
+            </w:tcBorders>
+            <w:tcMar>
+              <w:top w:type="dxa" w:w="40"/>
+              <w:left w:type="dxa" w:w="80"/>
+              <w:bottom w:type="dxa" w:w="40"/>
+              <w:right w:type="dxa" w:w="80"/>
+            </w:tcMar>
+            <w:vAlign w:val="top"/>
+          </w:tcPr>
+          <w:p>
+            <w:pPr>
+              <w:spacing w:after="40" w:line="264"/>
+              <w:ind w:firstLine="0"/>
+              <w:jc w:val="left"/>
+            </w:pPr>
+            <w:r>
+              <w:rPr>
+                <w:b/>
+                <w:bCs/>
+                <w:sz w:val="24"/>
+                <w:szCs w:val="24"/>
+              </w:rPr>
+              <w:t xml:space="preserve">Quên mật khẩu</w:t>
+            </w:r>
+          </w:p>
+        </w:tc>
+        <w:tc>
+          <w:tcPr>
+            <w:tcW w:type="dxa" w:w="4955"/>
+            <w:tcBorders>
+              <w:top w:val="single" w:color="000000" w:sz="4"/>
+              <w:left w:val="single" w:color="000000" w:sz="4"/>
+              <w:bottom w:val="single" w:color="000000" w:sz="4"/>
+              <w:right w:val="single" w:color="000000" w:sz="4"/>
+            </w:tcBorders>
+            <w:tcMar>
+              <w:top w:type="dxa" w:w="40"/>
+              <w:left w:type="dxa" w:w="80"/>
+              <w:bottom w:type="dxa" w:w="40"/>
+              <w:right w:type="dxa" w:w="80"/>
+            </w:tcMar>
+            <w:vAlign w:val="top"/>
+          </w:tcPr>
+          <w:p>
+            <w:pPr>
+              <w:spacing w:after="40" w:line="264"/>
+              <w:ind w:firstLine="0"/>
+              <w:jc w:val="left"/>
+            </w:pPr>
+            <w:r>
+              <w:rPr>
+                <w:sz w:val="24"/>
+                <w:szCs w:val="24"/>
+              </w:rPr>
+              <w:t xml:space="preserve">Lấy lại mật khẩu khi quên, theo email đã xác minh hay chưa.</w:t>
+            </w:r>
+          </w:p>
+        </w:tc>
+      </w:tr>
+      <w:tr>
+        <w:trPr>
+          <w:cantSplit/>
+        </w:trPr>
+        <w:tc>
+          <w:tcPr>
+            <w:tcW w:type="dxa" w:w="1100"/>
+            <w:tcBorders>
+              <w:top w:val="single" w:color="000000" w:sz="4"/>
+              <w:left w:val="single" w:color="000000" w:sz="4"/>
+              <w:bottom w:val="single" w:color="000000" w:sz="4"/>
+              <w:right w:val="single" w:color="000000" w:sz="4"/>
+            </w:tcBorders>
+            <w:tcMar>
+              <w:top w:type="dxa" w:w="40"/>
+              <w:left w:type="dxa" w:w="80"/>
+              <w:bottom w:type="dxa" w:w="40"/>
+              <w:right w:type="dxa" w:w="80"/>
+            </w:tcMar>
+            <w:vAlign w:val="top"/>
+          </w:tcPr>
+          <w:p>
+            <w:pPr>
+              <w:spacing w:after="40" w:line="264"/>
+              <w:ind w:firstLine="0"/>
+              <w:jc w:val="left"/>
+            </w:pPr>
+            <w:r>
+              <w:rPr>
+                <w:sz w:val="24"/>
+                <w:szCs w:val="24"/>
+              </w:rPr>
+              <w:t xml:space="preserve">XI</w:t>
+            </w:r>
+          </w:p>
+        </w:tc>
+        <w:tc>
+          <w:tcPr>
+            <w:tcW w:type="dxa" w:w="3300"/>
+            <w:tcBorders>
+              <w:top w:val="single" w:color="000000" w:sz="4"/>
+              <w:left w:val="single" w:color="000000" w:sz="4"/>
+              <w:bottom w:val="single" w:color="000000" w:sz="4"/>
+              <w:right w:val="single" w:color="000000" w:sz="4"/>
+            </w:tcBorders>
+            <w:tcMar>
+              <w:top w:type="dxa" w:w="40"/>
+              <w:left w:type="dxa" w:w="80"/>
+              <w:bottom w:type="dxa" w:w="40"/>
+              <w:right w:type="dxa" w:w="80"/>
+            </w:tcMar>
+            <w:vAlign w:val="top"/>
+          </w:tcPr>
+          <w:p>
+            <w:pPr>
+              <w:spacing w:after="40" w:line="264"/>
+              <w:ind w:firstLine="0"/>
+              <w:jc w:val="left"/>
+            </w:pPr>
+            <w:r>
+              <w:rPr>
+                <w:b/>
+                <w:bCs/>
+                <w:sz w:val="24"/>
+                <w:szCs w:val="24"/>
+              </w:rPr>
+              <w:t xml:space="preserve">Gửi yêu cầu hỗ trợ trên hệ thống</w:t>
+            </w:r>
+          </w:p>
+        </w:tc>
+        <w:tc>
+          <w:tcPr>
+            <w:tcW w:type="dxa" w:w="4955"/>
+            <w:tcBorders>
+              <w:top w:val="single" w:color="000000" w:sz="4"/>
+              <w:left w:val="single" w:color="000000" w:sz="4"/>
+              <w:bottom w:val="single" w:color="000000" w:sz="4"/>
+              <w:right w:val="single" w:color="000000" w:sz="4"/>
+            </w:tcBorders>
+            <w:tcMar>
+              <w:top w:type="dxa" w:w="40"/>
+              <w:left w:type="dxa" w:w="80"/>
+              <w:bottom w:type="dxa" w:w="40"/>
+              <w:right w:type="dxa" w:w="80"/>
+            </w:tcMar>
+            <w:vAlign w:val="top"/>
+          </w:tcPr>
+          <w:p>
+            <w:pPr>
+              <w:spacing w:after="40" w:line="264"/>
+              <w:ind w:firstLine="0"/>
+              <w:jc w:val="left"/>
+            </w:pPr>
+            <w:r>
+              <w:rPr>
+                <w:sz w:val="24"/>
+                <w:szCs w:val="24"/>
+              </w:rPr>
+              <w:t xml:space="preserve">Gửi yêu cầu hỗ trợ ngay trên hệ thống khi đã đăng nhập được.</w:t>
+            </w:r>
+          </w:p>
+        </w:tc>
+      </w:tr>
+      <w:tr>
+        <w:trPr>
+          <w:cantSplit/>
+        </w:trPr>
+        <w:tc>
+          <w:tcPr>
+            <w:tcW w:type="dxa" w:w="1100"/>
+            <w:tcBorders>
+              <w:top w:val="single" w:color="000000" w:sz="4"/>
+              <w:left w:val="single" w:color="000000" w:sz="4"/>
+              <w:bottom w:val="single" w:color="000000" w:sz="4"/>
+              <w:right w:val="single" w:color="000000" w:sz="4"/>
+            </w:tcBorders>
+            <w:tcMar>
+              <w:top w:type="dxa" w:w="40"/>
+              <w:left w:type="dxa" w:w="80"/>
+              <w:bottom w:type="dxa" w:w="40"/>
+              <w:right w:type="dxa" w:w="80"/>
+            </w:tcMar>
+            <w:vAlign w:val="top"/>
+          </w:tcPr>
+          <w:p>
+            <w:pPr>
+              <w:spacing w:after="40" w:line="264"/>
+              <w:ind w:firstLine="0"/>
+              <w:jc w:val="left"/>
+            </w:pPr>
+            <w:r>
+              <w:rPr>
+                <w:sz w:val="24"/>
+                <w:szCs w:val="24"/>
+              </w:rPr>
+              <w:t xml:space="preserve">XII</w:t>
+            </w:r>
+          </w:p>
+        </w:tc>
+        <w:tc>
+          <w:tcPr>
+            <w:tcW w:type="dxa" w:w="3300"/>
+            <w:tcBorders>
+              <w:top w:val="single" w:color="000000" w:sz="4"/>
+              <w:left w:val="single" w:color="000000" w:sz="4"/>
+              <w:bottom w:val="single" w:color="000000" w:sz="4"/>
+              <w:right w:val="single" w:color="000000" w:sz="4"/>
+            </w:tcBorders>
+            <w:tcMar>
+              <w:top w:type="dxa" w:w="40"/>
+              <w:left w:type="dxa" w:w="80"/>
+              <w:bottom w:type="dxa" w:w="40"/>
+              <w:right w:type="dxa" w:w="80"/>
+            </w:tcMar>
+            <w:vAlign w:val="top"/>
+          </w:tcPr>
+          <w:p>
+            <w:pPr>
+              <w:spacing w:after="40" w:line="264"/>
+              <w:ind w:firstLine="0"/>
+              <w:jc w:val="left"/>
+            </w:pPr>
+            <w:r>
+              <w:rPr>
+                <w:b/>
+                <w:bCs/>
+                <w:sz w:val="24"/>
+                <w:szCs w:val="24"/>
+              </w:rPr>
+              <w:t xml:space="preserve">Lỗi thường gặp và cách khắc phục</w:t>
+            </w:r>
+          </w:p>
+        </w:tc>
+        <w:tc>
+          <w:tcPr>
+            <w:tcW w:type="dxa" w:w="4955"/>
+            <w:tcBorders>
+              <w:top w:val="single" w:color="000000" w:sz="4"/>
+              <w:left w:val="single" w:color="000000" w:sz="4"/>
+              <w:bottom w:val="single" w:color="000000" w:sz="4"/>
+              <w:right w:val="single" w:color="000000" w:sz="4"/>
+            </w:tcBorders>
+            <w:tcMar>
+              <w:top w:type="dxa" w:w="40"/>
+              <w:left w:type="dxa" w:w="80"/>
+              <w:bottom w:type="dxa" w:w="40"/>
+              <w:right w:type="dxa" w:w="80"/>
+            </w:tcMar>
+            <w:vAlign w:val="top"/>
+          </w:tcPr>
+          <w:p>
+            <w:pPr>
+              <w:spacing w:after="40" w:line="264"/>
+              <w:ind w:firstLine="0"/>
+              <w:jc w:val="left"/>
+            </w:pPr>
+            <w:r>
+              <w:rPr>
+                <w:sz w:val="24"/>
+                <w:szCs w:val="24"/>
+              </w:rPr>
+              <w:t xml:space="preserve">Khi gặp thông báo lỗi, tra theo từ khóa hoặc nhóm vấn đề để tìm cách xử lý.</w:t>
+            </w:r>
+          </w:p>
+        </w:tc>
+      </w:tr>
+      <w:tr>
+        <w:trPr>
+          <w:cantSplit/>
+        </w:trPr>
+        <w:tc>
+          <w:tcPr>
+            <w:tcW w:type="dxa" w:w="1100"/>
+            <w:tcBorders>
+              <w:top w:val="single" w:color="000000" w:sz="4"/>
+              <w:left w:val="single" w:color="000000" w:sz="4"/>
+              <w:bottom w:val="single" w:color="000000" w:sz="4"/>
+              <w:right w:val="single" w:color="000000" w:sz="4"/>
+            </w:tcBorders>
+            <w:tcMar>
+              <w:top w:type="dxa" w:w="40"/>
+              <w:left w:type="dxa" w:w="80"/>
+              <w:bottom w:type="dxa" w:w="40"/>
+              <w:right w:type="dxa" w:w="80"/>
+            </w:tcMar>
+            <w:vAlign w:val="top"/>
+          </w:tcPr>
+          <w:p>
+            <w:pPr>
+              <w:spacing w:after="40" w:line="264"/>
+              <w:ind w:firstLine="0"/>
+              <w:jc w:val="left"/>
+            </w:pPr>
+            <w:r>
+              <w:rPr>
+                <w:sz w:val="24"/>
+                <w:szCs w:val="24"/>
+              </w:rPr>
+              <w:t xml:space="preserve">XIII</w:t>
+            </w:r>
+          </w:p>
+        </w:tc>
+        <w:tc>
+          <w:tcPr>
+            <w:tcW w:type="dxa" w:w="3300"/>
+            <w:tcBorders>
+              <w:top w:val="single" w:color="000000" w:sz="4"/>
+              <w:left w:val="single" w:color="000000" w:sz="4"/>
+              <w:bottom w:val="single" w:color="000000" w:sz="4"/>
+              <w:right w:val="single" w:color="000000" w:sz="4"/>
+            </w:tcBorders>
+            <w:tcMar>
+              <w:top w:type="dxa" w:w="40"/>
+              <w:left w:type="dxa" w:w="80"/>
+              <w:bottom w:type="dxa" w:w="40"/>
+              <w:right w:type="dxa" w:w="80"/>
+            </w:tcMar>
+            <w:vAlign w:val="top"/>
+          </w:tcPr>
+          <w:p>
+            <w:pPr>
+              <w:spacing w:after="40" w:line="264"/>
+              <w:ind w:firstLine="0"/>
+              <w:jc w:val="left"/>
+            </w:pPr>
+            <w:r>
+              <w:rPr>
+                <w:b/>
+                <w:bCs/>
+                <w:sz w:val="24"/>
+                <w:szCs w:val="24"/>
+              </w:rPr>
+              <w:t xml:space="preserve">Liên hệ hỗ trợ và an toàn tài khoản</w:t>
+            </w:r>
+          </w:p>
+        </w:tc>
+        <w:tc>
+          <w:tcPr>
+            <w:tcW w:type="dxa" w:w="4955"/>
+            <w:tcBorders>
+              <w:top w:val="single" w:color="000000" w:sz="4"/>
+              <w:left w:val="single" w:color="000000" w:sz="4"/>
+              <w:bottom w:val="single" w:color="000000" w:sz="4"/>
+              <w:right w:val="single" w:color="000000" w:sz="4"/>
+            </w:tcBorders>
+            <w:tcMar>
+              <w:top w:type="dxa" w:w="40"/>
+              <w:left w:type="dxa" w:w="80"/>
+              <w:bottom w:type="dxa" w:w="40"/>
+              <w:right w:type="dxa" w:w="80"/>
+            </w:tcMar>
+            <w:vAlign w:val="top"/>
+          </w:tcPr>
+          <w:p>
+            <w:pPr>
+              <w:spacing w:after="40" w:line="264"/>
+              <w:ind w:firstLine="0"/>
+              <w:jc w:val="left"/>
+            </w:pPr>
+            <w:r>
+              <w:rPr>
+                <w:sz w:val="24"/>
+                <w:szCs w:val="24"/>
+              </w:rPr>
+              <w:t xml:space="preserve">Xem email hỗ trợ, mẫu email gửi yêu cầu và cách giữ an toàn tài khoản.</w:t>
+            </w:r>
+          </w:p>
+        </w:tc>
+      </w:tr>
+      <w:tr>
+        <w:trPr>
+          <w:cantSplit/>
+        </w:trPr>
+        <w:tc>
+          <w:tcPr>
+            <w:tcW w:type="dxa" w:w="1100"/>
+            <w:tcBorders>
+              <w:top w:val="single" w:color="000000" w:sz="4"/>
+              <w:left w:val="single" w:color="000000" w:sz="4"/>
+              <w:bottom w:val="single" w:color="000000" w:sz="4"/>
+              <w:right w:val="single" w:color="000000" w:sz="4"/>
+            </w:tcBorders>
+            <w:tcMar>
+              <w:top w:type="dxa" w:w="40"/>
+              <w:left w:type="dxa" w:w="80"/>
+              <w:bottom w:type="dxa" w:w="40"/>
+              <w:right w:type="dxa" w:w="80"/>
+            </w:tcMar>
+            <w:vAlign w:val="top"/>
+          </w:tcPr>
+          <w:p>
+            <w:pPr>
+              <w:spacing w:after="40" w:line="264"/>
+              <w:ind w:firstLine="0"/>
+              <w:jc w:val="left"/>
+            </w:pPr>
+            <w:r>
+              <w:rPr>
+                <w:sz w:val="24"/>
+                <w:szCs w:val="24"/>
+              </w:rPr>
+              <w:t xml:space="preserve">Phụ lục</w:t>
+            </w:r>
+          </w:p>
+        </w:tc>
+        <w:tc>
+          <w:tcPr>
+            <w:tcW w:type="dxa" w:w="3300"/>
+            <w:tcBorders>
+              <w:top w:val="single" w:color="000000" w:sz="4"/>
+              <w:left w:val="single" w:color="000000" w:sz="4"/>
+              <w:bottom w:val="single" w:color="000000" w:sz="4"/>
+              <w:right w:val="single" w:color="000000" w:sz="4"/>
+            </w:tcBorders>
+            <w:tcMar>
+              <w:top w:type="dxa" w:w="40"/>
+              <w:left w:type="dxa" w:w="80"/>
+              <w:bottom w:type="dxa" w:w="40"/>
+              <w:right w:type="dxa" w:w="80"/>
+            </w:tcMar>
+            <w:vAlign w:val="top"/>
+          </w:tcPr>
+          <w:p>
+            <w:pPr>
+              <w:spacing w:after="40" w:line="264"/>
+              <w:ind w:firstLine="0"/>
+              <w:jc w:val="left"/>
+            </w:pPr>
+            <w:r>
+              <w:rPr>
+                <w:b/>
+                <w:bCs/>
+                <w:sz w:val="24"/>
+                <w:szCs w:val="24"/>
+              </w:rPr>
+              <w:t xml:space="preserve">Nhóm Zalo hỗ trợ theo cụm</w:t>
+            </w:r>
+          </w:p>
+        </w:tc>
+        <w:tc>
+          <w:tcPr>
+            <w:tcW w:type="dxa" w:w="4955"/>
+            <w:tcBorders>
+              <w:top w:val="single" w:color="000000" w:sz="4"/>
+              <w:left w:val="single" w:color="000000" w:sz="4"/>
+              <w:bottom w:val="single" w:color="000000" w:sz="4"/>
+              <w:right w:val="single" w:color="000000" w:sz="4"/>
+            </w:tcBorders>
+            <w:tcMar>
+              <w:top w:type="dxa" w:w="40"/>
+              <w:left w:type="dxa" w:w="80"/>
+              <w:bottom w:type="dxa" w:w="40"/>
+              <w:right w:type="dxa" w:w="80"/>
+            </w:tcMar>
+            <w:vAlign w:val="top"/>
+          </w:tcPr>
+          <w:p>
+            <w:pPr>
+              <w:spacing w:after="40" w:line="264"/>
+              <w:ind w:firstLine="0"/>
+              <w:jc w:val="left"/>
+            </w:pPr>
+            <w:r>
+              <w:rPr>
+                <w:sz w:val="24"/>
+                <w:szCs w:val="24"/>
+              </w:rPr>
+              <w:t xml:space="preserve">Tra tên trường để tìm đúng nhóm Zalo hỗ trợ của cụm khi chưa thấy nút Vào nhóm Zalo.</w:t>
+            </w:r>
+          </w:p>
+        </w:tc>
+      </w:tr>
+    </w:tbl>
+    <w:p>
+      <w:pPr>
+        <w:spacing w:after="120" w:line="240"/>
+        <w:ind w:firstLine="0"/>
+      </w:pPr>
     </w:p>
     <w:p>
       <w:pPr>
@@ -1745,7 +3768,7 @@
                     </pic:cNvPicPr>
                   </pic:nvPicPr>
                   <pic:blipFill>
-                    <a:blip r:embed="rId9" cstate="none"/>
+                    <a:blip r:embed="rId12" cstate="none"/>
                     <a:srcRect/>
                     <a:stretch>
                       <a:fillRect/>
@@ -1780,7 +3803,7 @@
           <w:sz w:val="24"/>
           <w:szCs w:val="24"/>
         </w:rPr>
-        <w:t xml:space="preserve">Hình 1a. Đăng nhập lần đầu (giao diện máy tính)</w:t>
+        <w:t xml:space="preserve">Hình 4a. Đăng nhập lần đầu (giao diện máy tính)</w:t>
       </w:r>
     </w:p>
     <w:p>
@@ -1809,7 +3832,7 @@
                     </pic:cNvPicPr>
                   </pic:nvPicPr>
                   <pic:blipFill>
-                    <a:blip r:embed="rId10" cstate="none"/>
+                    <a:blip r:embed="rId13" cstate="none"/>
                     <a:srcRect/>
                     <a:stretch>
                       <a:fillRect/>
@@ -1844,7 +3867,7 @@
           <w:sz w:val="24"/>
           <w:szCs w:val="24"/>
         </w:rPr>
-        <w:t xml:space="preserve">Hình 1b. Đăng nhập lần đầu (giao diện điện thoại)</w:t>
+        <w:t xml:space="preserve">Hình 4b. Đăng nhập lần đầu (giao diện điện thoại)</w:t>
       </w:r>
     </w:p>
     <w:p>
@@ -2488,7 +4511,7 @@
                     </pic:cNvPicPr>
                   </pic:nvPicPr>
                   <pic:blipFill>
-                    <a:blip r:embed="rId11" cstate="none"/>
+                    <a:blip r:embed="rId14" cstate="none"/>
                     <a:srcRect/>
                     <a:stretch>
                       <a:fillRect/>
@@ -2523,7 +4546,7 @@
           <w:sz w:val="24"/>
           <w:szCs w:val="24"/>
         </w:rPr>
-        <w:t xml:space="preserve">Hình 2a. Đổi mật khẩu lần đầu (giao diện máy tính)</w:t>
+        <w:t xml:space="preserve">Hình 5a. Đổi mật khẩu lần đầu (giao diện máy tính)</w:t>
       </w:r>
     </w:p>
     <w:p>
@@ -2552,7 +4575,7 @@
                     </pic:cNvPicPr>
                   </pic:nvPicPr>
                   <pic:blipFill>
-                    <a:blip r:embed="rId12" cstate="none"/>
+                    <a:blip r:embed="rId15" cstate="none"/>
                     <a:srcRect/>
                     <a:stretch>
                       <a:fillRect/>
@@ -2587,7 +4610,7 @@
           <w:sz w:val="24"/>
           <w:szCs w:val="24"/>
         </w:rPr>
-        <w:t xml:space="preserve">Hình 2b. Đổi mật khẩu lần đầu (giao diện điện thoại)</w:t>
+        <w:t xml:space="preserve">Hình 5b. Đổi mật khẩu lần đầu (giao diện điện thoại)</w:t>
       </w:r>
     </w:p>
     <w:p>
@@ -2752,7 +4775,7 @@
                     </pic:cNvPicPr>
                   </pic:nvPicPr>
                   <pic:blipFill>
-                    <a:blip r:embed="rId13" cstate="none"/>
+                    <a:blip r:embed="rId16" cstate="none"/>
                     <a:srcRect/>
                     <a:stretch>
                       <a:fillRect/>
@@ -2787,7 +4810,7 @@
           <w:sz w:val="24"/>
           <w:szCs w:val="24"/>
         </w:rPr>
-        <w:t xml:space="preserve">Hình 3a. Trang chủ của tôi (giao diện máy tính)</w:t>
+        <w:t xml:space="preserve">Hình 6a. Trang chủ của tôi (giao diện máy tính)</w:t>
       </w:r>
     </w:p>
     <w:p>
@@ -2816,7 +4839,7 @@
                     </pic:cNvPicPr>
                   </pic:nvPicPr>
                   <pic:blipFill>
-                    <a:blip r:embed="rId14" cstate="none"/>
+                    <a:blip r:embed="rId17" cstate="none"/>
                     <a:srcRect/>
                     <a:stretch>
                       <a:fillRect/>
@@ -2851,7 +4874,7 @@
           <w:sz w:val="24"/>
           <w:szCs w:val="24"/>
         </w:rPr>
-        <w:t xml:space="preserve">Hình 3b. Trang chủ của tôi (giao diện điện thoại)</w:t>
+        <w:t xml:space="preserve">Hình 6b. Trang chủ của tôi (giao diện điện thoại)</w:t>
       </w:r>
     </w:p>
     <w:p>
@@ -4769,7 +6792,7 @@
                     </pic:cNvPicPr>
                   </pic:nvPicPr>
                   <pic:blipFill>
-                    <a:blip r:embed="rId15" cstate="none"/>
+                    <a:blip r:embed="rId18" cstate="none"/>
                     <a:srcRect/>
                     <a:stretch>
                       <a:fillRect/>
@@ -4804,7 +6827,7 @@
           <w:sz w:val="24"/>
           <w:szCs w:val="24"/>
         </w:rPr>
-        <w:t xml:space="preserve">Hình 4a. Bổ sung hồ sơ (giao diện máy tính)</w:t>
+        <w:t xml:space="preserve">Hình 7a. Bổ sung hồ sơ (giao diện máy tính)</w:t>
       </w:r>
     </w:p>
     <w:p>
@@ -4833,7 +6856,7 @@
                     </pic:cNvPicPr>
                   </pic:nvPicPr>
                   <pic:blipFill>
-                    <a:blip r:embed="rId16" cstate="none"/>
+                    <a:blip r:embed="rId19" cstate="none"/>
                     <a:srcRect/>
                     <a:stretch>
                       <a:fillRect/>
@@ -4868,7 +6891,7 @@
           <w:sz w:val="24"/>
           <w:szCs w:val="24"/>
         </w:rPr>
-        <w:t xml:space="preserve">Hình 4b. Bổ sung hồ sơ (giao diện điện thoại)</w:t>
+        <w:t xml:space="preserve">Hình 7b. Bổ sung hồ sơ (giao diện điện thoại)</w:t>
       </w:r>
     </w:p>
     <w:p>
@@ -5979,7 +8002,7 @@
                     </pic:cNvPicPr>
                   </pic:nvPicPr>
                   <pic:blipFill>
-                    <a:blip r:embed="rId17" cstate="none"/>
+                    <a:blip r:embed="rId20" cstate="none"/>
                     <a:srcRect/>
                     <a:stretch>
                       <a:fillRect/>
@@ -6014,7 +8037,7 @@
           <w:sz w:val="24"/>
           <w:szCs w:val="24"/>
         </w:rPr>
-        <w:t xml:space="preserve">Hình 5a. Làm khảo sát đầu vào (giao diện máy tính)</w:t>
+        <w:t xml:space="preserve">Hình 8a. Làm khảo sát đầu vào (giao diện máy tính)</w:t>
       </w:r>
     </w:p>
     <w:p>
@@ -6043,7 +8066,7 @@
                     </pic:cNvPicPr>
                   </pic:nvPicPr>
                   <pic:blipFill>
-                    <a:blip r:embed="rId18" cstate="none"/>
+                    <a:blip r:embed="rId21" cstate="none"/>
                     <a:srcRect/>
                     <a:stretch>
                       <a:fillRect/>
@@ -6078,7 +8101,7 @@
           <w:sz w:val="24"/>
           <w:szCs w:val="24"/>
         </w:rPr>
-        <w:t xml:space="preserve">Hình 5b. Làm khảo sát đầu vào (giao diện điện thoại)</w:t>
+        <w:t xml:space="preserve">Hình 8b. Làm khảo sát đầu vào (giao diện điện thoại)</w:t>
       </w:r>
     </w:p>
     <w:p>
@@ -7190,7 +9213,7 @@
                     </pic:cNvPicPr>
                   </pic:nvPicPr>
                   <pic:blipFill>
-                    <a:blip r:embed="rId19" cstate="none"/>
+                    <a:blip r:embed="rId22" cstate="none"/>
                     <a:srcRect/>
                     <a:stretch>
                       <a:fillRect/>
@@ -7225,7 +9248,7 @@
           <w:sz w:val="24"/>
           <w:szCs w:val="24"/>
         </w:rPr>
-        <w:t xml:space="preserve">Hình 6a. Nhóm Zalo hỗ trợ và thông tin lớp học (giao diện máy tính)</w:t>
+        <w:t xml:space="preserve">Hình 9a. Nhóm Zalo hỗ trợ và thông tin lớp học (giao diện máy tính)</w:t>
       </w:r>
     </w:p>
     <w:p>
@@ -7239,938 +9262,6 @@
         <w:drawing>
           <wp:inline distT="0" distB="0" distL="0" distR="0">
             <wp:extent cx="1905000" cy="3733800"/>
-            <wp:effectExtent t="0" r="0" b="0" l="0"/>
-            <wp:docPr id="1" name="" descr="" title=""/>
-            <wp:cNvGraphicFramePr>
-              <a:graphicFrameLocks xmlns:a="http://schemas.openxmlformats.org/drawingml/2006/main" noChangeAspect="1"/>
-            </wp:cNvGraphicFramePr>
-            <a:graphic xmlns:a="http://schemas.openxmlformats.org/drawingml/2006/main">
-              <a:graphicData uri="http://schemas.openxmlformats.org/drawingml/2006/picture">
-                <pic:pic xmlns:pic="http://schemas.openxmlformats.org/drawingml/2006/picture">
-                  <pic:nvPicPr>
-                    <pic:cNvPr id="0" name="" descr=""/>
-                    <pic:cNvPicPr>
-                      <a:picLocks noChangeAspect="1" noChangeArrowheads="1"/>
-                    </pic:cNvPicPr>
-                  </pic:nvPicPr>
-                  <pic:blipFill>
-                    <a:blip r:embed="rId20" cstate="none"/>
-                    <a:srcRect/>
-                    <a:stretch>
-                      <a:fillRect/>
-                    </a:stretch>
-                  </pic:blipFill>
-                  <pic:spPr bwMode="auto">
-                    <a:xfrm>
-                      <a:off x="0" y="0"/>
-                      <a:ext cx="1905000" cy="3733800"/>
-                    </a:xfrm>
-                    <a:prstGeom prst="rect">
-                      <a:avLst/>
-                    </a:prstGeom>
-                  </pic:spPr>
-                </pic:pic>
-              </a:graphicData>
-            </a:graphic>
-          </wp:inline>
-        </w:drawing>
-      </w:r>
-    </w:p>
-    <w:p>
-      <w:pPr>
-        <w:spacing w:after="160" w:before="60" w:line="240"/>
-        <w:ind w:firstLine="0"/>
-        <w:jc w:val="center"/>
-      </w:pPr>
-      <w:r>
-        <w:rPr>
-          <w:i/>
-          <w:iCs/>
-          <w:sz w:val="24"/>
-          <w:szCs w:val="24"/>
-        </w:rPr>
-        <w:t xml:space="preserve">Hình 6b. Nhóm Zalo hỗ trợ và thông tin lớp học (giao diện điện thoại)</w:t>
-      </w:r>
-    </w:p>
-    <w:p>
-      <w:pPr>
-        <w:spacing w:after="120" w:before="0" w:line="288"/>
-        <w:ind w:firstLine="567"/>
-        <w:jc w:val="both"/>
-      </w:pPr>
-      <w:r>
-        <w:rPr>
-          <w:b/>
-          <w:bCs/>
-        </w:rPr>
-        <w:t xml:space="preserve">Bước 1. </w:t>
-      </w:r>
-      <w:r>
-        <w:t xml:space="preserve">Bấm </w:t>
-      </w:r>
-      <w:r>
-        <w:rPr>
-          <w:b/>
-          <w:bCs/>
-        </w:rPr>
-        <w:t xml:space="preserve">Lớp học</w:t>
-      </w:r>
-      <w:r>
-        <w:t xml:space="preserve"> trên menu. Ngay dưới tên khóa là khối </w:t>
-      </w:r>
-      <w:r>
-        <w:rPr>
-          <w:b/>
-          <w:bCs/>
-        </w:rPr>
-        <w:t xml:space="preserve">Cụm hỗ trợ Zalo</w:t>
-      </w:r>
-      <w:r>
-        <w:t xml:space="preserve"> với tên cụm của Thầy/Cô.</w:t>
-      </w:r>
-    </w:p>
-    <w:p>
-      <w:pPr>
-        <w:spacing w:after="120" w:before="0" w:line="288"/>
-        <w:ind w:firstLine="567"/>
-        <w:jc w:val="both"/>
-      </w:pPr>
-      <w:r>
-        <w:rPr>
-          <w:b/>
-          <w:bCs/>
-        </w:rPr>
-        <w:t xml:space="preserve">Bước 2. </w:t>
-      </w:r>
-      <w:r>
-        <w:t xml:space="preserve">Bấm </w:t>
-      </w:r>
-      <w:r>
-        <w:rPr>
-          <w:b/>
-          <w:bCs/>
-        </w:rPr>
-        <w:t xml:space="preserve">“Vào nhóm Zalo”</w:t>
-      </w:r>
-      <w:r>
-        <w:t xml:space="preserve">. Trên điện thoại, Zalo mở ra, bấm </w:t>
-      </w:r>
-      <w:r>
-        <w:rPr>
-          <w:b/>
-          <w:bCs/>
-        </w:rPr>
-        <w:t xml:space="preserve">“Tham gia nhóm”</w:t>
-      </w:r>
-      <w:r>
-        <w:t xml:space="preserve">. Trên máy tính, Zalo hiện mã QR: mở Zalo trên điện thoại, chọn biểu tượng quét mã QR để quét.</w:t>
-      </w:r>
-    </w:p>
-    <w:p>
-      <w:pPr>
-        <w:spacing w:after="120" w:before="0" w:line="288"/>
-        <w:ind w:firstLine="567"/>
-        <w:jc w:val="both"/>
-      </w:pPr>
-      <w:r>
-        <w:rPr>
-          <w:b/>
-          <w:bCs/>
-        </w:rPr>
-        <w:t xml:space="preserve">Bước 3. </w:t>
-      </w:r>
-      <w:r>
-        <w:t xml:space="preserve">Bên dưới là </w:t>
-      </w:r>
-      <w:r>
-        <w:rPr>
-          <w:b/>
-          <w:bCs/>
-        </w:rPr>
-        <w:t xml:space="preserve">các giai đoạn</w:t>
-      </w:r>
-      <w:r>
-        <w:t xml:space="preserve"> của khóa học và thời gian của từng giai đoạn.</w:t>
-      </w:r>
-    </w:p>
-    <w:p>
-      <w:pPr>
-        <w:spacing w:after="120" w:before="0" w:line="288"/>
-        <w:ind w:firstLine="567"/>
-        <w:jc w:val="both"/>
-      </w:pPr>
-      <w:r>
-        <w:rPr>
-          <w:b/>
-          <w:bCs/>
-        </w:rPr>
-        <w:t xml:space="preserve">Bước 4. </w:t>
-      </w:r>
-      <w:r>
-        <w:t xml:space="preserve">Khung </w:t>
-      </w:r>
-      <w:r>
-        <w:rPr>
-          <w:i/>
-          <w:iCs/>
-        </w:rPr>
-        <w:t xml:space="preserve">"Danh sách lớp… sẽ được phân chia và cập nhật sau"</w:t>
-      </w:r>
-      <w:r>
-        <w:t xml:space="preserve"> cho biết </w:t>
-      </w:r>
-      <w:r>
-        <w:rPr>
-          <w:b/>
-          <w:bCs/>
-        </w:rPr>
-        <w:t xml:space="preserve">chưa chia lớp theo trình độ</w:t>
-      </w:r>
-      <w:r>
-        <w:t xml:space="preserve">. Đây là bình thường ở giai đoạn này. Theo dõi nhóm Zalo để biết khi nào có lớp.</w:t>
-      </w:r>
-    </w:p>
-    <w:p>
-      <w:pPr>
-        <w:spacing w:after="120" w:before="0" w:line="288"/>
-        <w:ind w:firstLine="567"/>
-        <w:jc w:val="both"/>
-      </w:pPr>
-      <w:r>
-        <w:rPr>
-          <w:b/>
-          <w:bCs/>
-          <w:i/>
-          <w:iCs/>
-        </w:rPr>
-        <w:t xml:space="preserve">Lưu ý – Khi đã chia lớp: </w:t>
-      </w:r>
-      <w:r>
-        <w:t xml:space="preserve">Mỗi giai đoạn sẽ hiện tên lớp, giảng viên, người hỗ trợ (kèm số điện thoại nếu có), lịch từng buổi và điểm danh. Phần </w:t>
-      </w:r>
-      <w:r>
-        <w:rPr>
-          <w:i/>
-          <w:iCs/>
-        </w:rPr>
-        <w:t xml:space="preserve">Kết quả đánh giá</w:t>
-      </w:r>
-      <w:r>
-        <w:t xml:space="preserve"> hiện mức đầu vào: Cơ bản, Thành thạo hoặc Nâng cao.</w:t>
-      </w:r>
-    </w:p>
-    <w:p>
-      <w:pPr>
-        <w:spacing w:after="120" w:before="0" w:line="288"/>
-        <w:ind w:firstLine="567"/>
-        <w:jc w:val="both"/>
-      </w:pPr>
-      <w:r>
-        <w:rPr>
-          <w:b/>
-          <w:bCs/>
-          <w:i/>
-          <w:iCs/>
-        </w:rPr>
-        <w:t xml:space="preserve">Lưu ý – Mẹo khi dùng nhóm Zalo: </w:t>
-      </w:r>
-      <w:r>
-        <w:t xml:space="preserve">Đặt tên Zalo dễ nhận biết (họ tên, trường) để cán bộ hỗ trợ dễ trao đổi. Đọc tin ghim của nhóm trước khi hỏi. Không gửi mật khẩu hay số CCCD lên nhóm.</w:t>
-      </w:r>
-    </w:p>
-    <w:p>
-      <w:pPr>
-        <w:pStyle w:val="Heading1"/>
-        <w:keepNext/>
-        <w:spacing w:after="120" w:before="240" w:line="288"/>
-        <w:ind w:firstLine="567"/>
-        <w:jc w:val="both"/>
-      </w:pPr>
-      <w:r>
-        <w:rPr>
-          <w:b/>
-          <w:bCs/>
-        </w:rPr>
-        <w:t xml:space="preserve">IX. XÁC NHẬN THÔNG TIN CUỐI KHÓA</w:t>
-      </w:r>
-    </w:p>
-    <w:p>
-      <w:pPr>
-        <w:spacing w:after="120" w:before="0" w:line="288"/>
-        <w:ind w:firstLine="567"/>
-        <w:jc w:val="both"/>
-      </w:pPr>
-      <w:r>
-        <w:t xml:space="preserve">Thực hiện khi Ban tổ chức mở </w:t>
-      </w:r>
-      <w:r>
-        <w:rPr>
-          <w:b/>
-          <w:bCs/>
-        </w:rPr>
-        <w:t xml:space="preserve">đợt xác nhận</w:t>
-      </w:r>
-      <w:r>
-        <w:t xml:space="preserve"> (thường ở cuối khóa, trước khi cấp chứng nhận). Xác nhận là lời cam kết thông tin đúng. Phải xác nhận trong thời hạn của đợt thì hồ sơ mới được ghi nhận.</w:t>
-      </w:r>
-    </w:p>
-    <w:p>
-      <w:pPr>
-        <w:keepNext/>
-        <w:spacing w:before="120" w:line="240"/>
-        <w:ind w:firstLine="0"/>
-        <w:jc w:val="center"/>
-      </w:pPr>
-      <w:r>
-        <w:drawing>
-          <wp:inline distT="0" distB="0" distL="0" distR="0">
-            <wp:extent cx="4953000" cy="3076575"/>
-            <wp:effectExtent t="0" r="0" b="0" l="0"/>
-            <wp:docPr id="1" name="" descr="" title=""/>
-            <wp:cNvGraphicFramePr>
-              <a:graphicFrameLocks xmlns:a="http://schemas.openxmlformats.org/drawingml/2006/main" noChangeAspect="1"/>
-            </wp:cNvGraphicFramePr>
-            <a:graphic xmlns:a="http://schemas.openxmlformats.org/drawingml/2006/main">
-              <a:graphicData uri="http://schemas.openxmlformats.org/drawingml/2006/picture">
-                <pic:pic xmlns:pic="http://schemas.openxmlformats.org/drawingml/2006/picture">
-                  <pic:nvPicPr>
-                    <pic:cNvPr id="0" name="" descr=""/>
-                    <pic:cNvPicPr>
-                      <a:picLocks noChangeAspect="1" noChangeArrowheads="1"/>
-                    </pic:cNvPicPr>
-                  </pic:nvPicPr>
-                  <pic:blipFill>
-                    <a:blip r:embed="rId21" cstate="none"/>
-                    <a:srcRect/>
-                    <a:stretch>
-                      <a:fillRect/>
-                    </a:stretch>
-                  </pic:blipFill>
-                  <pic:spPr bwMode="auto">
-                    <a:xfrm>
-                      <a:off x="0" y="0"/>
-                      <a:ext cx="4953000" cy="3076575"/>
-                    </a:xfrm>
-                    <a:prstGeom prst="rect">
-                      <a:avLst/>
-                    </a:prstGeom>
-                  </pic:spPr>
-                </pic:pic>
-              </a:graphicData>
-            </a:graphic>
-          </wp:inline>
-        </w:drawing>
-      </w:r>
-    </w:p>
-    <w:p>
-      <w:pPr>
-        <w:spacing w:after="160" w:before="60" w:line="240"/>
-        <w:ind w:firstLine="0"/>
-        <w:jc w:val="center"/>
-      </w:pPr>
-      <w:r>
-        <w:rPr>
-          <w:i/>
-          <w:iCs/>
-          <w:sz w:val="24"/>
-          <w:szCs w:val="24"/>
-        </w:rPr>
-        <w:t xml:space="preserve">Hình 7a. Xác nhận thông tin cuối khóa (giao diện máy tính)</w:t>
-      </w:r>
-    </w:p>
-    <w:p>
-      <w:pPr>
-        <w:keepNext/>
-        <w:spacing w:line="240"/>
-        <w:ind w:firstLine="0"/>
-        <w:jc w:val="center"/>
-      </w:pPr>
-      <w:r>
-        <w:drawing>
-          <wp:inline distT="0" distB="0" distL="0" distR="0">
-            <wp:extent cx="1905000" cy="2724150"/>
-            <wp:effectExtent t="0" r="0" b="0" l="0"/>
-            <wp:docPr id="1" name="" descr="" title=""/>
-            <wp:cNvGraphicFramePr>
-              <a:graphicFrameLocks xmlns:a="http://schemas.openxmlformats.org/drawingml/2006/main" noChangeAspect="1"/>
-            </wp:cNvGraphicFramePr>
-            <a:graphic xmlns:a="http://schemas.openxmlformats.org/drawingml/2006/main">
-              <a:graphicData uri="http://schemas.openxmlformats.org/drawingml/2006/picture">
-                <pic:pic xmlns:pic="http://schemas.openxmlformats.org/drawingml/2006/picture">
-                  <pic:nvPicPr>
-                    <pic:cNvPr id="0" name="" descr=""/>
-                    <pic:cNvPicPr>
-                      <a:picLocks noChangeAspect="1" noChangeArrowheads="1"/>
-                    </pic:cNvPicPr>
-                  </pic:nvPicPr>
-                  <pic:blipFill>
-                    <a:blip r:embed="rId22" cstate="none"/>
-                    <a:srcRect/>
-                    <a:stretch>
-                      <a:fillRect/>
-                    </a:stretch>
-                  </pic:blipFill>
-                  <pic:spPr bwMode="auto">
-                    <a:xfrm>
-                      <a:off x="0" y="0"/>
-                      <a:ext cx="1905000" cy="2724150"/>
-                    </a:xfrm>
-                    <a:prstGeom prst="rect">
-                      <a:avLst/>
-                    </a:prstGeom>
-                  </pic:spPr>
-                </pic:pic>
-              </a:graphicData>
-            </a:graphic>
-          </wp:inline>
-        </w:drawing>
-      </w:r>
-    </w:p>
-    <w:p>
-      <w:pPr>
-        <w:spacing w:after="160" w:before="60" w:line="240"/>
-        <w:ind w:firstLine="0"/>
-        <w:jc w:val="center"/>
-      </w:pPr>
-      <w:r>
-        <w:rPr>
-          <w:i/>
-          <w:iCs/>
-          <w:sz w:val="24"/>
-          <w:szCs w:val="24"/>
-        </w:rPr>
-        <w:t xml:space="preserve">Hình 7b. Xác nhận thông tin cuối khóa (giao diện điện thoại)</w:t>
-      </w:r>
-    </w:p>
-    <w:p>
-      <w:pPr>
-        <w:spacing w:after="120" w:before="0" w:line="288"/>
-        <w:ind w:firstLine="567"/>
-        <w:jc w:val="both"/>
-      </w:pPr>
-      <w:r>
-        <w:rPr>
-          <w:b/>
-          <w:bCs/>
-        </w:rPr>
-        <w:t xml:space="preserve">Bước 1. </w:t>
-      </w:r>
-      <w:r>
-        <w:t xml:space="preserve">Bấm </w:t>
-      </w:r>
-      <w:r>
-        <w:rPr>
-          <w:b/>
-          <w:bCs/>
-        </w:rPr>
-        <w:t xml:space="preserve">Xác nhận</w:t>
-      </w:r>
-      <w:r>
-        <w:t xml:space="preserve"> trên menu. Đọc lại toàn bộ thông tin. Nếu có khung </w:t>
-      </w:r>
-      <w:r>
-        <w:rPr>
-          <w:b/>
-          <w:bCs/>
-        </w:rPr>
-        <w:t xml:space="preserve">đỏ</w:t>
-      </w:r>
-      <w:r>
-        <w:t xml:space="preserve"> (lỗi), bấm nút </w:t>
-      </w:r>
-      <w:r>
-        <w:rPr>
-          <w:b/>
-          <w:bCs/>
-        </w:rPr>
-        <w:t xml:space="preserve">“Sửa”</w:t>
-      </w:r>
-      <w:r>
-        <w:t xml:space="preserve"> cạnh lỗi để quay về đúng ô cần sửa. Khung </w:t>
-      </w:r>
-      <w:r>
-        <w:rPr>
-          <w:b/>
-          <w:bCs/>
-        </w:rPr>
-        <w:t xml:space="preserve">vàng</w:t>
-      </w:r>
-      <w:r>
-        <w:t xml:space="preserve"> chỉ là gợi ý, không bắt buộc.</w:t>
-      </w:r>
-    </w:p>
-    <w:p>
-      <w:pPr>
-        <w:spacing w:after="120" w:before="0" w:line="288"/>
-        <w:ind w:firstLine="567"/>
-        <w:jc w:val="both"/>
-      </w:pPr>
-      <w:r>
-        <w:rPr>
-          <w:b/>
-          <w:bCs/>
-        </w:rPr>
-        <w:t xml:space="preserve">Bước 2. </w:t>
-      </w:r>
-      <w:r>
-        <w:t xml:space="preserve">Tích vào ô cam kết.</w:t>
-      </w:r>
-    </w:p>
-    <w:p>
-      <w:pPr>
-        <w:spacing w:after="120" w:before="0" w:line="288"/>
-        <w:ind w:firstLine="567"/>
-        <w:jc w:val="both"/>
-      </w:pPr>
-      <w:r>
-        <w:rPr>
-          <w:b/>
-          <w:bCs/>
-        </w:rPr>
-        <w:t xml:space="preserve">Bước 3. </w:t>
-      </w:r>
-      <w:r>
-        <w:t xml:space="preserve">Bấm </w:t>
-      </w:r>
-      <w:r>
-        <w:rPr>
-          <w:b/>
-          <w:bCs/>
-        </w:rPr>
-        <w:t xml:space="preserve">“Xác nhận”</w:t>
-      </w:r>
-      <w:r>
-        <w:t xml:space="preserve">. Màn hình báo </w:t>
-      </w:r>
-      <w:r>
-        <w:rPr>
-          <w:i/>
-          <w:iCs/>
-        </w:rPr>
-        <w:t xml:space="preserve">"Đã xác nhận lúc …"</w:t>
-      </w:r>
-      <w:r>
-        <w:t xml:space="preserve"> và hệ thống gửi bản sao hồ sơ vào email của Thầy/Cô.</w:t>
-      </w:r>
-    </w:p>
-    <w:p>
-      <w:pPr>
-        <w:spacing w:after="120" w:before="0" w:line="288"/>
-        <w:ind w:firstLine="567"/>
-        <w:jc w:val="both"/>
-      </w:pPr>
-      <w:r>
-        <w:rPr>
-          <w:b/>
-          <w:bCs/>
-          <w:i/>
-          <w:iCs/>
-        </w:rPr>
-        <w:t xml:space="preserve">Lưu ý – Sửa hồ sơ sau khi đã xác nhận: </w:t>
-      </w:r>
-      <w:r>
-        <w:t xml:space="preserve">Nếu sửa và lưu lại sau khi xác nhận, lần xác nhận cũ bị hủy. Hệ thống hiện hộp thông báo </w:t>
-      </w:r>
-      <w:r>
-        <w:rPr>
-          <w:i/>
-          <w:iCs/>
-        </w:rPr>
-        <w:t xml:space="preserve">"Cần xác nhận lại"</w:t>
-      </w:r>
-      <w:r>
-        <w:t xml:space="preserve">. Thầy/Cô bấm </w:t>
-      </w:r>
-      <w:r>
-        <w:rPr>
-          <w:b/>
-          <w:bCs/>
-        </w:rPr>
-        <w:t xml:space="preserve">“Xác nhận lại”</w:t>
-      </w:r>
-      <w:r>
-        <w:t xml:space="preserve"> và làm lại các bước trên trước hạn chót.</w:t>
-      </w:r>
-    </w:p>
-    <w:p>
-      <w:pPr>
-        <w:pStyle w:val="Heading1"/>
-        <w:keepNext/>
-        <w:spacing w:after="120" w:before="240" w:line="288"/>
-        <w:ind w:firstLine="567"/>
-        <w:jc w:val="both"/>
-      </w:pPr>
-      <w:r>
-        <w:rPr>
-          <w:b/>
-          <w:bCs/>
-        </w:rPr>
-        <w:t xml:space="preserve">X. QUÊN MẬT KHẨU</w:t>
-      </w:r>
-    </w:p>
-    <w:p>
-      <w:pPr>
-        <w:spacing w:after="120" w:before="0" w:line="288"/>
-        <w:ind w:firstLine="567"/>
-        <w:jc w:val="both"/>
-      </w:pPr>
-      <w:r>
-        <w:t xml:space="preserve">Có hai cách, tùy việc email của Thầy/Cô đã được xác minh hay chưa.</w:t>
-      </w:r>
-    </w:p>
-    <w:tbl>
-      <w:tblPr>
-        <w:tblW w:type="dxa" w:w="9355"/>
-        <w:tblBorders>
-          <w:top w:val="single" w:color="auto" w:sz="4"/>
-          <w:left w:val="single" w:color="auto" w:sz="4"/>
-          <w:bottom w:val="single" w:color="auto" w:sz="4"/>
-          <w:right w:val="single" w:color="auto" w:sz="4"/>
-          <w:insideH w:val="single" w:color="auto" w:sz="4"/>
-          <w:insideV w:val="single" w:color="auto" w:sz="4"/>
-        </w:tblBorders>
-        <w:tblLayout w:type="fixed"/>
-      </w:tblPr>
-      <w:tblGrid>
-        <w:gridCol w:w="2994"/>
-        <w:gridCol w:w="6361"/>
-      </w:tblGrid>
-      <w:tr>
-        <w:trPr>
-          <w:cantSplit/>
-          <w:tblHeader/>
-        </w:trPr>
-        <w:tc>
-          <w:tcPr>
-            <w:tcW w:type="dxa" w:w="2994"/>
-            <w:tcBorders>
-              <w:top w:val="single" w:color="000000" w:sz="4"/>
-              <w:left w:val="single" w:color="000000" w:sz="4"/>
-              <w:bottom w:val="single" w:color="000000" w:sz="4"/>
-              <w:right w:val="single" w:color="000000" w:sz="4"/>
-            </w:tcBorders>
-            <w:shd w:fill="E7E6E6" w:color="auto" w:val="clear"/>
-            <w:tcMar>
-              <w:top w:type="dxa" w:w="40"/>
-              <w:left w:type="dxa" w:w="80"/>
-              <w:bottom w:type="dxa" w:w="40"/>
-              <w:right w:type="dxa" w:w="80"/>
-            </w:tcMar>
-            <w:vAlign w:val="center"/>
-          </w:tcPr>
-          <w:p>
-            <w:pPr>
-              <w:spacing w:after="40" w:line="264"/>
-              <w:ind w:firstLine="0"/>
-              <w:jc w:val="center"/>
-            </w:pPr>
-            <w:r>
-              <w:rPr>
-                <w:b/>
-                <w:bCs/>
-                <w:sz w:val="24"/>
-                <w:szCs w:val="24"/>
-              </w:rPr>
-              <w:t xml:space="preserve">Trường hợp</w:t>
-            </w:r>
-          </w:p>
-        </w:tc>
-        <w:tc>
-          <w:tcPr>
-            <w:tcW w:type="dxa" w:w="6361"/>
-            <w:tcBorders>
-              <w:top w:val="single" w:color="000000" w:sz="4"/>
-              <w:left w:val="single" w:color="000000" w:sz="4"/>
-              <w:bottom w:val="single" w:color="000000" w:sz="4"/>
-              <w:right w:val="single" w:color="000000" w:sz="4"/>
-            </w:tcBorders>
-            <w:shd w:fill="E7E6E6" w:color="auto" w:val="clear"/>
-            <w:tcMar>
-              <w:top w:type="dxa" w:w="40"/>
-              <w:left w:type="dxa" w:w="80"/>
-              <w:bottom w:type="dxa" w:w="40"/>
-              <w:right w:type="dxa" w:w="80"/>
-            </w:tcMar>
-            <w:vAlign w:val="center"/>
-          </w:tcPr>
-          <w:p>
-            <w:pPr>
-              <w:spacing w:after="40" w:line="264"/>
-              <w:ind w:firstLine="0"/>
-              <w:jc w:val="center"/>
-            </w:pPr>
-            <w:r>
-              <w:rPr>
-                <w:b/>
-                <w:bCs/>
-                <w:sz w:val="24"/>
-                <w:szCs w:val="24"/>
-              </w:rPr>
-              <w:t xml:space="preserve">Cách làm</w:t>
-            </w:r>
-          </w:p>
-        </w:tc>
-      </w:tr>
-      <w:tr>
-        <w:trPr>
-          <w:cantSplit/>
-        </w:trPr>
-        <w:tc>
-          <w:tcPr>
-            <w:tcW w:type="dxa" w:w="2994"/>
-            <w:tcBorders>
-              <w:top w:val="single" w:color="000000" w:sz="4"/>
-              <w:left w:val="single" w:color="000000" w:sz="4"/>
-              <w:bottom w:val="single" w:color="000000" w:sz="4"/>
-              <w:right w:val="single" w:color="000000" w:sz="4"/>
-            </w:tcBorders>
-            <w:tcMar>
-              <w:top w:type="dxa" w:w="40"/>
-              <w:left w:type="dxa" w:w="80"/>
-              <w:bottom w:type="dxa" w:w="40"/>
-              <w:right w:type="dxa" w:w="80"/>
-            </w:tcMar>
-            <w:vAlign w:val="top"/>
-          </w:tcPr>
-          <w:p>
-            <w:pPr>
-              <w:spacing w:after="40" w:line="264"/>
-              <w:ind w:firstLine="0"/>
-              <w:jc w:val="left"/>
-            </w:pPr>
-            <w:r>
-              <w:rPr>
-                <w:b/>
-                <w:bCs/>
-                <w:sz w:val="24"/>
-                <w:szCs w:val="24"/>
-              </w:rPr>
-              <w:t xml:space="preserve">Email đã xác minh</w:t>
-            </w:r>
-          </w:p>
-        </w:tc>
-        <w:tc>
-          <w:tcPr>
-            <w:tcW w:type="dxa" w:w="6361"/>
-            <w:tcBorders>
-              <w:top w:val="single" w:color="000000" w:sz="4"/>
-              <w:left w:val="single" w:color="000000" w:sz="4"/>
-              <w:bottom w:val="single" w:color="000000" w:sz="4"/>
-              <w:right w:val="single" w:color="000000" w:sz="4"/>
-            </w:tcBorders>
-            <w:tcMar>
-              <w:top w:type="dxa" w:w="40"/>
-              <w:left w:type="dxa" w:w="80"/>
-              <w:bottom w:type="dxa" w:w="40"/>
-              <w:right w:type="dxa" w:w="80"/>
-            </w:tcMar>
-            <w:vAlign w:val="top"/>
-          </w:tcPr>
-          <w:p>
-            <w:pPr>
-              <w:spacing w:after="40" w:line="264"/>
-              <w:ind w:firstLine="0"/>
-              <w:jc w:val="left"/>
-            </w:pPr>
-            <w:r>
-              <w:rPr>
-                <w:sz w:val="24"/>
-                <w:szCs w:val="24"/>
-              </w:rPr>
-              <w:t xml:space="preserve">Ở màn hình đăng nhập, bấm </w:t>
-            </w:r>
-            <w:r>
-              <w:rPr>
-                <w:b/>
-                <w:bCs/>
-                <w:sz w:val="24"/>
-                <w:szCs w:val="24"/>
-              </w:rPr>
-              <w:t xml:space="preserve">“Quên mật khẩu?”</w:t>
-            </w:r>
-            <w:r>
-              <w:rPr>
-                <w:sz w:val="24"/>
-                <w:szCs w:val="24"/>
-              </w:rPr>
-              <w:t xml:space="preserve">. Nhập tên tài khoản hoặc mã định danh MOET, bấm </w:t>
-            </w:r>
-            <w:r>
-              <w:rPr>
-                <w:b/>
-                <w:bCs/>
-                <w:sz w:val="24"/>
-                <w:szCs w:val="24"/>
-              </w:rPr>
-              <w:t xml:space="preserve">“Gửi yêu cầu”</w:t>
-            </w:r>
-            <w:r>
-              <w:rPr>
-                <w:sz w:val="24"/>
-                <w:szCs w:val="24"/>
-              </w:rPr>
-              <w:t xml:space="preserve">. Mở email (xem cả Thư rác), bấm liên kết đặt lại mật khẩu, đặt mật khẩu mới.</w:t>
-            </w:r>
-          </w:p>
-        </w:tc>
-      </w:tr>
-      <w:tr>
-        <w:trPr>
-          <w:cantSplit/>
-        </w:trPr>
-        <w:tc>
-          <w:tcPr>
-            <w:tcW w:type="dxa" w:w="2994"/>
-            <w:tcBorders>
-              <w:top w:val="single" w:color="000000" w:sz="4"/>
-              <w:left w:val="single" w:color="000000" w:sz="4"/>
-              <w:bottom w:val="single" w:color="000000" w:sz="4"/>
-              <w:right w:val="single" w:color="000000" w:sz="4"/>
-            </w:tcBorders>
-            <w:tcMar>
-              <w:top w:type="dxa" w:w="40"/>
-              <w:left w:type="dxa" w:w="80"/>
-              <w:bottom w:type="dxa" w:w="40"/>
-              <w:right w:type="dxa" w:w="80"/>
-            </w:tcMar>
-            <w:vAlign w:val="top"/>
-          </w:tcPr>
-          <w:p>
-            <w:pPr>
-              <w:spacing w:after="40" w:line="264"/>
-              <w:ind w:firstLine="0"/>
-              <w:jc w:val="left"/>
-            </w:pPr>
-            <w:r>
-              <w:rPr>
-                <w:b/>
-                <w:bCs/>
-                <w:sz w:val="24"/>
-                <w:szCs w:val="24"/>
-              </w:rPr>
-              <w:t xml:space="preserve">Email chưa xác minh</w:t>
-            </w:r>
-            <w:r>
-              <w:rPr>
-                <w:sz w:val="24"/>
-                <w:szCs w:val="24"/>
-              </w:rPr>
-              <w:t xml:space="preserve"> hoặc không nhận được thư sau 15 phút</w:t>
-            </w:r>
-          </w:p>
-        </w:tc>
-        <w:tc>
-          <w:tcPr>
-            <w:tcW w:type="dxa" w:w="6361"/>
-            <w:tcBorders>
-              <w:top w:val="single" w:color="000000" w:sz="4"/>
-              <w:left w:val="single" w:color="000000" w:sz="4"/>
-              <w:bottom w:val="single" w:color="000000" w:sz="4"/>
-              <w:right w:val="single" w:color="000000" w:sz="4"/>
-            </w:tcBorders>
-            <w:tcMar>
-              <w:top w:type="dxa" w:w="40"/>
-              <w:left w:type="dxa" w:w="80"/>
-              <w:bottom w:type="dxa" w:w="40"/>
-              <w:right w:type="dxa" w:w="80"/>
-            </w:tcMar>
-            <w:vAlign w:val="top"/>
-          </w:tcPr>
-          <w:p>
-            <w:pPr>
-              <w:spacing w:after="40" w:line="264"/>
-              <w:ind w:firstLine="0"/>
-              <w:jc w:val="left"/>
-            </w:pPr>
-            <w:r>
-              <w:rPr>
-                <w:sz w:val="24"/>
-                <w:szCs w:val="24"/>
-              </w:rPr>
-              <w:t xml:space="preserve">Gửi email tới </w:t>
-            </w:r>
-            <w:r>
-              <w:rPr>
-                <w:b/>
-                <w:bCs/>
-                <w:sz w:val="24"/>
-                <w:szCs w:val="24"/>
-              </w:rPr>
-              <w:t xml:space="preserve">boiduongnls@hcmue.edu.vn</w:t>
-            </w:r>
-            <w:r>
-              <w:rPr>
-                <w:sz w:val="24"/>
-                <w:szCs w:val="24"/>
-              </w:rPr>
-              <w:t xml:space="preserve"> theo mẫu ở mục XIII. Sau khi xác minh, cán bộ hỗ trợ đặt lại mật khẩu về ngày sinh để Thầy/Cô đăng nhập và đổi lại.</w:t>
-            </w:r>
-          </w:p>
-        </w:tc>
-      </w:tr>
-    </w:tbl>
-    <w:p>
-      <w:pPr>
-        <w:spacing w:after="120" w:line="240"/>
-        <w:ind w:firstLine="0"/>
-      </w:pPr>
-    </w:p>
-    <w:p>
-      <w:pPr>
-        <w:spacing w:after="120" w:before="0" w:line="288"/>
-        <w:ind w:firstLine="567"/>
-        <w:jc w:val="both"/>
-      </w:pPr>
-      <w:r>
-        <w:rPr>
-          <w:b/>
-          <w:bCs/>
-          <w:i/>
-          <w:iCs/>
-        </w:rPr>
-        <w:t xml:space="preserve">Lưu ý – Vì sao màn hình luôn báo đã gửi? </w:t>
-      </w:r>
-      <w:r>
-        <w:t xml:space="preserve">Để bảo vệ tài khoản, hệ thống luôn hiện cùng một thông báo, kể cả khi mã không đúng hoặc email chưa xác minh. Nếu không nhận được thư, hãy làm theo dòng thứ hai của bảng trên.</w:t>
-      </w:r>
-    </w:p>
-    <w:p>
-      <w:pPr>
-        <w:pStyle w:val="Heading1"/>
-        <w:keepNext/>
-        <w:spacing w:after="120" w:before="240" w:line="288"/>
-        <w:ind w:firstLine="567"/>
-        <w:jc w:val="both"/>
-      </w:pPr>
-      <w:r>
-        <w:rPr>
-          <w:b/>
-          <w:bCs/>
-        </w:rPr>
-        <w:t xml:space="preserve">XI. GỬI YÊU CẦU HỖ TRỢ TRÊN HỆ THỐNG</w:t>
-      </w:r>
-    </w:p>
-    <w:p>
-      <w:pPr>
-        <w:spacing w:after="120" w:before="0" w:line="288"/>
-        <w:ind w:firstLine="567"/>
-        <w:jc w:val="both"/>
-      </w:pPr>
-      <w:r>
-        <w:t xml:space="preserve">Khi đã đăng nhập được, cách nhanh nhất là gửi yêu cầu ngay trên hệ thống. Câu trả lời hiện lại ở cùng trang.</w:t>
-      </w:r>
-    </w:p>
-    <w:p>
-      <w:pPr>
-        <w:keepNext/>
-        <w:spacing w:before="120" w:line="240"/>
-        <w:ind w:firstLine="0"/>
-        <w:jc w:val="center"/>
-      </w:pPr>
-      <w:r>
-        <w:drawing>
-          <wp:inline distT="0" distB="0" distL="0" distR="0">
-            <wp:extent cx="4953000" cy="3124200"/>
             <wp:effectExtent t="0" r="0" b="0" l="0"/>
             <wp:docPr id="1" name="" descr="" title=""/>
             <wp:cNvGraphicFramePr>
@@ -8195,7 +9286,7 @@
                   <pic:spPr bwMode="auto">
                     <a:xfrm>
                       <a:off x="0" y="0"/>
-                      <a:ext cx="4953000" cy="3124200"/>
+                      <a:ext cx="1905000" cy="3733800"/>
                     </a:xfrm>
                     <a:prstGeom prst="rect">
                       <a:avLst/>
@@ -8221,20 +9312,242 @@
           <w:sz w:val="24"/>
           <w:szCs w:val="24"/>
         </w:rPr>
-        <w:t xml:space="preserve">Hình 8a. Gửi yêu cầu hỗ trợ trên hệ thống (giao diện máy tính)</w:t>
+        <w:t xml:space="preserve">Hình 9b. Nhóm Zalo hỗ trợ và thông tin lớp học (giao diện điện thoại)</w:t>
+      </w:r>
+    </w:p>
+    <w:p>
+      <w:pPr>
+        <w:spacing w:after="120" w:before="0" w:line="288"/>
+        <w:ind w:firstLine="567"/>
+        <w:jc w:val="both"/>
+      </w:pPr>
+      <w:r>
+        <w:rPr>
+          <w:b/>
+          <w:bCs/>
+        </w:rPr>
+        <w:t xml:space="preserve">Bước 1. </w:t>
+      </w:r>
+      <w:r>
+        <w:t xml:space="preserve">Bấm </w:t>
+      </w:r>
+      <w:r>
+        <w:rPr>
+          <w:b/>
+          <w:bCs/>
+        </w:rPr>
+        <w:t xml:space="preserve">Lớp học</w:t>
+      </w:r>
+      <w:r>
+        <w:t xml:space="preserve"> trên menu. Ngay dưới tên khóa là khối </w:t>
+      </w:r>
+      <w:r>
+        <w:rPr>
+          <w:b/>
+          <w:bCs/>
+        </w:rPr>
+        <w:t xml:space="preserve">Cụm hỗ trợ Zalo</w:t>
+      </w:r>
+      <w:r>
+        <w:t xml:space="preserve"> với tên cụm của Thầy/Cô.</w:t>
+      </w:r>
+    </w:p>
+    <w:p>
+      <w:pPr>
+        <w:spacing w:after="120" w:before="0" w:line="288"/>
+        <w:ind w:firstLine="567"/>
+        <w:jc w:val="both"/>
+      </w:pPr>
+      <w:r>
+        <w:rPr>
+          <w:b/>
+          <w:bCs/>
+        </w:rPr>
+        <w:t xml:space="preserve">Bước 2. </w:t>
+      </w:r>
+      <w:r>
+        <w:t xml:space="preserve">Bấm </w:t>
+      </w:r>
+      <w:r>
+        <w:rPr>
+          <w:b/>
+          <w:bCs/>
+        </w:rPr>
+        <w:t xml:space="preserve">“Vào nhóm Zalo”</w:t>
+      </w:r>
+      <w:r>
+        <w:t xml:space="preserve">. Trên điện thoại, Zalo mở ra, bấm </w:t>
+      </w:r>
+      <w:r>
+        <w:rPr>
+          <w:b/>
+          <w:bCs/>
+        </w:rPr>
+        <w:t xml:space="preserve">“Tham gia nhóm”</w:t>
+      </w:r>
+      <w:r>
+        <w:t xml:space="preserve">. Trên máy tính, Zalo hiện mã QR: mở Zalo trên điện thoại, chọn biểu tượng quét mã QR để quét.</w:t>
+      </w:r>
+    </w:p>
+    <w:p>
+      <w:pPr>
+        <w:spacing w:after="120" w:before="0" w:line="288"/>
+        <w:ind w:firstLine="567"/>
+        <w:jc w:val="both"/>
+      </w:pPr>
+      <w:r>
+        <w:rPr>
+          <w:b/>
+          <w:bCs/>
+        </w:rPr>
+        <w:t xml:space="preserve">Bước 3. </w:t>
+      </w:r>
+      <w:r>
+        <w:t xml:space="preserve">Bên dưới là </w:t>
+      </w:r>
+      <w:r>
+        <w:rPr>
+          <w:b/>
+          <w:bCs/>
+        </w:rPr>
+        <w:t xml:space="preserve">các giai đoạn</w:t>
+      </w:r>
+      <w:r>
+        <w:t xml:space="preserve"> của khóa học và thời gian của từng giai đoạn.</w:t>
+      </w:r>
+    </w:p>
+    <w:p>
+      <w:pPr>
+        <w:spacing w:after="120" w:before="0" w:line="288"/>
+        <w:ind w:firstLine="567"/>
+        <w:jc w:val="both"/>
+      </w:pPr>
+      <w:r>
+        <w:rPr>
+          <w:b/>
+          <w:bCs/>
+        </w:rPr>
+        <w:t xml:space="preserve">Bước 4. </w:t>
+      </w:r>
+      <w:r>
+        <w:t xml:space="preserve">Khung </w:t>
+      </w:r>
+      <w:r>
+        <w:rPr>
+          <w:i/>
+          <w:iCs/>
+        </w:rPr>
+        <w:t xml:space="preserve">"Danh sách lớp… sẽ được phân chia và cập nhật sau"</w:t>
+      </w:r>
+      <w:r>
+        <w:t xml:space="preserve"> cho biết </w:t>
+      </w:r>
+      <w:r>
+        <w:rPr>
+          <w:b/>
+          <w:bCs/>
+        </w:rPr>
+        <w:t xml:space="preserve">chưa chia lớp theo trình độ</w:t>
+      </w:r>
+      <w:r>
+        <w:t xml:space="preserve">. Đây là bình thường ở giai đoạn này. Theo dõi nhóm Zalo để biết khi nào có lớp.</w:t>
+      </w:r>
+    </w:p>
+    <w:p>
+      <w:pPr>
+        <w:spacing w:after="120" w:before="0" w:line="288"/>
+        <w:ind w:firstLine="567"/>
+        <w:jc w:val="both"/>
+      </w:pPr>
+      <w:r>
+        <w:rPr>
+          <w:b/>
+          <w:bCs/>
+          <w:i/>
+          <w:iCs/>
+        </w:rPr>
+        <w:t xml:space="preserve">Lưu ý – Khi đã chia lớp: </w:t>
+      </w:r>
+      <w:r>
+        <w:t xml:space="preserve">Mỗi giai đoạn sẽ hiện tên lớp, giảng viên, người hỗ trợ (kèm số điện thoại nếu có), lịch từng buổi và điểm danh. Phần </w:t>
+      </w:r>
+      <w:r>
+        <w:rPr>
+          <w:i/>
+          <w:iCs/>
+        </w:rPr>
+        <w:t xml:space="preserve">Kết quả đánh giá</w:t>
+      </w:r>
+      <w:r>
+        <w:t xml:space="preserve"> hiện mức đầu vào: Cơ bản, Thành thạo hoặc Nâng cao.</w:t>
+      </w:r>
+    </w:p>
+    <w:p>
+      <w:pPr>
+        <w:spacing w:after="120" w:before="0" w:line="288"/>
+        <w:ind w:firstLine="567"/>
+        <w:jc w:val="both"/>
+      </w:pPr>
+      <w:r>
+        <w:rPr>
+          <w:b/>
+          <w:bCs/>
+          <w:i/>
+          <w:iCs/>
+        </w:rPr>
+        <w:t xml:space="preserve">Lưu ý – Mẹo khi dùng nhóm Zalo: </w:t>
+      </w:r>
+      <w:r>
+        <w:t xml:space="preserve">Đặt tên Zalo dễ nhận biết (họ tên, trường) để cán bộ hỗ trợ dễ trao đổi. Đọc tin ghim của nhóm trước khi hỏi. Không gửi mật khẩu hay số CCCD lên nhóm.</w:t>
+      </w:r>
+    </w:p>
+    <w:p>
+      <w:pPr>
+        <w:pStyle w:val="Heading1"/>
+        <w:keepNext/>
+        <w:spacing w:after="120" w:before="240" w:line="288"/>
+        <w:ind w:firstLine="567"/>
+        <w:jc w:val="both"/>
+      </w:pPr>
+      <w:r>
+        <w:rPr>
+          <w:b/>
+          <w:bCs/>
+        </w:rPr>
+        <w:t xml:space="preserve">IX. XÁC NHẬN THÔNG TIN CUỐI KHÓA</w:t>
+      </w:r>
+    </w:p>
+    <w:p>
+      <w:pPr>
+        <w:spacing w:after="120" w:before="0" w:line="288"/>
+        <w:ind w:firstLine="567"/>
+        <w:jc w:val="both"/>
+      </w:pPr>
+      <w:r>
+        <w:t xml:space="preserve">Thực hiện khi Ban tổ chức mở </w:t>
+      </w:r>
+      <w:r>
+        <w:rPr>
+          <w:b/>
+          <w:bCs/>
+        </w:rPr>
+        <w:t xml:space="preserve">đợt xác nhận</w:t>
+      </w:r>
+      <w:r>
+        <w:t xml:space="preserve"> (thường ở cuối khóa, trước khi cấp chứng nhận). Xác nhận là lời cam kết thông tin đúng. Phải xác nhận trong thời hạn của đợt thì hồ sơ mới được ghi nhận.</w:t>
       </w:r>
     </w:p>
     <w:p>
       <w:pPr>
         <w:keepNext/>
-        <w:spacing w:line="240"/>
+        <w:spacing w:before="120" w:line="240"/>
         <w:ind w:firstLine="0"/>
         <w:jc w:val="center"/>
       </w:pPr>
       <w:r>
         <w:drawing>
           <wp:inline distT="0" distB="0" distL="0" distR="0">
-            <wp:extent cx="1905000" cy="2867025"/>
+            <wp:extent cx="4953000" cy="3076575"/>
             <wp:effectExtent t="0" r="0" b="0" l="0"/>
             <wp:docPr id="1" name="" descr="" title=""/>
             <wp:cNvGraphicFramePr>
@@ -8259,6 +9572,716 @@
                   <pic:spPr bwMode="auto">
                     <a:xfrm>
                       <a:off x="0" y="0"/>
+                      <a:ext cx="4953000" cy="3076575"/>
+                    </a:xfrm>
+                    <a:prstGeom prst="rect">
+                      <a:avLst/>
+                    </a:prstGeom>
+                  </pic:spPr>
+                </pic:pic>
+              </a:graphicData>
+            </a:graphic>
+          </wp:inline>
+        </w:drawing>
+      </w:r>
+    </w:p>
+    <w:p>
+      <w:pPr>
+        <w:spacing w:after="160" w:before="60" w:line="240"/>
+        <w:ind w:firstLine="0"/>
+        <w:jc w:val="center"/>
+      </w:pPr>
+      <w:r>
+        <w:rPr>
+          <w:i/>
+          <w:iCs/>
+          <w:sz w:val="24"/>
+          <w:szCs w:val="24"/>
+        </w:rPr>
+        <w:t xml:space="preserve">Hình 10a. Xác nhận thông tin cuối khóa (giao diện máy tính)</w:t>
+      </w:r>
+    </w:p>
+    <w:p>
+      <w:pPr>
+        <w:keepNext/>
+        <w:spacing w:line="240"/>
+        <w:ind w:firstLine="0"/>
+        <w:jc w:val="center"/>
+      </w:pPr>
+      <w:r>
+        <w:drawing>
+          <wp:inline distT="0" distB="0" distL="0" distR="0">
+            <wp:extent cx="1905000" cy="2724150"/>
+            <wp:effectExtent t="0" r="0" b="0" l="0"/>
+            <wp:docPr id="1" name="" descr="" title=""/>
+            <wp:cNvGraphicFramePr>
+              <a:graphicFrameLocks xmlns:a="http://schemas.openxmlformats.org/drawingml/2006/main" noChangeAspect="1"/>
+            </wp:cNvGraphicFramePr>
+            <a:graphic xmlns:a="http://schemas.openxmlformats.org/drawingml/2006/main">
+              <a:graphicData uri="http://schemas.openxmlformats.org/drawingml/2006/picture">
+                <pic:pic xmlns:pic="http://schemas.openxmlformats.org/drawingml/2006/picture">
+                  <pic:nvPicPr>
+                    <pic:cNvPr id="0" name="" descr=""/>
+                    <pic:cNvPicPr>
+                      <a:picLocks noChangeAspect="1" noChangeArrowheads="1"/>
+                    </pic:cNvPicPr>
+                  </pic:nvPicPr>
+                  <pic:blipFill>
+                    <a:blip r:embed="rId25" cstate="none"/>
+                    <a:srcRect/>
+                    <a:stretch>
+                      <a:fillRect/>
+                    </a:stretch>
+                  </pic:blipFill>
+                  <pic:spPr bwMode="auto">
+                    <a:xfrm>
+                      <a:off x="0" y="0"/>
+                      <a:ext cx="1905000" cy="2724150"/>
+                    </a:xfrm>
+                    <a:prstGeom prst="rect">
+                      <a:avLst/>
+                    </a:prstGeom>
+                  </pic:spPr>
+                </pic:pic>
+              </a:graphicData>
+            </a:graphic>
+          </wp:inline>
+        </w:drawing>
+      </w:r>
+    </w:p>
+    <w:p>
+      <w:pPr>
+        <w:spacing w:after="160" w:before="60" w:line="240"/>
+        <w:ind w:firstLine="0"/>
+        <w:jc w:val="center"/>
+      </w:pPr>
+      <w:r>
+        <w:rPr>
+          <w:i/>
+          <w:iCs/>
+          <w:sz w:val="24"/>
+          <w:szCs w:val="24"/>
+        </w:rPr>
+        <w:t xml:space="preserve">Hình 10b. Xác nhận thông tin cuối khóa (giao diện điện thoại)</w:t>
+      </w:r>
+    </w:p>
+    <w:p>
+      <w:pPr>
+        <w:spacing w:after="120" w:before="0" w:line="288"/>
+        <w:ind w:firstLine="567"/>
+        <w:jc w:val="both"/>
+      </w:pPr>
+      <w:r>
+        <w:rPr>
+          <w:b/>
+          <w:bCs/>
+        </w:rPr>
+        <w:t xml:space="preserve">Bước 1. </w:t>
+      </w:r>
+      <w:r>
+        <w:t xml:space="preserve">Bấm </w:t>
+      </w:r>
+      <w:r>
+        <w:rPr>
+          <w:b/>
+          <w:bCs/>
+        </w:rPr>
+        <w:t xml:space="preserve">Xác nhận</w:t>
+      </w:r>
+      <w:r>
+        <w:t xml:space="preserve"> trên menu. Đọc lại toàn bộ thông tin. Nếu có khung </w:t>
+      </w:r>
+      <w:r>
+        <w:rPr>
+          <w:b/>
+          <w:bCs/>
+        </w:rPr>
+        <w:t xml:space="preserve">đỏ</w:t>
+      </w:r>
+      <w:r>
+        <w:t xml:space="preserve"> (lỗi), bấm nút </w:t>
+      </w:r>
+      <w:r>
+        <w:rPr>
+          <w:b/>
+          <w:bCs/>
+        </w:rPr>
+        <w:t xml:space="preserve">“Sửa”</w:t>
+      </w:r>
+      <w:r>
+        <w:t xml:space="preserve"> cạnh lỗi để quay về đúng ô cần sửa. Khung </w:t>
+      </w:r>
+      <w:r>
+        <w:rPr>
+          <w:b/>
+          <w:bCs/>
+        </w:rPr>
+        <w:t xml:space="preserve">vàng</w:t>
+      </w:r>
+      <w:r>
+        <w:t xml:space="preserve"> chỉ là gợi ý, không bắt buộc.</w:t>
+      </w:r>
+    </w:p>
+    <w:p>
+      <w:pPr>
+        <w:spacing w:after="120" w:before="0" w:line="288"/>
+        <w:ind w:firstLine="567"/>
+        <w:jc w:val="both"/>
+      </w:pPr>
+      <w:r>
+        <w:rPr>
+          <w:b/>
+          <w:bCs/>
+        </w:rPr>
+        <w:t xml:space="preserve">Bước 2. </w:t>
+      </w:r>
+      <w:r>
+        <w:t xml:space="preserve">Tích vào ô cam kết.</w:t>
+      </w:r>
+    </w:p>
+    <w:p>
+      <w:pPr>
+        <w:spacing w:after="120" w:before="0" w:line="288"/>
+        <w:ind w:firstLine="567"/>
+        <w:jc w:val="both"/>
+      </w:pPr>
+      <w:r>
+        <w:rPr>
+          <w:b/>
+          <w:bCs/>
+        </w:rPr>
+        <w:t xml:space="preserve">Bước 3. </w:t>
+      </w:r>
+      <w:r>
+        <w:t xml:space="preserve">Bấm </w:t>
+      </w:r>
+      <w:r>
+        <w:rPr>
+          <w:b/>
+          <w:bCs/>
+        </w:rPr>
+        <w:t xml:space="preserve">“Xác nhận”</w:t>
+      </w:r>
+      <w:r>
+        <w:t xml:space="preserve">. Màn hình báo </w:t>
+      </w:r>
+      <w:r>
+        <w:rPr>
+          <w:i/>
+          <w:iCs/>
+        </w:rPr>
+        <w:t xml:space="preserve">"Đã xác nhận lúc …"</w:t>
+      </w:r>
+      <w:r>
+        <w:t xml:space="preserve"> và hệ thống gửi bản sao hồ sơ vào email của Thầy/Cô.</w:t>
+      </w:r>
+    </w:p>
+    <w:p>
+      <w:pPr>
+        <w:spacing w:after="120" w:before="0" w:line="288"/>
+        <w:ind w:firstLine="567"/>
+        <w:jc w:val="both"/>
+      </w:pPr>
+      <w:r>
+        <w:rPr>
+          <w:b/>
+          <w:bCs/>
+          <w:i/>
+          <w:iCs/>
+        </w:rPr>
+        <w:t xml:space="preserve">Lưu ý – Sửa hồ sơ sau khi đã xác nhận: </w:t>
+      </w:r>
+      <w:r>
+        <w:t xml:space="preserve">Nếu sửa và lưu lại sau khi xác nhận, lần xác nhận cũ bị hủy. Hệ thống hiện hộp thông báo </w:t>
+      </w:r>
+      <w:r>
+        <w:rPr>
+          <w:i/>
+          <w:iCs/>
+        </w:rPr>
+        <w:t xml:space="preserve">"Cần xác nhận lại"</w:t>
+      </w:r>
+      <w:r>
+        <w:t xml:space="preserve">. Thầy/Cô bấm </w:t>
+      </w:r>
+      <w:r>
+        <w:rPr>
+          <w:b/>
+          <w:bCs/>
+        </w:rPr>
+        <w:t xml:space="preserve">“Xác nhận lại”</w:t>
+      </w:r>
+      <w:r>
+        <w:t xml:space="preserve"> và làm lại các bước trên trước hạn chót.</w:t>
+      </w:r>
+    </w:p>
+    <w:p>
+      <w:pPr>
+        <w:pStyle w:val="Heading1"/>
+        <w:keepNext/>
+        <w:spacing w:after="120" w:before="240" w:line="288"/>
+        <w:ind w:firstLine="567"/>
+        <w:jc w:val="both"/>
+      </w:pPr>
+      <w:r>
+        <w:rPr>
+          <w:b/>
+          <w:bCs/>
+        </w:rPr>
+        <w:t xml:space="preserve">X. QUÊN MẬT KHẨU</w:t>
+      </w:r>
+    </w:p>
+    <w:p>
+      <w:pPr>
+        <w:spacing w:after="120" w:before="0" w:line="288"/>
+        <w:ind w:firstLine="567"/>
+        <w:jc w:val="both"/>
+      </w:pPr>
+      <w:r>
+        <w:t xml:space="preserve">Có hai cách, tùy việc email của Thầy/Cô đã được xác minh hay chưa.</w:t>
+      </w:r>
+    </w:p>
+    <w:tbl>
+      <w:tblPr>
+        <w:tblW w:type="dxa" w:w="9355"/>
+        <w:tblBorders>
+          <w:top w:val="single" w:color="auto" w:sz="4"/>
+          <w:left w:val="single" w:color="auto" w:sz="4"/>
+          <w:bottom w:val="single" w:color="auto" w:sz="4"/>
+          <w:right w:val="single" w:color="auto" w:sz="4"/>
+          <w:insideH w:val="single" w:color="auto" w:sz="4"/>
+          <w:insideV w:val="single" w:color="auto" w:sz="4"/>
+        </w:tblBorders>
+        <w:tblLayout w:type="fixed"/>
+      </w:tblPr>
+      <w:tblGrid>
+        <w:gridCol w:w="2994"/>
+        <w:gridCol w:w="6361"/>
+      </w:tblGrid>
+      <w:tr>
+        <w:trPr>
+          <w:cantSplit/>
+          <w:tblHeader/>
+        </w:trPr>
+        <w:tc>
+          <w:tcPr>
+            <w:tcW w:type="dxa" w:w="2994"/>
+            <w:tcBorders>
+              <w:top w:val="single" w:color="000000" w:sz="4"/>
+              <w:left w:val="single" w:color="000000" w:sz="4"/>
+              <w:bottom w:val="single" w:color="000000" w:sz="4"/>
+              <w:right w:val="single" w:color="000000" w:sz="4"/>
+            </w:tcBorders>
+            <w:shd w:fill="E7E6E6" w:color="auto" w:val="clear"/>
+            <w:tcMar>
+              <w:top w:type="dxa" w:w="40"/>
+              <w:left w:type="dxa" w:w="80"/>
+              <w:bottom w:type="dxa" w:w="40"/>
+              <w:right w:type="dxa" w:w="80"/>
+            </w:tcMar>
+            <w:vAlign w:val="center"/>
+          </w:tcPr>
+          <w:p>
+            <w:pPr>
+              <w:spacing w:after="40" w:line="264"/>
+              <w:ind w:firstLine="0"/>
+              <w:jc w:val="center"/>
+            </w:pPr>
+            <w:r>
+              <w:rPr>
+                <w:b/>
+                <w:bCs/>
+                <w:sz w:val="24"/>
+                <w:szCs w:val="24"/>
+              </w:rPr>
+              <w:t xml:space="preserve">Trường hợp</w:t>
+            </w:r>
+          </w:p>
+        </w:tc>
+        <w:tc>
+          <w:tcPr>
+            <w:tcW w:type="dxa" w:w="6361"/>
+            <w:tcBorders>
+              <w:top w:val="single" w:color="000000" w:sz="4"/>
+              <w:left w:val="single" w:color="000000" w:sz="4"/>
+              <w:bottom w:val="single" w:color="000000" w:sz="4"/>
+              <w:right w:val="single" w:color="000000" w:sz="4"/>
+            </w:tcBorders>
+            <w:shd w:fill="E7E6E6" w:color="auto" w:val="clear"/>
+            <w:tcMar>
+              <w:top w:type="dxa" w:w="40"/>
+              <w:left w:type="dxa" w:w="80"/>
+              <w:bottom w:type="dxa" w:w="40"/>
+              <w:right w:type="dxa" w:w="80"/>
+            </w:tcMar>
+            <w:vAlign w:val="center"/>
+          </w:tcPr>
+          <w:p>
+            <w:pPr>
+              <w:spacing w:after="40" w:line="264"/>
+              <w:ind w:firstLine="0"/>
+              <w:jc w:val="center"/>
+            </w:pPr>
+            <w:r>
+              <w:rPr>
+                <w:b/>
+                <w:bCs/>
+                <w:sz w:val="24"/>
+                <w:szCs w:val="24"/>
+              </w:rPr>
+              <w:t xml:space="preserve">Cách làm</w:t>
+            </w:r>
+          </w:p>
+        </w:tc>
+      </w:tr>
+      <w:tr>
+        <w:trPr>
+          <w:cantSplit/>
+        </w:trPr>
+        <w:tc>
+          <w:tcPr>
+            <w:tcW w:type="dxa" w:w="2994"/>
+            <w:tcBorders>
+              <w:top w:val="single" w:color="000000" w:sz="4"/>
+              <w:left w:val="single" w:color="000000" w:sz="4"/>
+              <w:bottom w:val="single" w:color="000000" w:sz="4"/>
+              <w:right w:val="single" w:color="000000" w:sz="4"/>
+            </w:tcBorders>
+            <w:tcMar>
+              <w:top w:type="dxa" w:w="40"/>
+              <w:left w:type="dxa" w:w="80"/>
+              <w:bottom w:type="dxa" w:w="40"/>
+              <w:right w:type="dxa" w:w="80"/>
+            </w:tcMar>
+            <w:vAlign w:val="top"/>
+          </w:tcPr>
+          <w:p>
+            <w:pPr>
+              <w:spacing w:after="40" w:line="264"/>
+              <w:ind w:firstLine="0"/>
+              <w:jc w:val="left"/>
+            </w:pPr>
+            <w:r>
+              <w:rPr>
+                <w:b/>
+                <w:bCs/>
+                <w:sz w:val="24"/>
+                <w:szCs w:val="24"/>
+              </w:rPr>
+              <w:t xml:space="preserve">Email đã xác minh</w:t>
+            </w:r>
+          </w:p>
+        </w:tc>
+        <w:tc>
+          <w:tcPr>
+            <w:tcW w:type="dxa" w:w="6361"/>
+            <w:tcBorders>
+              <w:top w:val="single" w:color="000000" w:sz="4"/>
+              <w:left w:val="single" w:color="000000" w:sz="4"/>
+              <w:bottom w:val="single" w:color="000000" w:sz="4"/>
+              <w:right w:val="single" w:color="000000" w:sz="4"/>
+            </w:tcBorders>
+            <w:tcMar>
+              <w:top w:type="dxa" w:w="40"/>
+              <w:left w:type="dxa" w:w="80"/>
+              <w:bottom w:type="dxa" w:w="40"/>
+              <w:right w:type="dxa" w:w="80"/>
+            </w:tcMar>
+            <w:vAlign w:val="top"/>
+          </w:tcPr>
+          <w:p>
+            <w:pPr>
+              <w:spacing w:after="40" w:line="264"/>
+              <w:ind w:firstLine="0"/>
+              <w:jc w:val="left"/>
+            </w:pPr>
+            <w:r>
+              <w:rPr>
+                <w:sz w:val="24"/>
+                <w:szCs w:val="24"/>
+              </w:rPr>
+              <w:t xml:space="preserve">Ở màn hình đăng nhập, bấm </w:t>
+            </w:r>
+            <w:r>
+              <w:rPr>
+                <w:b/>
+                <w:bCs/>
+                <w:sz w:val="24"/>
+                <w:szCs w:val="24"/>
+              </w:rPr>
+              <w:t xml:space="preserve">“Quên mật khẩu?”</w:t>
+            </w:r>
+            <w:r>
+              <w:rPr>
+                <w:sz w:val="24"/>
+                <w:szCs w:val="24"/>
+              </w:rPr>
+              <w:t xml:space="preserve">. Nhập tên tài khoản hoặc mã định danh MOET, bấm </w:t>
+            </w:r>
+            <w:r>
+              <w:rPr>
+                <w:b/>
+                <w:bCs/>
+                <w:sz w:val="24"/>
+                <w:szCs w:val="24"/>
+              </w:rPr>
+              <w:t xml:space="preserve">“Gửi yêu cầu”</w:t>
+            </w:r>
+            <w:r>
+              <w:rPr>
+                <w:sz w:val="24"/>
+                <w:szCs w:val="24"/>
+              </w:rPr>
+              <w:t xml:space="preserve">. Mở email (xem cả Thư rác), bấm liên kết đặt lại mật khẩu, đặt mật khẩu mới.</w:t>
+            </w:r>
+          </w:p>
+        </w:tc>
+      </w:tr>
+      <w:tr>
+        <w:trPr>
+          <w:cantSplit/>
+        </w:trPr>
+        <w:tc>
+          <w:tcPr>
+            <w:tcW w:type="dxa" w:w="2994"/>
+            <w:tcBorders>
+              <w:top w:val="single" w:color="000000" w:sz="4"/>
+              <w:left w:val="single" w:color="000000" w:sz="4"/>
+              <w:bottom w:val="single" w:color="000000" w:sz="4"/>
+              <w:right w:val="single" w:color="000000" w:sz="4"/>
+            </w:tcBorders>
+            <w:tcMar>
+              <w:top w:type="dxa" w:w="40"/>
+              <w:left w:type="dxa" w:w="80"/>
+              <w:bottom w:type="dxa" w:w="40"/>
+              <w:right w:type="dxa" w:w="80"/>
+            </w:tcMar>
+            <w:vAlign w:val="top"/>
+          </w:tcPr>
+          <w:p>
+            <w:pPr>
+              <w:spacing w:after="40" w:line="264"/>
+              <w:ind w:firstLine="0"/>
+              <w:jc w:val="left"/>
+            </w:pPr>
+            <w:r>
+              <w:rPr>
+                <w:b/>
+                <w:bCs/>
+                <w:sz w:val="24"/>
+                <w:szCs w:val="24"/>
+              </w:rPr>
+              <w:t xml:space="preserve">Email chưa xác minh</w:t>
+            </w:r>
+            <w:r>
+              <w:rPr>
+                <w:sz w:val="24"/>
+                <w:szCs w:val="24"/>
+              </w:rPr>
+              <w:t xml:space="preserve"> hoặc không nhận được thư sau 15 phút</w:t>
+            </w:r>
+          </w:p>
+        </w:tc>
+        <w:tc>
+          <w:tcPr>
+            <w:tcW w:type="dxa" w:w="6361"/>
+            <w:tcBorders>
+              <w:top w:val="single" w:color="000000" w:sz="4"/>
+              <w:left w:val="single" w:color="000000" w:sz="4"/>
+              <w:bottom w:val="single" w:color="000000" w:sz="4"/>
+              <w:right w:val="single" w:color="000000" w:sz="4"/>
+            </w:tcBorders>
+            <w:tcMar>
+              <w:top w:type="dxa" w:w="40"/>
+              <w:left w:type="dxa" w:w="80"/>
+              <w:bottom w:type="dxa" w:w="40"/>
+              <w:right w:type="dxa" w:w="80"/>
+            </w:tcMar>
+            <w:vAlign w:val="top"/>
+          </w:tcPr>
+          <w:p>
+            <w:pPr>
+              <w:spacing w:after="40" w:line="264"/>
+              <w:ind w:firstLine="0"/>
+              <w:jc w:val="left"/>
+            </w:pPr>
+            <w:r>
+              <w:rPr>
+                <w:sz w:val="24"/>
+                <w:szCs w:val="24"/>
+              </w:rPr>
+              <w:t xml:space="preserve">Gửi email tới </w:t>
+            </w:r>
+            <w:r>
+              <w:rPr>
+                <w:b/>
+                <w:bCs/>
+                <w:sz w:val="24"/>
+                <w:szCs w:val="24"/>
+              </w:rPr>
+              <w:t xml:space="preserve">boiduongnls@hcmue.edu.vn</w:t>
+            </w:r>
+            <w:r>
+              <w:rPr>
+                <w:sz w:val="24"/>
+                <w:szCs w:val="24"/>
+              </w:rPr>
+              <w:t xml:space="preserve"> theo mẫu ở mục XIII. Sau khi xác minh, cán bộ hỗ trợ đặt lại mật khẩu về ngày sinh để Thầy/Cô đăng nhập và đổi lại.</w:t>
+            </w:r>
+          </w:p>
+        </w:tc>
+      </w:tr>
+    </w:tbl>
+    <w:p>
+      <w:pPr>
+        <w:spacing w:after="120" w:line="240"/>
+        <w:ind w:firstLine="0"/>
+      </w:pPr>
+    </w:p>
+    <w:p>
+      <w:pPr>
+        <w:spacing w:after="120" w:before="0" w:line="288"/>
+        <w:ind w:firstLine="567"/>
+        <w:jc w:val="both"/>
+      </w:pPr>
+      <w:r>
+        <w:rPr>
+          <w:b/>
+          <w:bCs/>
+          <w:i/>
+          <w:iCs/>
+        </w:rPr>
+        <w:t xml:space="preserve">Lưu ý – Vì sao màn hình luôn báo đã gửi? </w:t>
+      </w:r>
+      <w:r>
+        <w:t xml:space="preserve">Để bảo vệ tài khoản, hệ thống luôn hiện cùng một thông báo, kể cả khi mã không đúng hoặc email chưa xác minh. Nếu không nhận được thư, hãy làm theo dòng thứ hai của bảng trên.</w:t>
+      </w:r>
+    </w:p>
+    <w:p>
+      <w:pPr>
+        <w:pStyle w:val="Heading1"/>
+        <w:keepNext/>
+        <w:spacing w:after="120" w:before="240" w:line="288"/>
+        <w:ind w:firstLine="567"/>
+        <w:jc w:val="both"/>
+      </w:pPr>
+      <w:r>
+        <w:rPr>
+          <w:b/>
+          <w:bCs/>
+        </w:rPr>
+        <w:t xml:space="preserve">XI. GỬI YÊU CẦU HỖ TRỢ TRÊN HỆ THỐNG</w:t>
+      </w:r>
+    </w:p>
+    <w:p>
+      <w:pPr>
+        <w:spacing w:after="120" w:before="0" w:line="288"/>
+        <w:ind w:firstLine="567"/>
+        <w:jc w:val="both"/>
+      </w:pPr>
+      <w:r>
+        <w:t xml:space="preserve">Khi đã đăng nhập được, cách nhanh nhất là gửi yêu cầu ngay trên hệ thống. Câu trả lời hiện lại ở cùng trang.</w:t>
+      </w:r>
+    </w:p>
+    <w:p>
+      <w:pPr>
+        <w:keepNext/>
+        <w:spacing w:before="120" w:line="240"/>
+        <w:ind w:firstLine="0"/>
+        <w:jc w:val="center"/>
+      </w:pPr>
+      <w:r>
+        <w:drawing>
+          <wp:inline distT="0" distB="0" distL="0" distR="0">
+            <wp:extent cx="4953000" cy="3124200"/>
+            <wp:effectExtent t="0" r="0" b="0" l="0"/>
+            <wp:docPr id="1" name="" descr="" title=""/>
+            <wp:cNvGraphicFramePr>
+              <a:graphicFrameLocks xmlns:a="http://schemas.openxmlformats.org/drawingml/2006/main" noChangeAspect="1"/>
+            </wp:cNvGraphicFramePr>
+            <a:graphic xmlns:a="http://schemas.openxmlformats.org/drawingml/2006/main">
+              <a:graphicData uri="http://schemas.openxmlformats.org/drawingml/2006/picture">
+                <pic:pic xmlns:pic="http://schemas.openxmlformats.org/drawingml/2006/picture">
+                  <pic:nvPicPr>
+                    <pic:cNvPr id="0" name="" descr=""/>
+                    <pic:cNvPicPr>
+                      <a:picLocks noChangeAspect="1" noChangeArrowheads="1"/>
+                    </pic:cNvPicPr>
+                  </pic:nvPicPr>
+                  <pic:blipFill>
+                    <a:blip r:embed="rId26" cstate="none"/>
+                    <a:srcRect/>
+                    <a:stretch>
+                      <a:fillRect/>
+                    </a:stretch>
+                  </pic:blipFill>
+                  <pic:spPr bwMode="auto">
+                    <a:xfrm>
+                      <a:off x="0" y="0"/>
+                      <a:ext cx="4953000" cy="3124200"/>
+                    </a:xfrm>
+                    <a:prstGeom prst="rect">
+                      <a:avLst/>
+                    </a:prstGeom>
+                  </pic:spPr>
+                </pic:pic>
+              </a:graphicData>
+            </a:graphic>
+          </wp:inline>
+        </w:drawing>
+      </w:r>
+    </w:p>
+    <w:p>
+      <w:pPr>
+        <w:spacing w:after="160" w:before="60" w:line="240"/>
+        <w:ind w:firstLine="0"/>
+        <w:jc w:val="center"/>
+      </w:pPr>
+      <w:r>
+        <w:rPr>
+          <w:i/>
+          <w:iCs/>
+          <w:sz w:val="24"/>
+          <w:szCs w:val="24"/>
+        </w:rPr>
+        <w:t xml:space="preserve">Hình 11a. Gửi yêu cầu hỗ trợ trên hệ thống (giao diện máy tính)</w:t>
+      </w:r>
+    </w:p>
+    <w:p>
+      <w:pPr>
+        <w:keepNext/>
+        <w:spacing w:line="240"/>
+        <w:ind w:firstLine="0"/>
+        <w:jc w:val="center"/>
+      </w:pPr>
+      <w:r>
+        <w:drawing>
+          <wp:inline distT="0" distB="0" distL="0" distR="0">
+            <wp:extent cx="1905000" cy="2867025"/>
+            <wp:effectExtent t="0" r="0" b="0" l="0"/>
+            <wp:docPr id="1" name="" descr="" title=""/>
+            <wp:cNvGraphicFramePr>
+              <a:graphicFrameLocks xmlns:a="http://schemas.openxmlformats.org/drawingml/2006/main" noChangeAspect="1"/>
+            </wp:cNvGraphicFramePr>
+            <a:graphic xmlns:a="http://schemas.openxmlformats.org/drawingml/2006/main">
+              <a:graphicData uri="http://schemas.openxmlformats.org/drawingml/2006/picture">
+                <pic:pic xmlns:pic="http://schemas.openxmlformats.org/drawingml/2006/picture">
+                  <pic:nvPicPr>
+                    <pic:cNvPr id="0" name="" descr=""/>
+                    <pic:cNvPicPr>
+                      <a:picLocks noChangeAspect="1" noChangeArrowheads="1"/>
+                    </pic:cNvPicPr>
+                  </pic:nvPicPr>
+                  <pic:blipFill>
+                    <a:blip r:embed="rId27" cstate="none"/>
+                    <a:srcRect/>
+                    <a:stretch>
+                      <a:fillRect/>
+                    </a:stretch>
+                  </pic:blipFill>
+                  <pic:spPr bwMode="auto">
+                    <a:xfrm>
+                      <a:off x="0" y="0"/>
                       <a:ext cx="1905000" cy="2867025"/>
                     </a:xfrm>
                     <a:prstGeom prst="rect">
@@ -8285,7 +10308,7 @@
           <w:sz w:val="24"/>
           <w:szCs w:val="24"/>
         </w:rPr>
-        <w:t xml:space="preserve">Hình 8b. Gửi yêu cầu hỗ trợ trên hệ thống (giao diện điện thoại)</w:t>
+        <w:t xml:space="preserve">Hình 11b. Gửi yêu cầu hỗ trợ trên hệ thống (giao diện điện thoại)</w:t>
       </w:r>
     </w:p>
     <w:p>

</xml_diff>